<commit_message>
Design Doc multiple sections added
</commit_message>
<xml_diff>
--- a/Design/SiteSafeDesign.docx
+++ b/Design/SiteSafeDesign.docx
@@ -556,7 +556,7 @@
           <w:szCs w:val="32"/>
         </w:rPr>
         <w:drawing>
-          <wp:anchor distT="0" distB="0" distL="114300" distR="114300" simplePos="0" relativeHeight="251540480" behindDoc="0" locked="0" layoutInCell="1" allowOverlap="1" wp14:anchorId="1AE65912" wp14:editId="0E67FBB4">
+          <wp:anchor distT="0" distB="0" distL="114300" distR="114300" simplePos="0" relativeHeight="251540480" behindDoc="0" locked="0" layoutInCell="1" allowOverlap="1" wp14:anchorId="1AE65912" wp14:editId="16F5F856">
             <wp:simplePos x="0" y="0"/>
             <wp:positionH relativeFrom="column">
               <wp:posOffset>60960</wp:posOffset>
@@ -831,7 +831,23 @@
                                 <w:sz w:val="18"/>
                                 <w:szCs w:val="18"/>
                               </w:rPr>
-                              <w:t xml:space="preserve"> Site Safe Logo</w:t>
+                              <w:t xml:space="preserve"> </w:t>
+                            </w:r>
+                            <w:proofErr w:type="spellStart"/>
+                            <w:r>
+                              <w:rPr>
+                                <w:sz w:val="18"/>
+                                <w:szCs w:val="18"/>
+                              </w:rPr>
+                              <w:t>SiteSafe</w:t>
+                            </w:r>
+                            <w:proofErr w:type="spellEnd"/>
+                            <w:r>
+                              <w:rPr>
+                                <w:sz w:val="18"/>
+                                <w:szCs w:val="18"/>
+                              </w:rPr>
+                              <w:t xml:space="preserve"> Logo</w:t>
                             </w:r>
                           </w:p>
                         </w:txbxContent>
@@ -896,7 +912,23 @@
                           <w:sz w:val="18"/>
                           <w:szCs w:val="18"/>
                         </w:rPr>
-                        <w:t xml:space="preserve"> Site Safe Logo</w:t>
+                        <w:t xml:space="preserve"> </w:t>
+                      </w:r>
+                      <w:proofErr w:type="spellStart"/>
+                      <w:r>
+                        <w:rPr>
+                          <w:sz w:val="18"/>
+                          <w:szCs w:val="18"/>
+                        </w:rPr>
+                        <w:t>SiteSafe</w:t>
+                      </w:r>
+                      <w:proofErr w:type="spellEnd"/>
+                      <w:r>
+                        <w:rPr>
+                          <w:sz w:val="18"/>
+                          <w:szCs w:val="18"/>
+                        </w:rPr>
+                        <w:t xml:space="preserve"> Logo</w:t>
                       </w:r>
                     </w:p>
                   </w:txbxContent>
@@ -912,17 +944,48 @@
         <w:pStyle w:val="Subtitle"/>
       </w:pPr>
     </w:p>
-    <w:p>
-      <w:pPr>
-        <w:pStyle w:val="Subtitle"/>
-        <w:rPr>
-          <w:color w:val="0070C0"/>
-        </w:rPr>
-      </w:pPr>
-      <w:r>
-        <w:rPr>
-          <w:color w:val="0070C0"/>
-        </w:rPr>
+    <w:p/>
+    <w:p>
+      <w:pPr>
+        <w:pStyle w:val="Heading1"/>
+      </w:pPr>
+      <w:r>
+        <w:lastRenderedPageBreak/>
+        <w:t>Table of Contents</w:t>
+      </w:r>
+    </w:p>
+    <w:p/>
+    <w:p/>
+    <w:p/>
+    <w:p/>
+    <w:p/>
+    <w:p/>
+    <w:p/>
+    <w:p/>
+    <w:p/>
+    <w:p/>
+    <w:p/>
+    <w:p/>
+    <w:p/>
+    <w:p/>
+    <w:p/>
+    <w:p/>
+    <w:p/>
+    <w:p/>
+    <w:p/>
+    <w:p/>
+    <w:p/>
+    <w:p/>
+    <w:p/>
+    <w:p/>
+    <w:p/>
+    <w:p/>
+    <w:p/>
+    <w:p>
+      <w:pPr>
+        <w:pStyle w:val="Heading1"/>
+      </w:pPr>
+      <w:r>
         <w:lastRenderedPageBreak/>
         <w:t>Introduction</w:t>
       </w:r>
@@ -1084,22 +1147,546 @@
     </w:p>
     <w:p>
       <w:pPr>
-        <w:pStyle w:val="Subtitle"/>
-        <w:rPr>
-          <w:color w:val="0070C0"/>
-        </w:rPr>
-      </w:pPr>
-      <w:r>
-        <w:rPr>
-          <w:color w:val="0070C0"/>
-        </w:rPr>
+        <w:pStyle w:val="Heading1"/>
+      </w:pPr>
+      <w:r>
+        <w:lastRenderedPageBreak/>
+        <w:t>Technologies</w:t>
+      </w:r>
+    </w:p>
+    <w:p/>
+    <w:p>
+      <w:pPr>
+        <w:rPr>
+          <w:lang w:val="en-GB"/>
+        </w:rPr>
+      </w:pPr>
+      <w:r>
+        <w:rPr>
+          <w:lang w:val="en-GB"/>
+        </w:rPr>
+        <w:t>Extensive research guided the selection of technologies for this project to ensure they meet the requirements of real-time video monitoring, detection accuracy, and system integration. Below is an overview of the chosen technologies and their roles in the project:</w:t>
+      </w:r>
+    </w:p>
+    <w:p>
+      <w:pPr>
+        <w:pStyle w:val="ListParagraph"/>
+        <w:numPr>
+          <w:ilvl w:val="0"/>
+          <w:numId w:val="21"/>
+        </w:numPr>
+        <w:rPr>
+          <w:lang w:val="en-GB"/>
+        </w:rPr>
+      </w:pPr>
+      <w:r>
+        <w:rPr>
+          <w:b/>
+          <w:bCs/>
+          <w:lang w:val="en-GB"/>
+        </w:rPr>
+        <w:t>Python</w:t>
+      </w:r>
+      <w:r>
+        <w:rPr>
+          <w:lang w:val="en-GB"/>
+        </w:rPr>
+        <w:t xml:space="preserve"> </w:t>
+      </w:r>
+      <w:r>
+        <w:rPr>
+          <w:lang w:val="en-GB"/>
+        </w:rPr>
+        <w:t>serves as the primary programming language due to its robust libraries for AI and machine learning. It will be used to manage object detection workflows, integrate the chosen frameworks, and handle real-time data processing for the live monitoring system</w:t>
+      </w:r>
+      <w:r>
+        <w:rPr>
+          <w:lang w:val="en-GB"/>
+        </w:rPr>
+        <w:t xml:space="preserve"> through flask</w:t>
+      </w:r>
+      <w:r>
+        <w:rPr>
+          <w:lang w:val="en-GB"/>
+        </w:rPr>
+        <w:t>.</w:t>
+      </w:r>
+    </w:p>
+    <w:p>
+      <w:pPr>
+        <w:pStyle w:val="ListParagraph"/>
+        <w:numPr>
+          <w:ilvl w:val="0"/>
+          <w:numId w:val="21"/>
+        </w:numPr>
+        <w:rPr>
+          <w:lang w:val="en-GB"/>
+        </w:rPr>
+      </w:pPr>
+      <w:r>
+        <w:rPr>
+          <w:b/>
+          <w:bCs/>
+          <w:lang w:val="en-GB"/>
+        </w:rPr>
+        <w:t>YOLOv1</w:t>
+      </w:r>
+      <w:r>
+        <w:rPr>
+          <w:b/>
+          <w:bCs/>
+          <w:lang w:val="en-GB"/>
+        </w:rPr>
+        <w:t xml:space="preserve">1 </w:t>
+      </w:r>
+      <w:r>
+        <w:rPr>
+          <w:lang w:val="en-GB"/>
+        </w:rPr>
+        <w:t>(You Only Look Once) is essential for detecting helmets and high-visibility jackets in real-time. It processes live video feeds, identifying and classifying objects in a single pass, making it highly suitable for the speed and accuracy requirements of this project.</w:t>
+      </w:r>
+    </w:p>
+    <w:p>
+      <w:pPr>
+        <w:pStyle w:val="ListParagraph"/>
+        <w:numPr>
+          <w:ilvl w:val="0"/>
+          <w:numId w:val="21"/>
+        </w:numPr>
+        <w:rPr>
+          <w:lang w:val="en-GB"/>
+        </w:rPr>
+      </w:pPr>
+      <w:proofErr w:type="spellStart"/>
+      <w:r>
+        <w:rPr>
+          <w:b/>
+          <w:bCs/>
+          <w:lang w:val="en-GB"/>
+        </w:rPr>
+        <w:t>Ultralytics</w:t>
+      </w:r>
+      <w:proofErr w:type="spellEnd"/>
+      <w:r>
+        <w:rPr>
+          <w:lang w:val="en-GB"/>
+        </w:rPr>
+        <w:t xml:space="preserve"> </w:t>
+      </w:r>
+      <w:r>
+        <w:rPr>
+          <w:lang w:val="en-GB"/>
+        </w:rPr>
+        <w:t>enhances YOLO's capabilities. It simplifies the deployment and testing of the detection models, allowing seamless integration into the project's monitoring pipeline.</w:t>
+      </w:r>
+    </w:p>
+    <w:p>
+      <w:pPr>
+        <w:pStyle w:val="ListParagraph"/>
+        <w:numPr>
+          <w:ilvl w:val="0"/>
+          <w:numId w:val="21"/>
+        </w:numPr>
+        <w:rPr>
+          <w:lang w:val="en-GB"/>
+        </w:rPr>
+      </w:pPr>
+      <w:r>
+        <w:rPr>
+          <w:b/>
+          <w:bCs/>
+          <w:lang w:val="en-GB"/>
+        </w:rPr>
+        <w:t>OpenCV</w:t>
+      </w:r>
+      <w:r>
+        <w:rPr>
+          <w:lang w:val="en-GB"/>
+        </w:rPr>
+        <w:t xml:space="preserve"> </w:t>
+      </w:r>
+      <w:r>
+        <w:rPr>
+          <w:lang w:val="en-GB"/>
+        </w:rPr>
+        <w:t>will manage video capture and annotation tasks. It will overlay bounding boxes, labels, and confidence scores on the detected objects in video frames, providing a clear visual representation of safety compliance on the construction site.</w:t>
+      </w:r>
+    </w:p>
+    <w:p>
+      <w:pPr>
+        <w:pStyle w:val="ListParagraph"/>
+        <w:numPr>
+          <w:ilvl w:val="0"/>
+          <w:numId w:val="21"/>
+        </w:numPr>
+        <w:rPr>
+          <w:lang w:val="en-GB"/>
+        </w:rPr>
+      </w:pPr>
+      <w:r>
+        <w:rPr>
+          <w:b/>
+          <w:bCs/>
+          <w:lang w:val="en-GB"/>
+        </w:rPr>
+        <w:t>Flask</w:t>
+      </w:r>
+      <w:r>
+        <w:rPr>
+          <w:lang w:val="en-GB"/>
+        </w:rPr>
+        <w:t xml:space="preserve"> </w:t>
+      </w:r>
+      <w:r>
+        <w:rPr>
+          <w:lang w:val="en-GB"/>
+        </w:rPr>
+        <w:t>will function as the backend framework, enabling communication between the detection system and the web interface. It will handle API requests, process detection results, and serve data to the React-based frontend for display.</w:t>
+      </w:r>
+    </w:p>
+    <w:p>
+      <w:pPr>
+        <w:pStyle w:val="ListParagraph"/>
+        <w:numPr>
+          <w:ilvl w:val="0"/>
+          <w:numId w:val="21"/>
+        </w:numPr>
+        <w:rPr>
+          <w:lang w:val="en-GB"/>
+        </w:rPr>
+      </w:pPr>
+      <w:r>
+        <w:rPr>
+          <w:b/>
+          <w:bCs/>
+          <w:lang w:val="en-GB"/>
+        </w:rPr>
+        <w:t>React</w:t>
+      </w:r>
+      <w:r>
+        <w:rPr>
+          <w:lang w:val="en-GB"/>
+        </w:rPr>
+        <w:t xml:space="preserve"> </w:t>
+      </w:r>
+      <w:r>
+        <w:rPr>
+          <w:lang w:val="en-GB"/>
+        </w:rPr>
+        <w:t>will power the web-based user interface, ensuring interactivity and responsiveness. It will allow users to view live monitoring feeds, configure alerts, and interact with the system seamlessly.</w:t>
+      </w:r>
+    </w:p>
+    <w:p>
+      <w:pPr>
+        <w:pStyle w:val="ListParagraph"/>
+        <w:numPr>
+          <w:ilvl w:val="0"/>
+          <w:numId w:val="21"/>
+        </w:numPr>
+        <w:rPr>
+          <w:lang w:val="en-GB"/>
+        </w:rPr>
+      </w:pPr>
+      <w:r>
+        <w:rPr>
+          <w:b/>
+          <w:bCs/>
+          <w:lang w:val="en-GB"/>
+        </w:rPr>
+        <w:t>SMTP</w:t>
+      </w:r>
+      <w:r>
+        <w:rPr>
+          <w:lang w:val="en-GB"/>
+        </w:rPr>
+        <w:t xml:space="preserve"> </w:t>
+      </w:r>
+      <w:r>
+        <w:rPr>
+          <w:lang w:val="en-GB"/>
+        </w:rPr>
+        <w:t>will be used to send email alerts when a safety violation, such as the absence of a helmet or high-visibility jacket, is detected. This ensures real-time notifications for site supervisor</w:t>
+      </w:r>
+      <w:r>
+        <w:rPr>
+          <w:lang w:val="en-GB"/>
+        </w:rPr>
+        <w:t>/ safety officer</w:t>
+      </w:r>
+      <w:r>
+        <w:rPr>
+          <w:lang w:val="en-GB"/>
+        </w:rPr>
+        <w:t>.</w:t>
+      </w:r>
+    </w:p>
+    <w:p>
+      <w:pPr>
+        <w:pStyle w:val="ListParagraph"/>
+        <w:numPr>
+          <w:ilvl w:val="0"/>
+          <w:numId w:val="21"/>
+        </w:numPr>
+        <w:rPr>
+          <w:lang w:val="en-GB"/>
+        </w:rPr>
+      </w:pPr>
+      <w:r>
+        <w:rPr>
+          <w:b/>
+          <w:bCs/>
+          <w:lang w:val="en-GB"/>
+        </w:rPr>
+        <w:t>MySQL</w:t>
+      </w:r>
+      <w:r>
+        <w:rPr>
+          <w:lang w:val="en-GB"/>
+        </w:rPr>
+        <w:t xml:space="preserve"> </w:t>
+      </w:r>
+      <w:r>
+        <w:rPr>
+          <w:lang w:val="en-GB"/>
+        </w:rPr>
+        <w:t>will store detection logs, timestamps, and alert records in a structured format. This database will support efficient data retrieval for generating reports and monitoring site compliance trends.</w:t>
+      </w:r>
+    </w:p>
+    <w:p>
+      <w:pPr>
+        <w:rPr>
+          <w:lang w:val="en-GB"/>
+        </w:rPr>
+      </w:pPr>
+      <w:r>
+        <w:rPr>
+          <w:lang w:val="en-GB"/>
+        </w:rPr>
+        <w:t>This combination of technologies ensures a robust, efficient, and scalable solution for real-time safety monitoring in construction sites.</w:t>
+      </w:r>
+    </w:p>
+    <w:p>
+      <w:pPr>
+        <w:rPr>
+          <w:lang w:val="en-GB"/>
+        </w:rPr>
+      </w:pPr>
+    </w:p>
+    <w:p>
+      <w:pPr>
+        <w:rPr>
+          <w:lang w:val="en-GB"/>
+        </w:rPr>
+      </w:pPr>
+    </w:p>
+    <w:p>
+      <w:pPr>
+        <w:rPr>
+          <w:lang w:val="en-GB"/>
+        </w:rPr>
+      </w:pPr>
+    </w:p>
+    <w:p>
+      <w:pPr>
+        <w:rPr>
+          <w:lang w:val="en-GB"/>
+        </w:rPr>
+      </w:pPr>
+    </w:p>
+    <w:p>
+      <w:pPr>
+        <w:pStyle w:val="Heading1"/>
+      </w:pPr>
+      <w:r>
+        <w:lastRenderedPageBreak/>
+        <w:t>Demo Site &amp; Company Site</w:t>
+      </w:r>
+    </w:p>
+    <w:p/>
+    <w:p>
+      <w:pPr>
+        <w:rPr>
+          <w:lang w:val="en-GB"/>
+        </w:rPr>
+      </w:pPr>
+    </w:p>
+    <w:p>
+      <w:pPr>
+        <w:rPr>
+          <w:lang w:val="en-GB"/>
+        </w:rPr>
+      </w:pPr>
+    </w:p>
+    <w:p>
+      <w:pPr>
+        <w:rPr>
+          <w:lang w:val="en-GB"/>
+        </w:rPr>
+      </w:pPr>
+    </w:p>
+    <w:p>
+      <w:pPr>
+        <w:rPr>
+          <w:lang w:val="en-GB"/>
+        </w:rPr>
+      </w:pPr>
+    </w:p>
+    <w:p>
+      <w:pPr>
+        <w:rPr>
+          <w:lang w:val="en-GB"/>
+        </w:rPr>
+      </w:pPr>
+    </w:p>
+    <w:p>
+      <w:pPr>
+        <w:rPr>
+          <w:lang w:val="en-GB"/>
+        </w:rPr>
+      </w:pPr>
+    </w:p>
+    <w:p>
+      <w:pPr>
+        <w:rPr>
+          <w:lang w:val="en-GB"/>
+        </w:rPr>
+      </w:pPr>
+    </w:p>
+    <w:p>
+      <w:pPr>
+        <w:rPr>
+          <w:lang w:val="en-GB"/>
+        </w:rPr>
+      </w:pPr>
+    </w:p>
+    <w:p>
+      <w:pPr>
+        <w:rPr>
+          <w:lang w:val="en-GB"/>
+        </w:rPr>
+      </w:pPr>
+    </w:p>
+    <w:p>
+      <w:pPr>
+        <w:rPr>
+          <w:lang w:val="en-GB"/>
+        </w:rPr>
+      </w:pPr>
+    </w:p>
+    <w:p>
+      <w:pPr>
+        <w:rPr>
+          <w:lang w:val="en-GB"/>
+        </w:rPr>
+      </w:pPr>
+    </w:p>
+    <w:p>
+      <w:pPr>
+        <w:rPr>
+          <w:lang w:val="en-GB"/>
+        </w:rPr>
+      </w:pPr>
+    </w:p>
+    <w:p>
+      <w:pPr>
+        <w:rPr>
+          <w:lang w:val="en-GB"/>
+        </w:rPr>
+      </w:pPr>
+    </w:p>
+    <w:p>
+      <w:pPr>
+        <w:rPr>
+          <w:lang w:val="en-GB"/>
+        </w:rPr>
+      </w:pPr>
+    </w:p>
+    <w:p>
+      <w:pPr>
+        <w:rPr>
+          <w:lang w:val="en-GB"/>
+        </w:rPr>
+      </w:pPr>
+    </w:p>
+    <w:p>
+      <w:pPr>
+        <w:rPr>
+          <w:lang w:val="en-GB"/>
+        </w:rPr>
+      </w:pPr>
+    </w:p>
+    <w:p>
+      <w:pPr>
+        <w:rPr>
+          <w:lang w:val="en-GB"/>
+        </w:rPr>
+      </w:pPr>
+    </w:p>
+    <w:p>
+      <w:pPr>
+        <w:rPr>
+          <w:lang w:val="en-GB"/>
+        </w:rPr>
+      </w:pPr>
+    </w:p>
+    <w:p>
+      <w:pPr>
+        <w:rPr>
+          <w:lang w:val="en-GB"/>
+        </w:rPr>
+      </w:pPr>
+    </w:p>
+    <w:p>
+      <w:pPr>
+        <w:rPr>
+          <w:lang w:val="en-GB"/>
+        </w:rPr>
+      </w:pPr>
+    </w:p>
+    <w:p>
+      <w:pPr>
+        <w:rPr>
+          <w:lang w:val="en-GB"/>
+        </w:rPr>
+      </w:pPr>
+    </w:p>
+    <w:p>
+      <w:pPr>
+        <w:rPr>
+          <w:lang w:val="en-GB"/>
+        </w:rPr>
+      </w:pPr>
+    </w:p>
+    <w:p>
+      <w:pPr>
+        <w:rPr>
+          <w:lang w:val="en-GB"/>
+        </w:rPr>
+      </w:pPr>
+    </w:p>
+    <w:p>
+      <w:pPr>
+        <w:rPr>
+          <w:lang w:val="en-GB"/>
+        </w:rPr>
+      </w:pPr>
+    </w:p>
+    <w:p>
+      <w:pPr>
+        <w:rPr>
+          <w:lang w:val="en-GB"/>
+        </w:rPr>
+      </w:pPr>
+    </w:p>
+    <w:p>
+      <w:pPr>
+        <w:pStyle w:val="Heading1"/>
+      </w:pPr>
+      <w:r>
         <w:lastRenderedPageBreak/>
         <w:t xml:space="preserve">Personal Protective Equipment </w:t>
       </w:r>
       <w:r>
-        <w:rPr>
-          <w:color w:val="0070C0"/>
-        </w:rPr>
         <w:t>Detection</w:t>
       </w:r>
     </w:p>
@@ -1331,6 +1918,9 @@
       <w:r>
         <w:t>Evaluation</w:t>
       </w:r>
+      <w:r>
+        <w:t xml:space="preserve"> of detection model</w:t>
+      </w:r>
     </w:p>
     <w:p/>
     <w:p>
@@ -1386,8 +1976,2102 @@
         </w:rPr>
       </w:pPr>
     </w:p>
+    <w:p>
+      <w:pPr>
+        <w:rPr>
+          <w:lang w:val="en-GB"/>
+        </w:rPr>
+      </w:pPr>
+    </w:p>
+    <w:p>
+      <w:pPr>
+        <w:rPr>
+          <w:lang w:val="en-GB"/>
+        </w:rPr>
+      </w:pPr>
+    </w:p>
+    <w:p>
+      <w:pPr>
+        <w:rPr>
+          <w:lang w:val="en-GB"/>
+        </w:rPr>
+      </w:pPr>
+    </w:p>
+    <w:p>
+      <w:pPr>
+        <w:rPr>
+          <w:lang w:val="en-GB"/>
+        </w:rPr>
+      </w:pPr>
+    </w:p>
+    <w:p>
+      <w:pPr>
+        <w:rPr>
+          <w:lang w:val="en-GB"/>
+        </w:rPr>
+      </w:pPr>
+    </w:p>
+    <w:p>
+      <w:pPr>
+        <w:rPr>
+          <w:lang w:val="en-GB"/>
+        </w:rPr>
+      </w:pPr>
+    </w:p>
+    <w:p>
+      <w:pPr>
+        <w:rPr>
+          <w:lang w:val="en-GB"/>
+        </w:rPr>
+      </w:pPr>
+    </w:p>
+    <w:p>
+      <w:pPr>
+        <w:pStyle w:val="Heading1"/>
+      </w:pPr>
+      <w:r>
+        <w:lastRenderedPageBreak/>
+        <w:t>Notification Process</w:t>
+      </w:r>
+    </w:p>
+    <w:p/>
+    <w:p>
+      <w:pPr>
+        <w:pStyle w:val="Heading2"/>
+      </w:pPr>
+      <w:r>
+        <w:t>Incident Report</w:t>
+      </w:r>
+    </w:p>
+    <w:p/>
+    <w:p>
+      <w:r>
+        <w:t>After successful detection of no helmet or</w:t>
+      </w:r>
+      <w:r>
+        <w:t>/and</w:t>
+      </w:r>
+      <w:r>
+        <w:t xml:space="preserve"> no high visibility jacket</w:t>
+      </w:r>
+      <w:r>
+        <w:t xml:space="preserve"> on a construction site</w:t>
+      </w:r>
+      <w:r>
+        <w:t xml:space="preserve"> an incident report is automatically generated</w:t>
+      </w:r>
+      <w:r>
+        <w:t xml:space="preserve"> by the </w:t>
+      </w:r>
+      <w:proofErr w:type="spellStart"/>
+      <w:r>
+        <w:t>SiteSafeAI</w:t>
+      </w:r>
+      <w:proofErr w:type="spellEnd"/>
+      <w:r>
+        <w:t xml:space="preserve"> system</w:t>
+      </w:r>
+      <w:r>
+        <w:t xml:space="preserve">. </w:t>
+      </w:r>
+      <w:r>
+        <w:t xml:space="preserve">In this report details of the incident will be held, details like date/time, image, detection confidence, etc. </w:t>
+      </w:r>
+      <w:r>
+        <w:t>This incident report will be accessed by the manager/ safety officer through email. The manager/ safety officer will then decide whether to act on the incident being able to use the incident report as a reference.</w:t>
+      </w:r>
+    </w:p>
+    <w:p/>
+    <w:p>
+      <w:pPr>
+        <w:pStyle w:val="Heading2"/>
+      </w:pPr>
+      <w:r>
+        <w:t>Camera Monitoring Specialist</w:t>
+      </w:r>
+    </w:p>
+    <w:p/>
+    <w:p>
+      <w:r>
+        <w:t>Also, after a successful detection of no helmet or</w:t>
+      </w:r>
+      <w:r>
+        <w:t>/and</w:t>
+      </w:r>
+      <w:r>
+        <w:t xml:space="preserve"> no high visibility jacket the camera monitoring specialist is notified. This depends on the companies needs. Some companies have an alert system in place while others have specialist watching the cameras constantly. The case that will be implemented is </w:t>
+      </w:r>
+      <w:r>
+        <w:t xml:space="preserve">where a monitoring person is watching the screen constantly. This process will be easily modifiable to suit an </w:t>
+      </w:r>
+      <w:r>
+        <w:t>alert-based</w:t>
+      </w:r>
+      <w:r>
+        <w:t xml:space="preserve"> system as well.</w:t>
+      </w:r>
+    </w:p>
+    <w:p/>
+    <w:p>
+      <w:pPr>
+        <w:pStyle w:val="Heading2"/>
+      </w:pPr>
+      <w:r>
+        <w:t>Email Service</w:t>
+      </w:r>
+    </w:p>
+    <w:p/>
+    <w:p>
+      <w:pPr>
+        <w:rPr>
+          <w:lang w:val="en-GB"/>
+        </w:rPr>
+      </w:pPr>
+      <w:r>
+        <w:rPr>
+          <w:lang w:val="en-GB"/>
+        </w:rPr>
+        <w:t>Once an incident is detected, such as a worker not wearing a helmet or high-visibility jacket, the system will send an automatic email notification to the relevant personnel, such as the manager or safety officer. The email will contain a detailed report of the incident, including relevant information like the time of detection and a snapshot of the image with bounding boxes highlighting the violation. This ensures that the safety officer or manager can take immediate action and maintain proper records for safety compliance.</w:t>
+      </w:r>
+    </w:p>
+    <w:p>
+      <w:pPr>
+        <w:rPr>
+          <w:lang w:val="en-GB"/>
+        </w:rPr>
+      </w:pPr>
+      <w:r>
+        <w:rPr>
+          <w:lang w:val="en-GB"/>
+        </w:rPr>
+        <w:t>The email service will use SMTP (Simple Mail Transfer Protocol) to send these alerts. The email body will be dynamically generated, pulling data from the database to generate reports with details about the incident. The system will be configured to send these notifications based on the detection of specific safety violations.</w:t>
+      </w:r>
+    </w:p>
+    <w:p/>
+    <w:p/>
+    <w:p>
+      <w:pPr>
+        <w:pStyle w:val="Heading2"/>
+      </w:pPr>
+      <w:r>
+        <w:lastRenderedPageBreak/>
+        <w:t>SMS Service</w:t>
+      </w:r>
+    </w:p>
+    <w:p/>
+    <w:p>
+      <w:pPr>
+        <w:rPr>
+          <w:lang w:val="en-GB"/>
+        </w:rPr>
+      </w:pPr>
+      <w:r>
+        <w:rPr>
+          <w:lang w:val="en-GB"/>
+        </w:rPr>
+        <w:t>The SMS service will follow a similar logic to the email service. In the event of a safety violation, such as a worker not wearing the required protective gear, an SMS alert will be sent to the relevant personnel, such as the safety officer. The SMS will include basic details about the violation, such as the time and nature of the incident, with a link to the full report in the system.</w:t>
+      </w:r>
+    </w:p>
+    <w:p>
+      <w:pPr>
+        <w:rPr>
+          <w:lang w:val="en-GB"/>
+        </w:rPr>
+      </w:pPr>
+      <w:r>
+        <w:rPr>
+          <w:lang w:val="en-GB"/>
+        </w:rPr>
+        <w:t>While the structure for this service is planned and designed, the actual implementation will not be done in the initial version of the project. This is because SMS services typically incur ongoing costs, which may not be feasible for the first deployment of the system. However, this feature can be considered for future development, allowing for a more immediate alert system for on-the-ground personnel, especially in cases where email notifications may not be as effective in real-time.</w:t>
+      </w:r>
+    </w:p>
+    <w:p/>
+    <w:p>
+      <w:pPr>
+        <w:pStyle w:val="Heading2"/>
+      </w:pPr>
+      <w:r>
+        <w:t>Spam Protection</w:t>
+      </w:r>
+    </w:p>
+    <w:p/>
+    <w:p>
+      <w:pPr>
+        <w:rPr>
+          <w:lang w:val="en-GB"/>
+        </w:rPr>
+      </w:pPr>
+      <w:r>
+        <w:rPr>
+          <w:lang w:val="en-GB"/>
+        </w:rPr>
+        <w:t>To prevent the system from sending excessive or redundant alerts, a spam protection mechanism will be implemented. This will ensure that users do not receive an overwhelming number of notifications for the same incident or similar incidents within a short period.</w:t>
+      </w:r>
+    </w:p>
+    <w:p>
+      <w:pPr>
+        <w:rPr>
+          <w:lang w:val="en-GB"/>
+        </w:rPr>
+      </w:pPr>
+      <w:r>
+        <w:rPr>
+          <w:lang w:val="en-GB"/>
+        </w:rPr>
+        <w:t>The approach will involve introducing a cooldown period for alerts. After an alert is triggered for a specific violation (e.g., a worker not wearing a helmet or high-visibility jacket), the system will impose a cooldown period (e.g., 15 minutes or more). During this time, even if the same violation is detected again, no new alerts will be sent until the cooldown period has expired. This will prevent the system from spamming alerts for repeated detections of the same issue.</w:t>
+      </w:r>
+    </w:p>
+    <w:p>
+      <w:pPr>
+        <w:rPr>
+          <w:lang w:val="en-GB"/>
+        </w:rPr>
+      </w:pPr>
+      <w:r>
+        <w:rPr>
+          <w:lang w:val="en-GB"/>
+        </w:rPr>
+        <w:t>In addition to the cooldown period, the system can be configured to aggregate multiple violations occurring in a short time into a single report. For example, if several workers are detected without helmets or high-visibility jackets within a few minutes, a single alert summari</w:t>
+      </w:r>
+      <w:r>
+        <w:rPr>
+          <w:lang w:val="en-GB"/>
+        </w:rPr>
+        <w:t>s</w:t>
+      </w:r>
+      <w:r>
+        <w:rPr>
+          <w:lang w:val="en-GB"/>
+        </w:rPr>
+        <w:t>ing all the violations can be sent, rather than sending multiple individual alerts.</w:t>
+      </w:r>
+    </w:p>
+    <w:p>
+      <w:pPr>
+        <w:rPr>
+          <w:lang w:val="en-GB"/>
+        </w:rPr>
+      </w:pPr>
+      <w:r>
+        <w:rPr>
+          <w:lang w:val="en-GB"/>
+        </w:rPr>
+        <w:t>This spam protection mechanism ensures that alerts remain meaningful and actionable without overwhelming the personnel responsible for responding to the notifications. It also improves the overall user experience, allowing for a more controlled and efficient alerting system.</w:t>
+      </w:r>
+    </w:p>
+    <w:p>
+      <w:pPr>
+        <w:rPr>
+          <w:lang w:val="en-GB"/>
+        </w:rPr>
+      </w:pPr>
+    </w:p>
+    <w:p>
+      <w:pPr>
+        <w:rPr>
+          <w:lang w:val="en-GB"/>
+        </w:rPr>
+      </w:pPr>
+    </w:p>
+    <w:p>
+      <w:pPr>
+        <w:rPr>
+          <w:lang w:val="en-GB"/>
+        </w:rPr>
+      </w:pPr>
+    </w:p>
+    <w:p>
+      <w:pPr>
+        <w:pStyle w:val="Heading2"/>
+      </w:pPr>
+      <w:r>
+        <w:lastRenderedPageBreak/>
+        <w:t>Notification Email Example</w:t>
+      </w:r>
+      <w:r>
+        <w:t xml:space="preserve"> with Incident Report</w:t>
+      </w:r>
+    </w:p>
+    <w:p>
+      <w:pPr>
+        <w:rPr>
+          <w:lang w:val="en-GB"/>
+        </w:rPr>
+      </w:pPr>
+    </w:p>
+    <w:p>
+      <w:pPr>
+        <w:rPr>
+          <w:lang w:val="en-GB"/>
+        </w:rPr>
+      </w:pPr>
+    </w:p>
+    <w:p>
+      <w:pPr>
+        <w:rPr>
+          <w:lang w:val="en-GB"/>
+        </w:rPr>
+      </w:pPr>
+    </w:p>
+    <w:p>
+      <w:pPr>
+        <w:rPr>
+          <w:lang w:val="en-GB"/>
+        </w:rPr>
+      </w:pPr>
+    </w:p>
+    <w:p>
+      <w:pPr>
+        <w:rPr>
+          <w:lang w:val="en-GB"/>
+        </w:rPr>
+      </w:pPr>
+    </w:p>
+    <w:p>
+      <w:pPr>
+        <w:rPr>
+          <w:lang w:val="en-GB"/>
+        </w:rPr>
+      </w:pPr>
+    </w:p>
+    <w:p>
+      <w:pPr>
+        <w:rPr>
+          <w:lang w:val="en-GB"/>
+        </w:rPr>
+      </w:pPr>
+    </w:p>
+    <w:p>
+      <w:pPr>
+        <w:rPr>
+          <w:lang w:val="en-GB"/>
+        </w:rPr>
+      </w:pPr>
+    </w:p>
+    <w:p>
+      <w:pPr>
+        <w:rPr>
+          <w:lang w:val="en-GB"/>
+        </w:rPr>
+      </w:pPr>
+    </w:p>
+    <w:p>
+      <w:pPr>
+        <w:rPr>
+          <w:lang w:val="en-GB"/>
+        </w:rPr>
+      </w:pPr>
+    </w:p>
+    <w:p>
+      <w:pPr>
+        <w:rPr>
+          <w:lang w:val="en-GB"/>
+        </w:rPr>
+      </w:pPr>
+    </w:p>
+    <w:p>
+      <w:pPr>
+        <w:rPr>
+          <w:lang w:val="en-GB"/>
+        </w:rPr>
+      </w:pPr>
+    </w:p>
+    <w:p>
+      <w:pPr>
+        <w:rPr>
+          <w:lang w:val="en-GB"/>
+        </w:rPr>
+      </w:pPr>
+    </w:p>
+    <w:p>
+      <w:pPr>
+        <w:rPr>
+          <w:lang w:val="en-GB"/>
+        </w:rPr>
+      </w:pPr>
+    </w:p>
+    <w:p>
+      <w:pPr>
+        <w:rPr>
+          <w:lang w:val="en-GB"/>
+        </w:rPr>
+      </w:pPr>
+    </w:p>
+    <w:p>
+      <w:pPr>
+        <w:rPr>
+          <w:lang w:val="en-GB"/>
+        </w:rPr>
+      </w:pPr>
+    </w:p>
+    <w:p>
+      <w:pPr>
+        <w:rPr>
+          <w:lang w:val="en-GB"/>
+        </w:rPr>
+      </w:pPr>
+    </w:p>
+    <w:p>
+      <w:pPr>
+        <w:rPr>
+          <w:lang w:val="en-GB"/>
+        </w:rPr>
+      </w:pPr>
+    </w:p>
+    <w:p>
+      <w:pPr>
+        <w:rPr>
+          <w:lang w:val="en-GB"/>
+        </w:rPr>
+      </w:pPr>
+    </w:p>
+    <w:p>
+      <w:pPr>
+        <w:rPr>
+          <w:lang w:val="en-GB"/>
+        </w:rPr>
+      </w:pPr>
+    </w:p>
+    <w:p>
+      <w:pPr>
+        <w:rPr>
+          <w:lang w:val="en-GB"/>
+        </w:rPr>
+      </w:pPr>
+    </w:p>
+    <w:p>
+      <w:pPr>
+        <w:rPr>
+          <w:lang w:val="en-GB"/>
+        </w:rPr>
+      </w:pPr>
+    </w:p>
+    <w:p>
+      <w:pPr>
+        <w:rPr>
+          <w:lang w:val="en-GB"/>
+        </w:rPr>
+      </w:pPr>
+    </w:p>
+    <w:p>
+      <w:pPr>
+        <w:rPr>
+          <w:lang w:val="en-GB"/>
+        </w:rPr>
+      </w:pPr>
+    </w:p>
+    <w:p/>
+    <w:p/>
+    <w:p/>
+    <w:p>
+      <w:pPr>
+        <w:pStyle w:val="Heading1"/>
+      </w:pPr>
+      <w:r>
+        <w:lastRenderedPageBreak/>
+        <w:t xml:space="preserve">Additional </w:t>
+      </w:r>
+      <w:r>
+        <w:t>Functionalities</w:t>
+      </w:r>
+    </w:p>
+    <w:p/>
+    <w:p>
+      <w:pPr>
+        <w:pStyle w:val="Heading2"/>
+      </w:pPr>
+      <w:r>
+        <w:t>Dashboards</w:t>
+      </w:r>
+    </w:p>
+    <w:p/>
+    <w:p>
+      <w:pPr>
+        <w:rPr>
+          <w:lang w:val="en-GB"/>
+        </w:rPr>
+      </w:pPr>
+      <w:r>
+        <w:rPr>
+          <w:lang w:val="en-GB"/>
+        </w:rPr>
+        <w:t>A Dashboard button will be made available to all registered users, providing them with an intuitive and easy-to-access overview of key safety metrics. Once clicked, this button will open a dashboard interface displaying important data such as the number of incidents detected for each user, along with other relevant statistics. These insights will help safety officers, managers, and company representatives monitor the overall safety performance of the site in real time.</w:t>
+      </w:r>
+    </w:p>
+    <w:p>
+      <w:pPr>
+        <w:rPr>
+          <w:lang w:val="en-GB"/>
+        </w:rPr>
+      </w:pPr>
+      <w:r>
+        <w:rPr>
+          <w:lang w:val="en-GB"/>
+        </w:rPr>
+        <w:t>Key features of the dashboard include:</w:t>
+      </w:r>
+    </w:p>
+    <w:p>
+      <w:pPr>
+        <w:numPr>
+          <w:ilvl w:val="0"/>
+          <w:numId w:val="25"/>
+        </w:numPr>
+        <w:rPr>
+          <w:lang w:val="en-GB"/>
+        </w:rPr>
+      </w:pPr>
+      <w:r>
+        <w:rPr>
+          <w:b/>
+          <w:bCs/>
+          <w:lang w:val="en-GB"/>
+        </w:rPr>
+        <w:t>Incident Tracking</w:t>
+      </w:r>
+      <w:r>
+        <w:rPr>
+          <w:lang w:val="en-GB"/>
+        </w:rPr>
+        <w:t>: A visual representation of the number of incidents. This will allow managers to quickly assess safety compliance and identify areas needing improvement.</w:t>
+      </w:r>
+    </w:p>
+    <w:p>
+      <w:pPr>
+        <w:numPr>
+          <w:ilvl w:val="0"/>
+          <w:numId w:val="25"/>
+        </w:numPr>
+        <w:rPr>
+          <w:lang w:val="en-GB"/>
+        </w:rPr>
+      </w:pPr>
+      <w:r>
+        <w:rPr>
+          <w:b/>
+          <w:bCs/>
+        </w:rPr>
+        <w:t>Safety Statistics</w:t>
+      </w:r>
+      <w:r>
+        <w:t>: The dashboard will also display aggregated statistics through interactive graphs, such as bar charts or line graphs, showing the total number of violations over a specific period. These graphs will highlight trends in safety performance, allowing users to visually track improvements or issues in safety compliance. Key metrics such as the frequency of violations by type (e.g., no helmet, no high-visibility jacket) will be represented, helping users quickly assess how well safety protocols are being followed across the site.</w:t>
+      </w:r>
+    </w:p>
+    <w:p>
+      <w:pPr>
+        <w:numPr>
+          <w:ilvl w:val="0"/>
+          <w:numId w:val="25"/>
+        </w:numPr>
+        <w:rPr>
+          <w:lang w:val="en-GB"/>
+        </w:rPr>
+      </w:pPr>
+      <w:r>
+        <w:rPr>
+          <w:b/>
+          <w:bCs/>
+          <w:lang w:val="en-GB"/>
+        </w:rPr>
+        <w:t>Safety Reporting</w:t>
+      </w:r>
+      <w:r>
+        <w:rPr>
+          <w:lang w:val="en-GB"/>
+        </w:rPr>
+        <w:t>: Companies can use this dashboard to generate reports that highlight the safety status of their construction sites. These reports will be valuable for audits, safety meetings, and to showcase their commitment to worker safety.</w:t>
+      </w:r>
+    </w:p>
+    <w:p>
+      <w:pPr>
+        <w:rPr>
+          <w:lang w:val="en-GB"/>
+        </w:rPr>
+      </w:pPr>
+      <w:r>
+        <w:rPr>
+          <w:lang w:val="en-GB"/>
+        </w:rPr>
+        <w:t>The user interface will be designed to be easy to navigate and visually engaging, making it an essential tool for monitoring and improving workplace safety.</w:t>
+      </w:r>
+    </w:p>
+    <w:p>
+      <w:r>
+        <w:rPr>
+          <w:noProof/>
+        </w:rPr>
+        <w:drawing>
+          <wp:anchor distT="0" distB="0" distL="114300" distR="114300" simplePos="0" relativeHeight="251801600" behindDoc="0" locked="0" layoutInCell="1" allowOverlap="1" wp14:anchorId="60DA2958" wp14:editId="052C7D59">
+            <wp:simplePos x="0" y="0"/>
+            <wp:positionH relativeFrom="column">
+              <wp:posOffset>-106680</wp:posOffset>
+            </wp:positionH>
+            <wp:positionV relativeFrom="paragraph">
+              <wp:posOffset>3810</wp:posOffset>
+            </wp:positionV>
+            <wp:extent cx="5730240" cy="1958340"/>
+            <wp:effectExtent l="0" t="0" r="3810" b="3810"/>
+            <wp:wrapNone/>
+            <wp:docPr id="1807860910" name="Picture 7"/>
+            <wp:cNvGraphicFramePr>
+              <a:graphicFrameLocks xmlns:a="http://schemas.openxmlformats.org/drawingml/2006/main" noChangeAspect="1"/>
+            </wp:cNvGraphicFramePr>
+            <a:graphic xmlns:a="http://schemas.openxmlformats.org/drawingml/2006/main">
+              <a:graphicData uri="http://schemas.openxmlformats.org/drawingml/2006/picture">
+                <pic:pic xmlns:pic="http://schemas.openxmlformats.org/drawingml/2006/picture">
+                  <pic:nvPicPr>
+                    <pic:cNvPr id="0" name="Picture 5"/>
+                    <pic:cNvPicPr>
+                      <a:picLocks noChangeAspect="1" noChangeArrowheads="1"/>
+                    </pic:cNvPicPr>
+                  </pic:nvPicPr>
+                  <pic:blipFill>
+                    <a:blip r:embed="rId14">
+                      <a:extLst>
+                        <a:ext uri="{28A0092B-C50C-407E-A947-70E740481C1C}">
+                          <a14:useLocalDpi xmlns:a14="http://schemas.microsoft.com/office/drawing/2010/main" val="0"/>
+                        </a:ext>
+                      </a:extLst>
+                    </a:blip>
+                    <a:srcRect/>
+                    <a:stretch>
+                      <a:fillRect/>
+                    </a:stretch>
+                  </pic:blipFill>
+                  <pic:spPr bwMode="auto">
+                    <a:xfrm>
+                      <a:off x="0" y="0"/>
+                      <a:ext cx="5730240" cy="1958340"/>
+                    </a:xfrm>
+                    <a:prstGeom prst="rect">
+                      <a:avLst/>
+                    </a:prstGeom>
+                    <a:noFill/>
+                    <a:ln>
+                      <a:noFill/>
+                    </a:ln>
+                  </pic:spPr>
+                </pic:pic>
+              </a:graphicData>
+            </a:graphic>
+            <wp14:sizeRelH relativeFrom="page">
+              <wp14:pctWidth>0</wp14:pctWidth>
+            </wp14:sizeRelH>
+            <wp14:sizeRelV relativeFrom="page">
+              <wp14:pctHeight>0</wp14:pctHeight>
+            </wp14:sizeRelV>
+          </wp:anchor>
+        </w:drawing>
+      </w:r>
+    </w:p>
+    <w:p/>
+    <w:p/>
+    <w:p/>
+    <w:p/>
+    <w:p/>
+    <w:p/>
+    <w:p/>
+    <w:p>
+      <w:pPr>
+        <w:pStyle w:val="Heading1"/>
+      </w:pPr>
+      <w:r>
+        <w:lastRenderedPageBreak/>
+        <w:t>Project Plan</w:t>
+      </w:r>
+    </w:p>
+    <w:p>
+      <w:r>
+        <w:t>Documentation</w:t>
+      </w:r>
+    </w:p>
+    <w:p/>
+    <w:p>
+      <w:r>
+        <w:t>Timeline?</w:t>
+      </w:r>
+    </w:p>
+    <w:p/>
+    <w:p>
+      <w:r>
+        <w:t>Model</w:t>
+      </w:r>
+    </w:p>
+    <w:p/>
+    <w:p>
+      <w:r>
+        <w:t>Frontend</w:t>
+      </w:r>
+    </w:p>
+    <w:p/>
+    <w:p>
+      <w:r>
+        <w:t>Backend</w:t>
+      </w:r>
+    </w:p>
+    <w:p/>
+    <w:p/>
+    <w:p/>
+    <w:p/>
+    <w:p/>
+    <w:p/>
+    <w:p/>
+    <w:p/>
+    <w:p/>
+    <w:p/>
+    <w:p/>
+    <w:p/>
+    <w:p/>
+    <w:p/>
+    <w:p/>
+    <w:p/>
+    <w:p/>
+    <w:p/>
+    <w:p>
+      <w:pPr>
+        <w:pStyle w:val="Heading1"/>
+      </w:pPr>
+      <w:r>
+        <w:lastRenderedPageBreak/>
+        <w:t>UI/UX Design</w:t>
+      </w:r>
+    </w:p>
+    <w:p/>
+    <w:p>
+      <w:r>
+        <w:t xml:space="preserve">The UI/UX design for this project will keep thing as simple as possible for the user. A one-page design will be implemented with the </w:t>
+      </w:r>
+      <w:proofErr w:type="spellStart"/>
+      <w:r>
+        <w:t>SiteSafe</w:t>
+      </w:r>
+      <w:proofErr w:type="spellEnd"/>
+      <w:r>
+        <w:t xml:space="preserve"> logo on the left-hand side and the settings on the right-hand side. At the top of the page there will be a menu for navigation, but this should see minimal use since the page is designed to be fully operational from the first page. This is to make the user experience as intuitive as possible.</w:t>
+      </w:r>
+    </w:p>
+    <w:p>
+      <w:r>
+        <w:t>For the demo page the top navigation options will include Home, Description, Documentation and Contact.</w:t>
+      </w:r>
+    </w:p>
+    <w:p>
+      <w:r>
+        <w:t>The options on the right-hand side of the screen will include Turn Camera On/Off, Set Automatic Email/Phone, Email notification toggle, SMS notification toggle, Sensitivity slider and Open Dashboard button.</w:t>
+      </w:r>
+    </w:p>
+    <w:p/>
+    <w:p>
+      <w:pPr>
+        <w:pStyle w:val="Heading3"/>
+      </w:pPr>
+      <w:r>
+        <w:t>Home Screen Demo Site</w:t>
+      </w:r>
+    </w:p>
+    <w:p/>
+    <w:p>
+      <w:r>
+        <w:rPr>
+          <w:noProof/>
+        </w:rPr>
+        <w:drawing>
+          <wp:inline distT="0" distB="0" distL="0" distR="0" wp14:anchorId="2CEF1E79" wp14:editId="2D85B167">
+            <wp:extent cx="5722620" cy="2606040"/>
+            <wp:effectExtent l="0" t="0" r="0" b="3810"/>
+            <wp:docPr id="2045059732" name="Picture 8"/>
+            <wp:cNvGraphicFramePr>
+              <a:graphicFrameLocks xmlns:a="http://schemas.openxmlformats.org/drawingml/2006/main" noChangeAspect="1"/>
+            </wp:cNvGraphicFramePr>
+            <a:graphic xmlns:a="http://schemas.openxmlformats.org/drawingml/2006/main">
+              <a:graphicData uri="http://schemas.openxmlformats.org/drawingml/2006/picture">
+                <pic:pic xmlns:pic="http://schemas.openxmlformats.org/drawingml/2006/picture">
+                  <pic:nvPicPr>
+                    <pic:cNvPr id="0" name="Picture 6"/>
+                    <pic:cNvPicPr>
+                      <a:picLocks noChangeAspect="1" noChangeArrowheads="1"/>
+                    </pic:cNvPicPr>
+                  </pic:nvPicPr>
+                  <pic:blipFill>
+                    <a:blip r:embed="rId15" cstate="print">
+                      <a:extLst>
+                        <a:ext uri="{28A0092B-C50C-407E-A947-70E740481C1C}">
+                          <a14:useLocalDpi xmlns:a14="http://schemas.microsoft.com/office/drawing/2010/main" val="0"/>
+                        </a:ext>
+                      </a:extLst>
+                    </a:blip>
+                    <a:srcRect/>
+                    <a:stretch>
+                      <a:fillRect/>
+                    </a:stretch>
+                  </pic:blipFill>
+                  <pic:spPr bwMode="auto">
+                    <a:xfrm>
+                      <a:off x="0" y="0"/>
+                      <a:ext cx="5722620" cy="2606040"/>
+                    </a:xfrm>
+                    <a:prstGeom prst="rect">
+                      <a:avLst/>
+                    </a:prstGeom>
+                    <a:noFill/>
+                    <a:ln>
+                      <a:noFill/>
+                    </a:ln>
+                  </pic:spPr>
+                </pic:pic>
+              </a:graphicData>
+            </a:graphic>
+          </wp:inline>
+        </w:drawing>
+      </w:r>
+    </w:p>
+    <w:p>
+      <w:pPr>
+        <w:pStyle w:val="Heading1"/>
+        <w:jc w:val="left"/>
+      </w:pPr>
+    </w:p>
+    <w:p/>
+    <w:p/>
+    <w:p/>
+    <w:p>
+      <w:pPr>
+        <w:pStyle w:val="Heading1"/>
+      </w:pPr>
+      <w:r>
+        <w:lastRenderedPageBreak/>
+        <w:t>Database</w:t>
+      </w:r>
+    </w:p>
+    <w:p>
+      <w:pPr>
+        <w:pStyle w:val="Heading2"/>
+      </w:pPr>
+      <w:r>
+        <w:t>Overview</w:t>
+      </w:r>
+    </w:p>
+    <w:p/>
+    <w:p>
+      <w:pPr>
+        <w:rPr>
+          <w:lang w:val="en-GB"/>
+        </w:rPr>
+      </w:pPr>
+      <w:r>
+        <w:rPr>
+          <w:lang w:val="en-GB"/>
+        </w:rPr>
+        <w:t>The database is a critical component of the Construction Safety Monitoring System. It will store key information related to video stream monitoring, object detection results, and user interactions with the system.</w:t>
+      </w:r>
+    </w:p>
+    <w:p>
+      <w:r>
+        <w:t>MySQL was selected as the database solution for the Construction Safety Monitoring System due to its robust performance, reliability, and widespread use in the industry. MySQL offers high scalability, ease of integration with Python and other web technologies, and strong support for complex queries, which are essential for storing and analy</w:t>
+      </w:r>
+      <w:r>
+        <w:t>s</w:t>
+      </w:r>
+      <w:r>
+        <w:t>ing real-time detection data. Additionally, MySQL's support for</w:t>
+      </w:r>
+      <w:r>
+        <w:t xml:space="preserve"> </w:t>
+      </w:r>
+      <w:r>
+        <w:t>Atomicity, Consistency, Isolation, and Durability ACID compliance ensures data consistency and integrity, making it an ideal choice for managing critical safety-related information in the system.</w:t>
+      </w:r>
+    </w:p>
+    <w:p>
+      <w:pPr>
+        <w:rPr>
+          <w:lang w:val="en-GB"/>
+        </w:rPr>
+      </w:pPr>
+      <w:r>
+        <w:rPr>
+          <w:lang w:val="en-GB"/>
+        </w:rPr>
+        <w:t>The database will facilitate the tracking of safety violations, generate detailed reports, and support real-time alerts. The following section outlines the proposed database structure, data flow, and relevant considerations.</w:t>
+      </w:r>
+    </w:p>
+    <w:p>
+      <w:pPr>
+        <w:rPr>
+          <w:lang w:val="en-GB"/>
+        </w:rPr>
+      </w:pPr>
+    </w:p>
+    <w:p>
+      <w:pPr>
+        <w:rPr>
+          <w:lang w:val="en-GB"/>
+        </w:rPr>
+      </w:pPr>
+    </w:p>
+    <w:p>
+      <w:pPr>
+        <w:rPr>
+          <w:lang w:val="en-GB"/>
+        </w:rPr>
+      </w:pPr>
+    </w:p>
+    <w:p>
+      <w:pPr>
+        <w:rPr>
+          <w:lang w:val="en-GB"/>
+        </w:rPr>
+      </w:pPr>
+    </w:p>
+    <w:p>
+      <w:pPr>
+        <w:rPr>
+          <w:lang w:val="en-GB"/>
+        </w:rPr>
+      </w:pPr>
+    </w:p>
+    <w:p>
+      <w:pPr>
+        <w:rPr>
+          <w:lang w:val="en-GB"/>
+        </w:rPr>
+      </w:pPr>
+    </w:p>
+    <w:p>
+      <w:pPr>
+        <w:rPr>
+          <w:lang w:val="en-GB"/>
+        </w:rPr>
+      </w:pPr>
+    </w:p>
+    <w:p>
+      <w:pPr>
+        <w:rPr>
+          <w:lang w:val="en-GB"/>
+        </w:rPr>
+      </w:pPr>
+    </w:p>
+    <w:p>
+      <w:pPr>
+        <w:rPr>
+          <w:lang w:val="en-GB"/>
+        </w:rPr>
+      </w:pPr>
+    </w:p>
+    <w:p>
+      <w:pPr>
+        <w:rPr>
+          <w:lang w:val="en-GB"/>
+        </w:rPr>
+      </w:pPr>
+    </w:p>
+    <w:p>
+      <w:pPr>
+        <w:rPr>
+          <w:lang w:val="en-GB"/>
+        </w:rPr>
+      </w:pPr>
+    </w:p>
+    <w:p>
+      <w:pPr>
+        <w:rPr>
+          <w:lang w:val="en-GB"/>
+        </w:rPr>
+      </w:pPr>
+    </w:p>
+    <w:p>
+      <w:pPr>
+        <w:rPr>
+          <w:lang w:val="en-GB"/>
+        </w:rPr>
+      </w:pPr>
+    </w:p>
+    <w:p>
+      <w:pPr>
+        <w:rPr>
+          <w:lang w:val="en-GB"/>
+        </w:rPr>
+      </w:pPr>
+    </w:p>
+    <w:p>
+      <w:pPr>
+        <w:rPr>
+          <w:lang w:val="en-GB"/>
+        </w:rPr>
+      </w:pPr>
+    </w:p>
+    <w:p>
+      <w:pPr>
+        <w:pStyle w:val="Heading2"/>
+      </w:pPr>
+      <w:r>
+        <w:lastRenderedPageBreak/>
+        <w:t>Database Tables</w:t>
+      </w:r>
+    </w:p>
+    <w:p>
+      <w:pPr>
+        <w:rPr>
+          <w:lang w:val="en-GB"/>
+        </w:rPr>
+      </w:pPr>
+    </w:p>
+    <w:p>
+      <w:pPr>
+        <w:rPr>
+          <w:lang w:val="en-GB"/>
+        </w:rPr>
+      </w:pPr>
+      <w:r>
+        <w:rPr>
+          <w:lang w:val="en-GB"/>
+        </w:rPr>
+        <w:t>The system will be divided into several core tables</w:t>
+      </w:r>
+      <w:r>
+        <w:rPr>
+          <w:lang w:val="en-GB"/>
+        </w:rPr>
+        <w:t xml:space="preserve">, </w:t>
+      </w:r>
+      <w:r>
+        <w:rPr>
+          <w:lang w:val="en-GB"/>
+        </w:rPr>
+        <w:t>each responsible for storing a specific type of data:</w:t>
+      </w:r>
+    </w:p>
+    <w:p>
+      <w:pPr>
+        <w:rPr>
+          <w:lang w:val="en-GB"/>
+        </w:rPr>
+      </w:pPr>
+    </w:p>
+    <w:p>
+      <w:pPr>
+        <w:pStyle w:val="Heading3"/>
+      </w:pPr>
+      <w:r>
+        <w:t xml:space="preserve">Incident </w:t>
+      </w:r>
+      <w:r>
+        <w:t>Detection Logs Table</w:t>
+      </w:r>
+    </w:p>
+    <w:p/>
+    <w:p>
+      <w:pPr>
+        <w:rPr>
+          <w:lang w:val="en-GB"/>
+        </w:rPr>
+      </w:pPr>
+      <w:r>
+        <w:rPr>
+          <w:lang w:val="en-GB"/>
+        </w:rPr>
+        <w:t xml:space="preserve">This table will store details of each object </w:t>
+      </w:r>
+      <w:r>
+        <w:rPr>
+          <w:lang w:val="en-GB"/>
+        </w:rPr>
+        <w:t>incident</w:t>
+      </w:r>
+      <w:r>
+        <w:rPr>
+          <w:lang w:val="en-GB"/>
+        </w:rPr>
+        <w:t xml:space="preserve"> event, including the detection confidence,</w:t>
+      </w:r>
+      <w:r>
+        <w:rPr>
+          <w:lang w:val="en-GB"/>
+        </w:rPr>
+        <w:t xml:space="preserve"> type</w:t>
+      </w:r>
+      <w:r>
+        <w:rPr>
+          <w:lang w:val="en-GB"/>
+        </w:rPr>
+        <w:t xml:space="preserve"> and the</w:t>
+      </w:r>
+      <w:r>
+        <w:rPr>
+          <w:lang w:val="en-GB"/>
+        </w:rPr>
+        <w:t xml:space="preserve"> binary </w:t>
+      </w:r>
+      <w:r>
+        <w:rPr>
+          <w:lang w:val="en-GB"/>
+        </w:rPr>
+        <w:t xml:space="preserve">image. It is essential for tracking the results of each </w:t>
+      </w:r>
+      <w:r>
+        <w:rPr>
+          <w:lang w:val="en-GB"/>
+        </w:rPr>
+        <w:t xml:space="preserve">incident </w:t>
+      </w:r>
+      <w:r>
+        <w:rPr>
+          <w:lang w:val="en-GB"/>
+        </w:rPr>
+        <w:t>detection and providing context for alerts.</w:t>
+      </w:r>
+    </w:p>
+    <w:p>
+      <w:pPr>
+        <w:rPr>
+          <w:lang w:val="en-GB"/>
+        </w:rPr>
+      </w:pPr>
+    </w:p>
+    <w:p>
+      <w:pPr>
+        <w:rPr>
+          <w:lang w:val="en-GB"/>
+        </w:rPr>
+      </w:pPr>
+      <w:r>
+        <w:rPr>
+          <w:noProof/>
+          <w:lang w:val="en-GB"/>
+        </w:rPr>
+        <w:drawing>
+          <wp:inline distT="0" distB="0" distL="0" distR="0" wp14:anchorId="484B8CB4" wp14:editId="6ABB82F0">
+            <wp:extent cx="5341620" cy="3543300"/>
+            <wp:effectExtent l="0" t="0" r="0" b="0"/>
+            <wp:docPr id="2140700710" name="Picture 3" descr="A screenshot of a data type&#10;&#10;Description automatically generated"/>
+            <wp:cNvGraphicFramePr>
+              <a:graphicFrameLocks xmlns:a="http://schemas.openxmlformats.org/drawingml/2006/main" noChangeAspect="1"/>
+            </wp:cNvGraphicFramePr>
+            <a:graphic xmlns:a="http://schemas.openxmlformats.org/drawingml/2006/main">
+              <a:graphicData uri="http://schemas.openxmlformats.org/drawingml/2006/picture">
+                <pic:pic xmlns:pic="http://schemas.openxmlformats.org/drawingml/2006/picture">
+                  <pic:nvPicPr>
+                    <pic:cNvPr id="2140700710" name="Picture 3" descr="A screenshot of a data type&#10;&#10;Description automatically generated"/>
+                    <pic:cNvPicPr>
+                      <a:picLocks noChangeAspect="1" noChangeArrowheads="1"/>
+                    </pic:cNvPicPr>
+                  </pic:nvPicPr>
+                  <pic:blipFill>
+                    <a:blip r:embed="rId16">
+                      <a:extLst>
+                        <a:ext uri="{28A0092B-C50C-407E-A947-70E740481C1C}">
+                          <a14:useLocalDpi xmlns:a14="http://schemas.microsoft.com/office/drawing/2010/main" val="0"/>
+                        </a:ext>
+                      </a:extLst>
+                    </a:blip>
+                    <a:srcRect/>
+                    <a:stretch>
+                      <a:fillRect/>
+                    </a:stretch>
+                  </pic:blipFill>
+                  <pic:spPr bwMode="auto">
+                    <a:xfrm>
+                      <a:off x="0" y="0"/>
+                      <a:ext cx="5341620" cy="3543300"/>
+                    </a:xfrm>
+                    <a:prstGeom prst="rect">
+                      <a:avLst/>
+                    </a:prstGeom>
+                    <a:noFill/>
+                    <a:ln>
+                      <a:noFill/>
+                    </a:ln>
+                  </pic:spPr>
+                </pic:pic>
+              </a:graphicData>
+            </a:graphic>
+          </wp:inline>
+        </w:drawing>
+      </w:r>
+    </w:p>
+    <w:p>
+      <w:pPr>
+        <w:rPr>
+          <w:lang w:val="en-GB"/>
+        </w:rPr>
+      </w:pPr>
+    </w:p>
+    <w:p>
+      <w:pPr>
+        <w:rPr>
+          <w:lang w:val="en-GB"/>
+        </w:rPr>
+      </w:pPr>
+    </w:p>
+    <w:p>
+      <w:pPr>
+        <w:rPr>
+          <w:lang w:val="en-GB"/>
+        </w:rPr>
+      </w:pPr>
+    </w:p>
+    <w:p>
+      <w:pPr>
+        <w:rPr>
+          <w:lang w:val="en-GB"/>
+        </w:rPr>
+      </w:pPr>
+    </w:p>
+    <w:p>
+      <w:pPr>
+        <w:rPr>
+          <w:lang w:val="en-GB"/>
+        </w:rPr>
+      </w:pPr>
+    </w:p>
+    <w:p>
+      <w:pPr>
+        <w:rPr>
+          <w:lang w:val="en-GB"/>
+        </w:rPr>
+      </w:pPr>
+    </w:p>
+    <w:p>
+      <w:pPr>
+        <w:rPr>
+          <w:lang w:val="en-GB"/>
+        </w:rPr>
+      </w:pPr>
+    </w:p>
+    <w:p>
+      <w:pPr>
+        <w:rPr>
+          <w:lang w:val="en-GB"/>
+        </w:rPr>
+      </w:pPr>
+    </w:p>
+    <w:p>
+      <w:pPr>
+        <w:pStyle w:val="Heading3"/>
+      </w:pPr>
+      <w:r>
+        <w:lastRenderedPageBreak/>
+        <w:t>Users Table</w:t>
+      </w:r>
+    </w:p>
+    <w:p>
+      <w:pPr>
+        <w:rPr>
+          <w:lang w:val="en-GB"/>
+        </w:rPr>
+      </w:pPr>
+    </w:p>
+    <w:p>
+      <w:pPr>
+        <w:rPr>
+          <w:lang w:val="en-GB"/>
+        </w:rPr>
+      </w:pPr>
+      <w:r>
+        <w:rPr>
+          <w:lang w:val="en-GB"/>
+        </w:rPr>
+        <w:t>This table will store information about system users, including their roles (admin or regular user</w:t>
+      </w:r>
+      <w:r>
+        <w:rPr>
+          <w:lang w:val="en-GB"/>
+        </w:rPr>
+        <w:t>)</w:t>
+      </w:r>
+      <w:r>
+        <w:rPr>
+          <w:lang w:val="en-GB"/>
+        </w:rPr>
+        <w:t xml:space="preserve">, and </w:t>
+      </w:r>
+      <w:r>
+        <w:rPr>
+          <w:lang w:val="en-GB"/>
+        </w:rPr>
+        <w:t>password for log in</w:t>
+      </w:r>
+      <w:r>
+        <w:rPr>
+          <w:lang w:val="en-GB"/>
+        </w:rPr>
+        <w:t>. This information will be useful for managing system permissions and tracking user-specific actions</w:t>
+      </w:r>
+      <w:r>
+        <w:rPr>
+          <w:lang w:val="en-GB"/>
+        </w:rPr>
+        <w:t>.</w:t>
+      </w:r>
+    </w:p>
+    <w:p>
+      <w:pPr>
+        <w:rPr>
+          <w:lang w:val="en-GB"/>
+        </w:rPr>
+      </w:pPr>
+    </w:p>
+    <w:p>
+      <w:pPr>
+        <w:rPr>
+          <w:lang w:val="en-GB"/>
+        </w:rPr>
+      </w:pPr>
+      <w:r>
+        <w:rPr>
+          <w:noProof/>
+          <w:lang w:val="en-GB"/>
+        </w:rPr>
+        <w:drawing>
+          <wp:inline distT="0" distB="0" distL="0" distR="0" wp14:anchorId="44C0C972" wp14:editId="7E9AF48D">
+            <wp:extent cx="4229100" cy="3528060"/>
+            <wp:effectExtent l="0" t="0" r="0" b="0"/>
+            <wp:docPr id="1686743696" name="Picture 4"/>
+            <wp:cNvGraphicFramePr>
+              <a:graphicFrameLocks xmlns:a="http://schemas.openxmlformats.org/drawingml/2006/main" noChangeAspect="1"/>
+            </wp:cNvGraphicFramePr>
+            <a:graphic xmlns:a="http://schemas.openxmlformats.org/drawingml/2006/main">
+              <a:graphicData uri="http://schemas.openxmlformats.org/drawingml/2006/picture">
+                <pic:pic xmlns:pic="http://schemas.openxmlformats.org/drawingml/2006/picture">
+                  <pic:nvPicPr>
+                    <pic:cNvPr id="0" name="Picture 2"/>
+                    <pic:cNvPicPr>
+                      <a:picLocks noChangeAspect="1" noChangeArrowheads="1"/>
+                    </pic:cNvPicPr>
+                  </pic:nvPicPr>
+                  <pic:blipFill>
+                    <a:blip r:embed="rId17">
+                      <a:extLst>
+                        <a:ext uri="{28A0092B-C50C-407E-A947-70E740481C1C}">
+                          <a14:useLocalDpi xmlns:a14="http://schemas.microsoft.com/office/drawing/2010/main" val="0"/>
+                        </a:ext>
+                      </a:extLst>
+                    </a:blip>
+                    <a:srcRect/>
+                    <a:stretch>
+                      <a:fillRect/>
+                    </a:stretch>
+                  </pic:blipFill>
+                  <pic:spPr bwMode="auto">
+                    <a:xfrm>
+                      <a:off x="0" y="0"/>
+                      <a:ext cx="4229100" cy="3528060"/>
+                    </a:xfrm>
+                    <a:prstGeom prst="rect">
+                      <a:avLst/>
+                    </a:prstGeom>
+                    <a:noFill/>
+                    <a:ln>
+                      <a:noFill/>
+                    </a:ln>
+                  </pic:spPr>
+                </pic:pic>
+              </a:graphicData>
+            </a:graphic>
+          </wp:inline>
+        </w:drawing>
+      </w:r>
+    </w:p>
+    <w:p>
+      <w:pPr>
+        <w:rPr>
+          <w:lang w:val="en-GB"/>
+        </w:rPr>
+      </w:pPr>
+    </w:p>
+    <w:p>
+      <w:pPr>
+        <w:rPr>
+          <w:lang w:val="en-GB"/>
+        </w:rPr>
+      </w:pPr>
+    </w:p>
+    <w:p>
+      <w:pPr>
+        <w:rPr>
+          <w:lang w:val="en-GB"/>
+        </w:rPr>
+      </w:pPr>
+    </w:p>
+    <w:p>
+      <w:pPr>
+        <w:rPr>
+          <w:lang w:val="en-GB"/>
+        </w:rPr>
+      </w:pPr>
+    </w:p>
+    <w:p>
+      <w:pPr>
+        <w:rPr>
+          <w:lang w:val="en-GB"/>
+        </w:rPr>
+      </w:pPr>
+    </w:p>
+    <w:p>
+      <w:pPr>
+        <w:rPr>
+          <w:lang w:val="en-GB"/>
+        </w:rPr>
+      </w:pPr>
+    </w:p>
+    <w:p>
+      <w:pPr>
+        <w:rPr>
+          <w:lang w:val="en-GB"/>
+        </w:rPr>
+      </w:pPr>
+    </w:p>
+    <w:p>
+      <w:pPr>
+        <w:rPr>
+          <w:lang w:val="en-GB"/>
+        </w:rPr>
+      </w:pPr>
+    </w:p>
+    <w:p>
+      <w:pPr>
+        <w:rPr>
+          <w:lang w:val="en-GB"/>
+        </w:rPr>
+      </w:pPr>
+    </w:p>
+    <w:p>
+      <w:pPr>
+        <w:rPr>
+          <w:lang w:val="en-GB"/>
+        </w:rPr>
+      </w:pPr>
+    </w:p>
+    <w:p>
+      <w:pPr>
+        <w:rPr>
+          <w:lang w:val="en-GB"/>
+        </w:rPr>
+      </w:pPr>
+    </w:p>
+    <w:p>
+      <w:pPr>
+        <w:rPr>
+          <w:lang w:val="en-GB"/>
+        </w:rPr>
+      </w:pPr>
+    </w:p>
+    <w:p>
+      <w:pPr>
+        <w:rPr>
+          <w:lang w:val="en-GB"/>
+        </w:rPr>
+      </w:pPr>
+    </w:p>
+    <w:p>
+      <w:pPr>
+        <w:pStyle w:val="Heading3"/>
+      </w:pPr>
+      <w:r>
+        <w:t>Settings Table</w:t>
+      </w:r>
+    </w:p>
+    <w:p>
+      <w:pPr>
+        <w:rPr>
+          <w:lang w:val="en-GB"/>
+        </w:rPr>
+      </w:pPr>
+    </w:p>
+    <w:p>
+      <w:r>
+        <w:t>This table will store user-specific settings and preferences, including their notification preferences (email and SMS), confidence threshold for detection alerts, and contact details for notifications. It will allow for customi</w:t>
+      </w:r>
+      <w:r>
+        <w:t>s</w:t>
+      </w:r>
+      <w:r>
+        <w:t>ed user configurations while maintaining a centrali</w:t>
+      </w:r>
+      <w:r>
+        <w:t>s</w:t>
+      </w:r>
+      <w:r>
+        <w:t>ed location for managing user-specific settings such as notification methods and thresholds. This information will be crucial for personali</w:t>
+      </w:r>
+      <w:r>
+        <w:t>s</w:t>
+      </w:r>
+      <w:r>
+        <w:t>ing user experience and managing alert delivery preferences.</w:t>
+      </w:r>
+    </w:p>
+    <w:p/>
+    <w:p>
+      <w:pPr>
+        <w:rPr>
+          <w:lang w:val="en-GB"/>
+        </w:rPr>
+      </w:pPr>
+      <w:r>
+        <w:rPr>
+          <w:noProof/>
+          <w:lang w:val="en-GB"/>
+        </w:rPr>
+        <w:drawing>
+          <wp:inline distT="0" distB="0" distL="0" distR="0" wp14:anchorId="528D9F05" wp14:editId="06EE377F">
+            <wp:extent cx="4503420" cy="3848100"/>
+            <wp:effectExtent l="0" t="0" r="0" b="0"/>
+            <wp:docPr id="461791252" name="Picture 6"/>
+            <wp:cNvGraphicFramePr>
+              <a:graphicFrameLocks xmlns:a="http://schemas.openxmlformats.org/drawingml/2006/main" noChangeAspect="1"/>
+            </wp:cNvGraphicFramePr>
+            <a:graphic xmlns:a="http://schemas.openxmlformats.org/drawingml/2006/main">
+              <a:graphicData uri="http://schemas.openxmlformats.org/drawingml/2006/picture">
+                <pic:pic xmlns:pic="http://schemas.openxmlformats.org/drawingml/2006/picture">
+                  <pic:nvPicPr>
+                    <pic:cNvPr id="0" name="Picture 4"/>
+                    <pic:cNvPicPr>
+                      <a:picLocks noChangeAspect="1" noChangeArrowheads="1"/>
+                    </pic:cNvPicPr>
+                  </pic:nvPicPr>
+                  <pic:blipFill>
+                    <a:blip r:embed="rId18">
+                      <a:extLst>
+                        <a:ext uri="{28A0092B-C50C-407E-A947-70E740481C1C}">
+                          <a14:useLocalDpi xmlns:a14="http://schemas.microsoft.com/office/drawing/2010/main" val="0"/>
+                        </a:ext>
+                      </a:extLst>
+                    </a:blip>
+                    <a:srcRect/>
+                    <a:stretch>
+                      <a:fillRect/>
+                    </a:stretch>
+                  </pic:blipFill>
+                  <pic:spPr bwMode="auto">
+                    <a:xfrm>
+                      <a:off x="0" y="0"/>
+                      <a:ext cx="4503420" cy="3848100"/>
+                    </a:xfrm>
+                    <a:prstGeom prst="rect">
+                      <a:avLst/>
+                    </a:prstGeom>
+                    <a:noFill/>
+                    <a:ln>
+                      <a:noFill/>
+                    </a:ln>
+                  </pic:spPr>
+                </pic:pic>
+              </a:graphicData>
+            </a:graphic>
+          </wp:inline>
+        </w:drawing>
+      </w:r>
+    </w:p>
+    <w:p>
+      <w:pPr>
+        <w:rPr>
+          <w:lang w:val="en-GB"/>
+        </w:rPr>
+      </w:pPr>
+    </w:p>
+    <w:p/>
+    <w:p/>
+    <w:p/>
+    <w:p/>
+    <w:p/>
+    <w:p/>
+    <w:p/>
+    <w:p>
+      <w:pPr>
+        <w:pStyle w:val="Heading3"/>
+      </w:pPr>
+      <w:r>
+        <w:lastRenderedPageBreak/>
+        <w:t>Dashboard</w:t>
+      </w:r>
+      <w:r>
+        <w:t xml:space="preserve"> Table</w:t>
+      </w:r>
+    </w:p>
+    <w:p/>
+    <w:p/>
+    <w:p/>
+    <w:p/>
+    <w:p/>
+    <w:p/>
+    <w:p/>
+    <w:p/>
+    <w:p/>
+    <w:p/>
+    <w:p/>
+    <w:p/>
+    <w:p/>
+    <w:p/>
+    <w:p/>
+    <w:p/>
+    <w:p/>
+    <w:p/>
+    <w:p/>
+    <w:p/>
+    <w:p/>
+    <w:p/>
+    <w:p/>
+    <w:p/>
+    <w:p/>
+    <w:p/>
+    <w:p/>
+    <w:p/>
+    <w:p/>
+    <w:p>
+      <w:pPr>
+        <w:pStyle w:val="Heading1"/>
+      </w:pPr>
+      <w:r>
+        <w:lastRenderedPageBreak/>
+        <w:t>E</w:t>
+      </w:r>
+      <w:r>
+        <w:t>ntity-Relationship Diagram</w:t>
+      </w:r>
+    </w:p>
+    <w:p/>
+    <w:p/>
+    <w:p>
+      <w:pPr>
+        <w:pStyle w:val="Heading1"/>
+      </w:pPr>
+      <w:r>
+        <w:t>Class Diagram</w:t>
+      </w:r>
+    </w:p>
+    <w:p/>
+    <w:p/>
+    <w:p>
+      <w:pPr>
+        <w:pStyle w:val="Heading1"/>
+      </w:pPr>
+      <w:r>
+        <w:t>Sequence Diagrams</w:t>
+      </w:r>
+    </w:p>
+    <w:p/>
+    <w:p/>
+    <w:p/>
+    <w:p/>
+    <w:p/>
+    <w:p/>
+    <w:p/>
+    <w:p/>
+    <w:p/>
+    <w:p/>
+    <w:p/>
+    <w:p/>
+    <w:p/>
+    <w:p/>
+    <w:p/>
+    <w:p/>
+    <w:p/>
+    <w:p/>
+    <w:p/>
+    <w:p/>
+    <w:p/>
+    <w:p/>
+    <w:p/>
+    <w:p/>
+    <w:p/>
+    <w:p/>
+    <w:p/>
+    <w:p/>
+    <w:p/>
+    <w:p/>
+    <w:p>
+      <w:pPr>
+        <w:pStyle w:val="Subtitle"/>
+        <w:rPr>
+          <w:color w:val="0070C0"/>
+        </w:rPr>
+      </w:pPr>
+      <w:r>
+        <w:rPr>
+          <w:color w:val="0070C0"/>
+        </w:rPr>
+        <w:t>References</w:t>
+      </w:r>
+    </w:p>
+    <w:p/>
+    <w:p>
+      <w:pPr>
+        <w:pStyle w:val="ListParagraph"/>
+        <w:numPr>
+          <w:ilvl w:val="0"/>
+          <w:numId w:val="24"/>
+        </w:numPr>
+        <w:rPr>
+          <w:lang w:val="en-GB"/>
+        </w:rPr>
+      </w:pPr>
+      <w:r>
+        <w:rPr>
+          <w:lang w:val="en-GB"/>
+        </w:rPr>
+        <w:t xml:space="preserve">Python – </w:t>
+      </w:r>
+      <w:hyperlink r:id="rId19" w:tgtFrame="_new" w:history="1">
+        <w:r>
+          <w:rPr>
+            <w:rStyle w:val="Hyperlink"/>
+            <w:lang w:val="en-GB"/>
+          </w:rPr>
+          <w:t>https://www</w:t>
+        </w:r>
+        <w:r>
+          <w:rPr>
+            <w:rStyle w:val="Hyperlink"/>
+            <w:lang w:val="en-GB"/>
+          </w:rPr>
+          <w:t>.</w:t>
+        </w:r>
+        <w:r>
+          <w:rPr>
+            <w:rStyle w:val="Hyperlink"/>
+            <w:lang w:val="en-GB"/>
+          </w:rPr>
+          <w:t>python.org</w:t>
+        </w:r>
+      </w:hyperlink>
+    </w:p>
+    <w:p>
+      <w:pPr>
+        <w:pStyle w:val="ListParagraph"/>
+        <w:rPr>
+          <w:lang w:val="en-GB"/>
+        </w:rPr>
+      </w:pPr>
+    </w:p>
+    <w:p>
+      <w:pPr>
+        <w:pStyle w:val="ListParagraph"/>
+        <w:numPr>
+          <w:ilvl w:val="0"/>
+          <w:numId w:val="24"/>
+        </w:numPr>
+        <w:rPr>
+          <w:lang w:val="en-GB"/>
+        </w:rPr>
+      </w:pPr>
+      <w:r>
+        <w:rPr>
+          <w:lang w:val="en-GB"/>
+        </w:rPr>
+        <w:t xml:space="preserve">YOLO – </w:t>
+      </w:r>
+      <w:hyperlink r:id="rId20" w:history="1">
+        <w:r>
+          <w:rPr>
+            <w:rStyle w:val="Hyperlink"/>
+            <w:lang w:val="en-GB"/>
+          </w:rPr>
+          <w:t>https://yolo-docs.readthedocs.io/en/latest/</w:t>
+        </w:r>
+      </w:hyperlink>
+    </w:p>
+    <w:p>
+      <w:pPr>
+        <w:pStyle w:val="ListParagraph"/>
+        <w:rPr>
+          <w:lang w:val="en-GB"/>
+        </w:rPr>
+      </w:pPr>
+    </w:p>
+    <w:p>
+      <w:pPr>
+        <w:pStyle w:val="ListParagraph"/>
+        <w:numPr>
+          <w:ilvl w:val="0"/>
+          <w:numId w:val="24"/>
+        </w:numPr>
+        <w:rPr>
+          <w:lang w:val="en-GB"/>
+        </w:rPr>
+      </w:pPr>
+      <w:proofErr w:type="spellStart"/>
+      <w:r>
+        <w:rPr>
+          <w:lang w:val="en-GB"/>
+        </w:rPr>
+        <w:t>Ultralytics</w:t>
+      </w:r>
+      <w:proofErr w:type="spellEnd"/>
+      <w:r>
+        <w:rPr>
+          <w:lang w:val="en-GB"/>
+        </w:rPr>
+        <w:t xml:space="preserve"> – </w:t>
+      </w:r>
+      <w:hyperlink r:id="rId21" w:tgtFrame="_new" w:history="1">
+        <w:r>
+          <w:rPr>
+            <w:rStyle w:val="Hyperlink"/>
+            <w:lang w:val="en-GB"/>
+          </w:rPr>
+          <w:t>https://ultralytics.c</w:t>
+        </w:r>
+        <w:r>
+          <w:rPr>
+            <w:rStyle w:val="Hyperlink"/>
+            <w:lang w:val="en-GB"/>
+          </w:rPr>
+          <w:t>o</w:t>
+        </w:r>
+        <w:r>
+          <w:rPr>
+            <w:rStyle w:val="Hyperlink"/>
+            <w:lang w:val="en-GB"/>
+          </w:rPr>
+          <w:t>m</w:t>
+        </w:r>
+      </w:hyperlink>
+    </w:p>
+    <w:p>
+      <w:pPr>
+        <w:pStyle w:val="ListParagraph"/>
+        <w:rPr>
+          <w:lang w:val="en-GB"/>
+        </w:rPr>
+      </w:pPr>
+    </w:p>
+    <w:p>
+      <w:pPr>
+        <w:pStyle w:val="ListParagraph"/>
+        <w:numPr>
+          <w:ilvl w:val="0"/>
+          <w:numId w:val="24"/>
+        </w:numPr>
+        <w:rPr>
+          <w:lang w:val="en-GB"/>
+        </w:rPr>
+      </w:pPr>
+      <w:r>
+        <w:rPr>
+          <w:lang w:val="en-GB"/>
+        </w:rPr>
+        <w:t xml:space="preserve">OpenCV – </w:t>
+      </w:r>
+      <w:hyperlink r:id="rId22" w:tgtFrame="_new" w:history="1">
+        <w:r>
+          <w:rPr>
+            <w:rStyle w:val="Hyperlink"/>
+            <w:lang w:val="en-GB"/>
+          </w:rPr>
+          <w:t>https</w:t>
+        </w:r>
+        <w:r>
+          <w:rPr>
+            <w:rStyle w:val="Hyperlink"/>
+            <w:lang w:val="en-GB"/>
+          </w:rPr>
+          <w:t>:</w:t>
+        </w:r>
+        <w:r>
+          <w:rPr>
+            <w:rStyle w:val="Hyperlink"/>
+            <w:lang w:val="en-GB"/>
+          </w:rPr>
+          <w:t>//opencv.org</w:t>
+        </w:r>
+      </w:hyperlink>
+    </w:p>
+    <w:p>
+      <w:pPr>
+        <w:pStyle w:val="ListParagraph"/>
+        <w:rPr>
+          <w:lang w:val="en-GB"/>
+        </w:rPr>
+      </w:pPr>
+    </w:p>
+    <w:p>
+      <w:pPr>
+        <w:pStyle w:val="ListParagraph"/>
+        <w:numPr>
+          <w:ilvl w:val="0"/>
+          <w:numId w:val="24"/>
+        </w:numPr>
+        <w:rPr>
+          <w:lang w:val="en-GB"/>
+        </w:rPr>
+      </w:pPr>
+      <w:r>
+        <w:rPr>
+          <w:lang w:val="en-GB"/>
+        </w:rPr>
+        <w:t xml:space="preserve">Flask – </w:t>
+      </w:r>
+      <w:hyperlink r:id="rId23" w:history="1">
+        <w:r>
+          <w:rPr>
+            <w:rStyle w:val="Hyperlink"/>
+            <w:lang w:val="en-GB"/>
+          </w:rPr>
+          <w:t>https://flask.pallets</w:t>
+        </w:r>
+        <w:r>
+          <w:rPr>
+            <w:rStyle w:val="Hyperlink"/>
+            <w:lang w:val="en-GB"/>
+          </w:rPr>
+          <w:t>p</w:t>
+        </w:r>
+        <w:r>
+          <w:rPr>
+            <w:rStyle w:val="Hyperlink"/>
+            <w:lang w:val="en-GB"/>
+          </w:rPr>
+          <w:t>rojects.com</w:t>
+        </w:r>
+      </w:hyperlink>
+    </w:p>
+    <w:p>
+      <w:pPr>
+        <w:pStyle w:val="ListParagraph"/>
+        <w:rPr>
+          <w:lang w:val="en-GB"/>
+        </w:rPr>
+      </w:pPr>
+    </w:p>
+    <w:p>
+      <w:pPr>
+        <w:pStyle w:val="ListParagraph"/>
+        <w:numPr>
+          <w:ilvl w:val="0"/>
+          <w:numId w:val="24"/>
+        </w:numPr>
+        <w:rPr>
+          <w:lang w:val="en-GB"/>
+        </w:rPr>
+      </w:pPr>
+      <w:r>
+        <w:rPr>
+          <w:lang w:val="en-GB"/>
+        </w:rPr>
+        <w:t xml:space="preserve">React – </w:t>
+      </w:r>
+      <w:hyperlink r:id="rId24" w:tgtFrame="_new" w:history="1">
+        <w:r>
+          <w:rPr>
+            <w:rStyle w:val="Hyperlink"/>
+            <w:lang w:val="en-GB"/>
+          </w:rPr>
+          <w:t>https://reactjs</w:t>
+        </w:r>
+        <w:r>
+          <w:rPr>
+            <w:rStyle w:val="Hyperlink"/>
+            <w:lang w:val="en-GB"/>
+          </w:rPr>
+          <w:t>.</w:t>
+        </w:r>
+        <w:r>
+          <w:rPr>
+            <w:rStyle w:val="Hyperlink"/>
+            <w:lang w:val="en-GB"/>
+          </w:rPr>
+          <w:t>org</w:t>
+        </w:r>
+      </w:hyperlink>
+    </w:p>
+    <w:p>
+      <w:pPr>
+        <w:pStyle w:val="ListParagraph"/>
+        <w:rPr>
+          <w:lang w:val="en-GB"/>
+        </w:rPr>
+      </w:pPr>
+    </w:p>
+    <w:p>
+      <w:pPr>
+        <w:pStyle w:val="ListParagraph"/>
+        <w:numPr>
+          <w:ilvl w:val="0"/>
+          <w:numId w:val="24"/>
+        </w:numPr>
+        <w:rPr>
+          <w:lang w:val="en-GB"/>
+        </w:rPr>
+      </w:pPr>
+      <w:r>
+        <w:rPr>
+          <w:lang w:val="en-GB"/>
+        </w:rPr>
+        <w:t xml:space="preserve">SMTP – </w:t>
+      </w:r>
+      <w:hyperlink r:id="rId25" w:history="1">
+        <w:r>
+          <w:rPr>
+            <w:rStyle w:val="Hyperlink"/>
+            <w:lang w:val="en-GB"/>
+          </w:rPr>
+          <w:t>https://tools.ietf.</w:t>
+        </w:r>
+        <w:r>
+          <w:rPr>
+            <w:rStyle w:val="Hyperlink"/>
+            <w:lang w:val="en-GB"/>
+          </w:rPr>
+          <w:t>o</w:t>
+        </w:r>
+        <w:r>
+          <w:rPr>
+            <w:rStyle w:val="Hyperlink"/>
+            <w:lang w:val="en-GB"/>
+          </w:rPr>
+          <w:t>rg/html/rfc5321</w:t>
+        </w:r>
+      </w:hyperlink>
+    </w:p>
+    <w:p>
+      <w:pPr>
+        <w:pStyle w:val="ListParagraph"/>
+        <w:rPr>
+          <w:lang w:val="en-GB"/>
+        </w:rPr>
+      </w:pPr>
+    </w:p>
+    <w:p>
+      <w:pPr>
+        <w:pStyle w:val="ListParagraph"/>
+        <w:numPr>
+          <w:ilvl w:val="0"/>
+          <w:numId w:val="24"/>
+        </w:numPr>
+      </w:pPr>
+      <w:r>
+        <w:rPr>
+          <w:lang w:val="en-GB"/>
+        </w:rPr>
+        <w:t xml:space="preserve">MySQL – </w:t>
+      </w:r>
+      <w:hyperlink r:id="rId26" w:tgtFrame="_new" w:history="1">
+        <w:r>
+          <w:rPr>
+            <w:rStyle w:val="Hyperlink"/>
+            <w:lang w:val="en-GB"/>
+          </w:rPr>
+          <w:t>https://www.mysql.</w:t>
+        </w:r>
+        <w:r>
+          <w:rPr>
+            <w:rStyle w:val="Hyperlink"/>
+            <w:lang w:val="en-GB"/>
+          </w:rPr>
+          <w:t>c</w:t>
+        </w:r>
+        <w:r>
+          <w:rPr>
+            <w:rStyle w:val="Hyperlink"/>
+            <w:lang w:val="en-GB"/>
+          </w:rPr>
+          <w:t>om</w:t>
+        </w:r>
+      </w:hyperlink>
+    </w:p>
     <w:sectPr>
-      <w:footerReference w:type="default" r:id="rId14"/>
+      <w:footerReference w:type="default" r:id="rId27"/>
       <w:pgSz w:w="11906" w:h="16838"/>
       <w:pgMar w:top="1440" w:right="1440" w:bottom="1440" w:left="1440" w:header="708" w:footer="708" w:gutter="0"/>
       <w:pgBorders w:offsetFrom="page">
@@ -2837,6 +5521,205 @@
     </w:lvl>
   </w:abstractNum>
   <w:abstractNum w:abstractNumId="11" w15:restartNumberingAfterBreak="0">
+    <w:nsid w:val="5E0E7EF4"/>
+    <w:multiLevelType w:val="hybridMultilevel"/>
+    <w:tmpl w:val="75720B84"/>
+    <w:lvl w:ilvl="0" w:tplc="0809000F">
+      <w:start w:val="1"/>
+      <w:numFmt w:val="decimal"/>
+      <w:lvlText w:val="%1."/>
+      <w:lvlJc w:val="left"/>
+      <w:pPr>
+        <w:ind w:left="720" w:hanging="360"/>
+      </w:pPr>
+    </w:lvl>
+    <w:lvl w:ilvl="1" w:tplc="08090019" w:tentative="1">
+      <w:start w:val="1"/>
+      <w:numFmt w:val="lowerLetter"/>
+      <w:lvlText w:val="%2."/>
+      <w:lvlJc w:val="left"/>
+      <w:pPr>
+        <w:ind w:left="1440" w:hanging="360"/>
+      </w:pPr>
+    </w:lvl>
+    <w:lvl w:ilvl="2" w:tplc="0809001B" w:tentative="1">
+      <w:start w:val="1"/>
+      <w:numFmt w:val="lowerRoman"/>
+      <w:lvlText w:val="%3."/>
+      <w:lvlJc w:val="right"/>
+      <w:pPr>
+        <w:ind w:left="2160" w:hanging="180"/>
+      </w:pPr>
+    </w:lvl>
+    <w:lvl w:ilvl="3" w:tplc="0809000F" w:tentative="1">
+      <w:start w:val="1"/>
+      <w:numFmt w:val="decimal"/>
+      <w:lvlText w:val="%4."/>
+      <w:lvlJc w:val="left"/>
+      <w:pPr>
+        <w:ind w:left="2880" w:hanging="360"/>
+      </w:pPr>
+    </w:lvl>
+    <w:lvl w:ilvl="4" w:tplc="08090019" w:tentative="1">
+      <w:start w:val="1"/>
+      <w:numFmt w:val="lowerLetter"/>
+      <w:lvlText w:val="%5."/>
+      <w:lvlJc w:val="left"/>
+      <w:pPr>
+        <w:ind w:left="3600" w:hanging="360"/>
+      </w:pPr>
+    </w:lvl>
+    <w:lvl w:ilvl="5" w:tplc="0809001B" w:tentative="1">
+      <w:start w:val="1"/>
+      <w:numFmt w:val="lowerRoman"/>
+      <w:lvlText w:val="%6."/>
+      <w:lvlJc w:val="right"/>
+      <w:pPr>
+        <w:ind w:left="4320" w:hanging="180"/>
+      </w:pPr>
+    </w:lvl>
+    <w:lvl w:ilvl="6" w:tplc="0809000F" w:tentative="1">
+      <w:start w:val="1"/>
+      <w:numFmt w:val="decimal"/>
+      <w:lvlText w:val="%7."/>
+      <w:lvlJc w:val="left"/>
+      <w:pPr>
+        <w:ind w:left="5040" w:hanging="360"/>
+      </w:pPr>
+    </w:lvl>
+    <w:lvl w:ilvl="7" w:tplc="08090019" w:tentative="1">
+      <w:start w:val="1"/>
+      <w:numFmt w:val="lowerLetter"/>
+      <w:lvlText w:val="%8."/>
+      <w:lvlJc w:val="left"/>
+      <w:pPr>
+        <w:ind w:left="5760" w:hanging="360"/>
+      </w:pPr>
+    </w:lvl>
+    <w:lvl w:ilvl="8" w:tplc="0809001B" w:tentative="1">
+      <w:start w:val="1"/>
+      <w:numFmt w:val="lowerRoman"/>
+      <w:lvlText w:val="%9."/>
+      <w:lvlJc w:val="right"/>
+      <w:pPr>
+        <w:ind w:left="6480" w:hanging="180"/>
+      </w:pPr>
+    </w:lvl>
+  </w:abstractNum>
+  <w:abstractNum w:abstractNumId="12" w15:restartNumberingAfterBreak="0">
+    <w:nsid w:val="63BD0A5D"/>
+    <w:multiLevelType w:val="multilevel"/>
+    <w:tmpl w:val="940C3438"/>
+    <w:lvl w:ilvl="0">
+      <w:start w:val="1"/>
+      <w:numFmt w:val="decimal"/>
+      <w:lvlText w:val="%1."/>
+      <w:lvlJc w:val="left"/>
+      <w:pPr>
+        <w:tabs>
+          <w:tab w:val="num" w:pos="720"/>
+        </w:tabs>
+        <w:ind w:left="720" w:hanging="360"/>
+      </w:pPr>
+    </w:lvl>
+    <w:lvl w:ilvl="1" w:tentative="1">
+      <w:start w:val="1"/>
+      <w:numFmt w:val="decimal"/>
+      <w:lvlText w:val="%2."/>
+      <w:lvlJc w:val="left"/>
+      <w:pPr>
+        <w:tabs>
+          <w:tab w:val="num" w:pos="1440"/>
+        </w:tabs>
+        <w:ind w:left="1440" w:hanging="360"/>
+      </w:pPr>
+    </w:lvl>
+    <w:lvl w:ilvl="2" w:tentative="1">
+      <w:start w:val="1"/>
+      <w:numFmt w:val="decimal"/>
+      <w:lvlText w:val="%3."/>
+      <w:lvlJc w:val="left"/>
+      <w:pPr>
+        <w:tabs>
+          <w:tab w:val="num" w:pos="2160"/>
+        </w:tabs>
+        <w:ind w:left="2160" w:hanging="360"/>
+      </w:pPr>
+    </w:lvl>
+    <w:lvl w:ilvl="3" w:tentative="1">
+      <w:start w:val="1"/>
+      <w:numFmt w:val="decimal"/>
+      <w:lvlText w:val="%4."/>
+      <w:lvlJc w:val="left"/>
+      <w:pPr>
+        <w:tabs>
+          <w:tab w:val="num" w:pos="2880"/>
+        </w:tabs>
+        <w:ind w:left="2880" w:hanging="360"/>
+      </w:pPr>
+    </w:lvl>
+    <w:lvl w:ilvl="4" w:tentative="1">
+      <w:start w:val="1"/>
+      <w:numFmt w:val="decimal"/>
+      <w:lvlText w:val="%5."/>
+      <w:lvlJc w:val="left"/>
+      <w:pPr>
+        <w:tabs>
+          <w:tab w:val="num" w:pos="3600"/>
+        </w:tabs>
+        <w:ind w:left="3600" w:hanging="360"/>
+      </w:pPr>
+    </w:lvl>
+    <w:lvl w:ilvl="5" w:tentative="1">
+      <w:start w:val="1"/>
+      <w:numFmt w:val="decimal"/>
+      <w:lvlText w:val="%6."/>
+      <w:lvlJc w:val="left"/>
+      <w:pPr>
+        <w:tabs>
+          <w:tab w:val="num" w:pos="4320"/>
+        </w:tabs>
+        <w:ind w:left="4320" w:hanging="360"/>
+      </w:pPr>
+    </w:lvl>
+    <w:lvl w:ilvl="6" w:tentative="1">
+      <w:start w:val="1"/>
+      <w:numFmt w:val="decimal"/>
+      <w:lvlText w:val="%7."/>
+      <w:lvlJc w:val="left"/>
+      <w:pPr>
+        <w:tabs>
+          <w:tab w:val="num" w:pos="5040"/>
+        </w:tabs>
+        <w:ind w:left="5040" w:hanging="360"/>
+      </w:pPr>
+    </w:lvl>
+    <w:lvl w:ilvl="7" w:tentative="1">
+      <w:start w:val="1"/>
+      <w:numFmt w:val="decimal"/>
+      <w:lvlText w:val="%8."/>
+      <w:lvlJc w:val="left"/>
+      <w:pPr>
+        <w:tabs>
+          <w:tab w:val="num" w:pos="5760"/>
+        </w:tabs>
+        <w:ind w:left="5760" w:hanging="360"/>
+      </w:pPr>
+    </w:lvl>
+    <w:lvl w:ilvl="8" w:tentative="1">
+      <w:start w:val="1"/>
+      <w:numFmt w:val="decimal"/>
+      <w:lvlText w:val="%9."/>
+      <w:lvlJc w:val="left"/>
+      <w:pPr>
+        <w:tabs>
+          <w:tab w:val="num" w:pos="6480"/>
+        </w:tabs>
+        <w:ind w:left="6480" w:hanging="360"/>
+      </w:pPr>
+    </w:lvl>
+  </w:abstractNum>
+  <w:abstractNum w:abstractNumId="13" w15:restartNumberingAfterBreak="0">
     <w:nsid w:val="65CE5086"/>
     <w:multiLevelType w:val="multilevel"/>
     <w:tmpl w:val="E8D86E80"/>
@@ -2985,7 +5868,156 @@
       </w:rPr>
     </w:lvl>
   </w:abstractNum>
-  <w:abstractNum w:abstractNumId="12" w15:restartNumberingAfterBreak="0">
+  <w:abstractNum w:abstractNumId="14" w15:restartNumberingAfterBreak="0">
+    <w:nsid w:val="6926374C"/>
+    <w:multiLevelType w:val="multilevel"/>
+    <w:tmpl w:val="149015CE"/>
+    <w:lvl w:ilvl="0">
+      <w:start w:val="1"/>
+      <w:numFmt w:val="bullet"/>
+      <w:lvlText w:val=""/>
+      <w:lvlJc w:val="left"/>
+      <w:pPr>
+        <w:tabs>
+          <w:tab w:val="num" w:pos="720"/>
+        </w:tabs>
+        <w:ind w:left="720" w:hanging="360"/>
+      </w:pPr>
+      <w:rPr>
+        <w:rFonts w:ascii="Symbol" w:hAnsi="Symbol" w:hint="default"/>
+        <w:sz w:val="20"/>
+      </w:rPr>
+    </w:lvl>
+    <w:lvl w:ilvl="1" w:tentative="1">
+      <w:start w:val="1"/>
+      <w:numFmt w:val="bullet"/>
+      <w:lvlText w:val="o"/>
+      <w:lvlJc w:val="left"/>
+      <w:pPr>
+        <w:tabs>
+          <w:tab w:val="num" w:pos="1440"/>
+        </w:tabs>
+        <w:ind w:left="1440" w:hanging="360"/>
+      </w:pPr>
+      <w:rPr>
+        <w:rFonts w:ascii="Courier New" w:hAnsi="Courier New" w:hint="default"/>
+        <w:sz w:val="20"/>
+      </w:rPr>
+    </w:lvl>
+    <w:lvl w:ilvl="2" w:tentative="1">
+      <w:start w:val="1"/>
+      <w:numFmt w:val="bullet"/>
+      <w:lvlText w:val=""/>
+      <w:lvlJc w:val="left"/>
+      <w:pPr>
+        <w:tabs>
+          <w:tab w:val="num" w:pos="2160"/>
+        </w:tabs>
+        <w:ind w:left="2160" w:hanging="360"/>
+      </w:pPr>
+      <w:rPr>
+        <w:rFonts w:ascii="Wingdings" w:hAnsi="Wingdings" w:hint="default"/>
+        <w:sz w:val="20"/>
+      </w:rPr>
+    </w:lvl>
+    <w:lvl w:ilvl="3" w:tentative="1">
+      <w:start w:val="1"/>
+      <w:numFmt w:val="bullet"/>
+      <w:lvlText w:val=""/>
+      <w:lvlJc w:val="left"/>
+      <w:pPr>
+        <w:tabs>
+          <w:tab w:val="num" w:pos="2880"/>
+        </w:tabs>
+        <w:ind w:left="2880" w:hanging="360"/>
+      </w:pPr>
+      <w:rPr>
+        <w:rFonts w:ascii="Wingdings" w:hAnsi="Wingdings" w:hint="default"/>
+        <w:sz w:val="20"/>
+      </w:rPr>
+    </w:lvl>
+    <w:lvl w:ilvl="4" w:tentative="1">
+      <w:start w:val="1"/>
+      <w:numFmt w:val="bullet"/>
+      <w:lvlText w:val=""/>
+      <w:lvlJc w:val="left"/>
+      <w:pPr>
+        <w:tabs>
+          <w:tab w:val="num" w:pos="3600"/>
+        </w:tabs>
+        <w:ind w:left="3600" w:hanging="360"/>
+      </w:pPr>
+      <w:rPr>
+        <w:rFonts w:ascii="Wingdings" w:hAnsi="Wingdings" w:hint="default"/>
+        <w:sz w:val="20"/>
+      </w:rPr>
+    </w:lvl>
+    <w:lvl w:ilvl="5" w:tentative="1">
+      <w:start w:val="1"/>
+      <w:numFmt w:val="bullet"/>
+      <w:lvlText w:val=""/>
+      <w:lvlJc w:val="left"/>
+      <w:pPr>
+        <w:tabs>
+          <w:tab w:val="num" w:pos="4320"/>
+        </w:tabs>
+        <w:ind w:left="4320" w:hanging="360"/>
+      </w:pPr>
+      <w:rPr>
+        <w:rFonts w:ascii="Wingdings" w:hAnsi="Wingdings" w:hint="default"/>
+        <w:sz w:val="20"/>
+      </w:rPr>
+    </w:lvl>
+    <w:lvl w:ilvl="6" w:tentative="1">
+      <w:start w:val="1"/>
+      <w:numFmt w:val="bullet"/>
+      <w:lvlText w:val=""/>
+      <w:lvlJc w:val="left"/>
+      <w:pPr>
+        <w:tabs>
+          <w:tab w:val="num" w:pos="5040"/>
+        </w:tabs>
+        <w:ind w:left="5040" w:hanging="360"/>
+      </w:pPr>
+      <w:rPr>
+        <w:rFonts w:ascii="Wingdings" w:hAnsi="Wingdings" w:hint="default"/>
+        <w:sz w:val="20"/>
+      </w:rPr>
+    </w:lvl>
+    <w:lvl w:ilvl="7" w:tentative="1">
+      <w:start w:val="1"/>
+      <w:numFmt w:val="bullet"/>
+      <w:lvlText w:val=""/>
+      <w:lvlJc w:val="left"/>
+      <w:pPr>
+        <w:tabs>
+          <w:tab w:val="num" w:pos="5760"/>
+        </w:tabs>
+        <w:ind w:left="5760" w:hanging="360"/>
+      </w:pPr>
+      <w:rPr>
+        <w:rFonts w:ascii="Wingdings" w:hAnsi="Wingdings" w:hint="default"/>
+        <w:sz w:val="20"/>
+      </w:rPr>
+    </w:lvl>
+    <w:lvl w:ilvl="8" w:tentative="1">
+      <w:start w:val="1"/>
+      <w:numFmt w:val="bullet"/>
+      <w:lvlText w:val=""/>
+      <w:lvlJc w:val="left"/>
+      <w:pPr>
+        <w:tabs>
+          <w:tab w:val="num" w:pos="6480"/>
+        </w:tabs>
+        <w:ind w:left="6480" w:hanging="360"/>
+      </w:pPr>
+      <w:rPr>
+        <w:rFonts w:ascii="Wingdings" w:hAnsi="Wingdings" w:hint="default"/>
+        <w:sz w:val="20"/>
+      </w:rPr>
+    </w:lvl>
+  </w:abstractNum>
+  <w:abstractNum w:abstractNumId="15" w15:restartNumberingAfterBreak="0">
     <w:nsid w:val="698E45E6"/>
     <w:multiLevelType w:val="hybridMultilevel"/>
     <w:tmpl w:val="7CAC7A36"/>
@@ -3071,7 +6103,7 @@
       </w:pPr>
     </w:lvl>
   </w:abstractNum>
-  <w:abstractNum w:abstractNumId="13" w15:restartNumberingAfterBreak="0">
+  <w:abstractNum w:abstractNumId="16" w15:restartNumberingAfterBreak="0">
     <w:nsid w:val="6A087783"/>
     <w:multiLevelType w:val="hybridMultilevel"/>
     <w:tmpl w:val="5FAA5B9A"/>
@@ -3184,7 +6216,120 @@
       </w:rPr>
     </w:lvl>
   </w:abstractNum>
-  <w:abstractNum w:abstractNumId="14" w15:restartNumberingAfterBreak="0">
+  <w:abstractNum w:abstractNumId="17" w15:restartNumberingAfterBreak="0">
+    <w:nsid w:val="6E5A37AA"/>
+    <w:multiLevelType w:val="hybridMultilevel"/>
+    <w:tmpl w:val="4CD892BA"/>
+    <w:lvl w:ilvl="0" w:tplc="08090001">
+      <w:start w:val="1"/>
+      <w:numFmt w:val="bullet"/>
+      <w:lvlText w:val=""/>
+      <w:lvlJc w:val="left"/>
+      <w:pPr>
+        <w:ind w:left="720" w:hanging="360"/>
+      </w:pPr>
+      <w:rPr>
+        <w:rFonts w:ascii="Symbol" w:hAnsi="Symbol" w:hint="default"/>
+      </w:rPr>
+    </w:lvl>
+    <w:lvl w:ilvl="1" w:tplc="08090003" w:tentative="1">
+      <w:start w:val="1"/>
+      <w:numFmt w:val="bullet"/>
+      <w:lvlText w:val="o"/>
+      <w:lvlJc w:val="left"/>
+      <w:pPr>
+        <w:ind w:left="1440" w:hanging="360"/>
+      </w:pPr>
+      <w:rPr>
+        <w:rFonts w:ascii="Courier New" w:hAnsi="Courier New" w:cs="Courier New" w:hint="default"/>
+      </w:rPr>
+    </w:lvl>
+    <w:lvl w:ilvl="2" w:tplc="08090005" w:tentative="1">
+      <w:start w:val="1"/>
+      <w:numFmt w:val="bullet"/>
+      <w:lvlText w:val=""/>
+      <w:lvlJc w:val="left"/>
+      <w:pPr>
+        <w:ind w:left="2160" w:hanging="360"/>
+      </w:pPr>
+      <w:rPr>
+        <w:rFonts w:ascii="Wingdings" w:hAnsi="Wingdings" w:hint="default"/>
+      </w:rPr>
+    </w:lvl>
+    <w:lvl w:ilvl="3" w:tplc="08090001" w:tentative="1">
+      <w:start w:val="1"/>
+      <w:numFmt w:val="bullet"/>
+      <w:lvlText w:val=""/>
+      <w:lvlJc w:val="left"/>
+      <w:pPr>
+        <w:ind w:left="2880" w:hanging="360"/>
+      </w:pPr>
+      <w:rPr>
+        <w:rFonts w:ascii="Symbol" w:hAnsi="Symbol" w:hint="default"/>
+      </w:rPr>
+    </w:lvl>
+    <w:lvl w:ilvl="4" w:tplc="08090003" w:tentative="1">
+      <w:start w:val="1"/>
+      <w:numFmt w:val="bullet"/>
+      <w:lvlText w:val="o"/>
+      <w:lvlJc w:val="left"/>
+      <w:pPr>
+        <w:ind w:left="3600" w:hanging="360"/>
+      </w:pPr>
+      <w:rPr>
+        <w:rFonts w:ascii="Courier New" w:hAnsi="Courier New" w:cs="Courier New" w:hint="default"/>
+      </w:rPr>
+    </w:lvl>
+    <w:lvl w:ilvl="5" w:tplc="08090005" w:tentative="1">
+      <w:start w:val="1"/>
+      <w:numFmt w:val="bullet"/>
+      <w:lvlText w:val=""/>
+      <w:lvlJc w:val="left"/>
+      <w:pPr>
+        <w:ind w:left="4320" w:hanging="360"/>
+      </w:pPr>
+      <w:rPr>
+        <w:rFonts w:ascii="Wingdings" w:hAnsi="Wingdings" w:hint="default"/>
+      </w:rPr>
+    </w:lvl>
+    <w:lvl w:ilvl="6" w:tplc="08090001" w:tentative="1">
+      <w:start w:val="1"/>
+      <w:numFmt w:val="bullet"/>
+      <w:lvlText w:val=""/>
+      <w:lvlJc w:val="left"/>
+      <w:pPr>
+        <w:ind w:left="5040" w:hanging="360"/>
+      </w:pPr>
+      <w:rPr>
+        <w:rFonts w:ascii="Symbol" w:hAnsi="Symbol" w:hint="default"/>
+      </w:rPr>
+    </w:lvl>
+    <w:lvl w:ilvl="7" w:tplc="08090003" w:tentative="1">
+      <w:start w:val="1"/>
+      <w:numFmt w:val="bullet"/>
+      <w:lvlText w:val="o"/>
+      <w:lvlJc w:val="left"/>
+      <w:pPr>
+        <w:ind w:left="5760" w:hanging="360"/>
+      </w:pPr>
+      <w:rPr>
+        <w:rFonts w:ascii="Courier New" w:hAnsi="Courier New" w:cs="Courier New" w:hint="default"/>
+      </w:rPr>
+    </w:lvl>
+    <w:lvl w:ilvl="8" w:tplc="08090005" w:tentative="1">
+      <w:start w:val="1"/>
+      <w:numFmt w:val="bullet"/>
+      <w:lvlText w:val=""/>
+      <w:lvlJc w:val="left"/>
+      <w:pPr>
+        <w:ind w:left="6480" w:hanging="360"/>
+      </w:pPr>
+      <w:rPr>
+        <w:rFonts w:ascii="Wingdings" w:hAnsi="Wingdings" w:hint="default"/>
+      </w:rPr>
+    </w:lvl>
+  </w:abstractNum>
+  <w:abstractNum w:abstractNumId="18" w15:restartNumberingAfterBreak="0">
     <w:nsid w:val="751627B0"/>
     <w:multiLevelType w:val="multilevel"/>
     <w:tmpl w:val="7CEE38EE"/>
@@ -3333,7 +6478,206 @@
       </w:rPr>
     </w:lvl>
   </w:abstractNum>
-  <w:abstractNum w:abstractNumId="15" w15:restartNumberingAfterBreak="0">
+  <w:abstractNum w:abstractNumId="19" w15:restartNumberingAfterBreak="0">
+    <w:nsid w:val="75592B24"/>
+    <w:multiLevelType w:val="hybridMultilevel"/>
+    <w:tmpl w:val="5A725EB8"/>
+    <w:lvl w:ilvl="0" w:tplc="0809000F">
+      <w:start w:val="1"/>
+      <w:numFmt w:val="decimal"/>
+      <w:lvlText w:val="%1."/>
+      <w:lvlJc w:val="left"/>
+      <w:pPr>
+        <w:ind w:left="720" w:hanging="360"/>
+      </w:pPr>
+    </w:lvl>
+    <w:lvl w:ilvl="1" w:tplc="08090019" w:tentative="1">
+      <w:start w:val="1"/>
+      <w:numFmt w:val="lowerLetter"/>
+      <w:lvlText w:val="%2."/>
+      <w:lvlJc w:val="left"/>
+      <w:pPr>
+        <w:ind w:left="1440" w:hanging="360"/>
+      </w:pPr>
+    </w:lvl>
+    <w:lvl w:ilvl="2" w:tplc="0809001B" w:tentative="1">
+      <w:start w:val="1"/>
+      <w:numFmt w:val="lowerRoman"/>
+      <w:lvlText w:val="%3."/>
+      <w:lvlJc w:val="right"/>
+      <w:pPr>
+        <w:ind w:left="2160" w:hanging="180"/>
+      </w:pPr>
+    </w:lvl>
+    <w:lvl w:ilvl="3" w:tplc="0809000F" w:tentative="1">
+      <w:start w:val="1"/>
+      <w:numFmt w:val="decimal"/>
+      <w:lvlText w:val="%4."/>
+      <w:lvlJc w:val="left"/>
+      <w:pPr>
+        <w:ind w:left="2880" w:hanging="360"/>
+      </w:pPr>
+    </w:lvl>
+    <w:lvl w:ilvl="4" w:tplc="08090019" w:tentative="1">
+      <w:start w:val="1"/>
+      <w:numFmt w:val="lowerLetter"/>
+      <w:lvlText w:val="%5."/>
+      <w:lvlJc w:val="left"/>
+      <w:pPr>
+        <w:ind w:left="3600" w:hanging="360"/>
+      </w:pPr>
+    </w:lvl>
+    <w:lvl w:ilvl="5" w:tplc="0809001B" w:tentative="1">
+      <w:start w:val="1"/>
+      <w:numFmt w:val="lowerRoman"/>
+      <w:lvlText w:val="%6."/>
+      <w:lvlJc w:val="right"/>
+      <w:pPr>
+        <w:ind w:left="4320" w:hanging="180"/>
+      </w:pPr>
+    </w:lvl>
+    <w:lvl w:ilvl="6" w:tplc="0809000F" w:tentative="1">
+      <w:start w:val="1"/>
+      <w:numFmt w:val="decimal"/>
+      <w:lvlText w:val="%7."/>
+      <w:lvlJc w:val="left"/>
+      <w:pPr>
+        <w:ind w:left="5040" w:hanging="360"/>
+      </w:pPr>
+    </w:lvl>
+    <w:lvl w:ilvl="7" w:tplc="08090019" w:tentative="1">
+      <w:start w:val="1"/>
+      <w:numFmt w:val="lowerLetter"/>
+      <w:lvlText w:val="%8."/>
+      <w:lvlJc w:val="left"/>
+      <w:pPr>
+        <w:ind w:left="5760" w:hanging="360"/>
+      </w:pPr>
+    </w:lvl>
+    <w:lvl w:ilvl="8" w:tplc="0809001B" w:tentative="1">
+      <w:start w:val="1"/>
+      <w:numFmt w:val="lowerRoman"/>
+      <w:lvlText w:val="%9."/>
+      <w:lvlJc w:val="right"/>
+      <w:pPr>
+        <w:ind w:left="6480" w:hanging="180"/>
+      </w:pPr>
+    </w:lvl>
+  </w:abstractNum>
+  <w:abstractNum w:abstractNumId="20" w15:restartNumberingAfterBreak="0">
+    <w:nsid w:val="757B39AF"/>
+    <w:multiLevelType w:val="hybridMultilevel"/>
+    <w:tmpl w:val="4132751A"/>
+    <w:lvl w:ilvl="0" w:tplc="08090001">
+      <w:start w:val="1"/>
+      <w:numFmt w:val="bullet"/>
+      <w:lvlText w:val=""/>
+      <w:lvlJc w:val="left"/>
+      <w:pPr>
+        <w:ind w:left="720" w:hanging="360"/>
+      </w:pPr>
+      <w:rPr>
+        <w:rFonts w:ascii="Symbol" w:hAnsi="Symbol" w:hint="default"/>
+      </w:rPr>
+    </w:lvl>
+    <w:lvl w:ilvl="1" w:tplc="08090003" w:tentative="1">
+      <w:start w:val="1"/>
+      <w:numFmt w:val="bullet"/>
+      <w:lvlText w:val="o"/>
+      <w:lvlJc w:val="left"/>
+      <w:pPr>
+        <w:ind w:left="1440" w:hanging="360"/>
+      </w:pPr>
+      <w:rPr>
+        <w:rFonts w:ascii="Courier New" w:hAnsi="Courier New" w:cs="Courier New" w:hint="default"/>
+      </w:rPr>
+    </w:lvl>
+    <w:lvl w:ilvl="2" w:tplc="08090005" w:tentative="1">
+      <w:start w:val="1"/>
+      <w:numFmt w:val="bullet"/>
+      <w:lvlText w:val=""/>
+      <w:lvlJc w:val="left"/>
+      <w:pPr>
+        <w:ind w:left="2160" w:hanging="360"/>
+      </w:pPr>
+      <w:rPr>
+        <w:rFonts w:ascii="Wingdings" w:hAnsi="Wingdings" w:hint="default"/>
+      </w:rPr>
+    </w:lvl>
+    <w:lvl w:ilvl="3" w:tplc="08090001" w:tentative="1">
+      <w:start w:val="1"/>
+      <w:numFmt w:val="bullet"/>
+      <w:lvlText w:val=""/>
+      <w:lvlJc w:val="left"/>
+      <w:pPr>
+        <w:ind w:left="2880" w:hanging="360"/>
+      </w:pPr>
+      <w:rPr>
+        <w:rFonts w:ascii="Symbol" w:hAnsi="Symbol" w:hint="default"/>
+      </w:rPr>
+    </w:lvl>
+    <w:lvl w:ilvl="4" w:tplc="08090003" w:tentative="1">
+      <w:start w:val="1"/>
+      <w:numFmt w:val="bullet"/>
+      <w:lvlText w:val="o"/>
+      <w:lvlJc w:val="left"/>
+      <w:pPr>
+        <w:ind w:left="3600" w:hanging="360"/>
+      </w:pPr>
+      <w:rPr>
+        <w:rFonts w:ascii="Courier New" w:hAnsi="Courier New" w:cs="Courier New" w:hint="default"/>
+      </w:rPr>
+    </w:lvl>
+    <w:lvl w:ilvl="5" w:tplc="08090005" w:tentative="1">
+      <w:start w:val="1"/>
+      <w:numFmt w:val="bullet"/>
+      <w:lvlText w:val=""/>
+      <w:lvlJc w:val="left"/>
+      <w:pPr>
+        <w:ind w:left="4320" w:hanging="360"/>
+      </w:pPr>
+      <w:rPr>
+        <w:rFonts w:ascii="Wingdings" w:hAnsi="Wingdings" w:hint="default"/>
+      </w:rPr>
+    </w:lvl>
+    <w:lvl w:ilvl="6" w:tplc="08090001" w:tentative="1">
+      <w:start w:val="1"/>
+      <w:numFmt w:val="bullet"/>
+      <w:lvlText w:val=""/>
+      <w:lvlJc w:val="left"/>
+      <w:pPr>
+        <w:ind w:left="5040" w:hanging="360"/>
+      </w:pPr>
+      <w:rPr>
+        <w:rFonts w:ascii="Symbol" w:hAnsi="Symbol" w:hint="default"/>
+      </w:rPr>
+    </w:lvl>
+    <w:lvl w:ilvl="7" w:tplc="08090003" w:tentative="1">
+      <w:start w:val="1"/>
+      <w:numFmt w:val="bullet"/>
+      <w:lvlText w:val="o"/>
+      <w:lvlJc w:val="left"/>
+      <w:pPr>
+        <w:ind w:left="5760" w:hanging="360"/>
+      </w:pPr>
+      <w:rPr>
+        <w:rFonts w:ascii="Courier New" w:hAnsi="Courier New" w:cs="Courier New" w:hint="default"/>
+      </w:rPr>
+    </w:lvl>
+    <w:lvl w:ilvl="8" w:tplc="08090005" w:tentative="1">
+      <w:start w:val="1"/>
+      <w:numFmt w:val="bullet"/>
+      <w:lvlText w:val=""/>
+      <w:lvlJc w:val="left"/>
+      <w:pPr>
+        <w:ind w:left="6480" w:hanging="360"/>
+      </w:pPr>
+      <w:rPr>
+        <w:rFonts w:ascii="Wingdings" w:hAnsi="Wingdings" w:hint="default"/>
+      </w:rPr>
+    </w:lvl>
+  </w:abstractNum>
+  <w:abstractNum w:abstractNumId="21" w15:restartNumberingAfterBreak="0">
     <w:nsid w:val="76166D91"/>
     <w:multiLevelType w:val="hybridMultilevel"/>
     <w:tmpl w:val="2CAAEF9C"/>
@@ -3419,7 +6763,7 @@
       </w:pPr>
     </w:lvl>
   </w:abstractNum>
-  <w:abstractNum w:abstractNumId="16" w15:restartNumberingAfterBreak="0">
+  <w:abstractNum w:abstractNumId="22" w15:restartNumberingAfterBreak="0">
     <w:nsid w:val="784F3E37"/>
     <w:multiLevelType w:val="multilevel"/>
     <w:tmpl w:val="14263250"/>
@@ -3568,7 +6912,7 @@
       </w:rPr>
     </w:lvl>
   </w:abstractNum>
-  <w:abstractNum w:abstractNumId="17" w15:restartNumberingAfterBreak="0">
+  <w:abstractNum w:abstractNumId="23" w15:restartNumberingAfterBreak="0">
     <w:nsid w:val="79D0682B"/>
     <w:multiLevelType w:val="multilevel"/>
     <w:tmpl w:val="230E5688"/>
@@ -3717,7 +7061,7 @@
       </w:rPr>
     </w:lvl>
   </w:abstractNum>
-  <w:abstractNum w:abstractNumId="18" w15:restartNumberingAfterBreak="0">
+  <w:abstractNum w:abstractNumId="24" w15:restartNumberingAfterBreak="0">
     <w:nsid w:val="7BEE2CB6"/>
     <w:multiLevelType w:val="multilevel"/>
     <w:tmpl w:val="16A65CD6"/>
@@ -3863,10 +7207,10 @@
     </w:lvl>
   </w:abstractNum>
   <w:num w:numId="1" w16cid:durableId="2008750000">
-    <w:abstractNumId w:val="15"/>
+    <w:abstractNumId w:val="21"/>
   </w:num>
   <w:num w:numId="2" w16cid:durableId="1591574094">
-    <w:abstractNumId w:val="12"/>
+    <w:abstractNumId w:val="15"/>
   </w:num>
   <w:num w:numId="3" w16cid:durableId="1453592296">
     <w:abstractNumId w:val="0"/>
@@ -3875,7 +7219,7 @@
     <w:abstractNumId w:val="10"/>
   </w:num>
   <w:num w:numId="5" w16cid:durableId="1733847146">
-    <w:abstractNumId w:val="13"/>
+    <w:abstractNumId w:val="16"/>
   </w:num>
   <w:num w:numId="6" w16cid:durableId="2110537970">
     <w:abstractNumId w:val="6"/>
@@ -3893,7 +7237,7 @@
     <w:abstractNumId w:val="3"/>
   </w:num>
   <w:num w:numId="11" w16cid:durableId="1088038614">
-    <w:abstractNumId w:val="16"/>
+    <w:abstractNumId w:val="22"/>
   </w:num>
   <w:num w:numId="12" w16cid:durableId="952831338">
     <w:abstractNumId w:val="2"/>
@@ -3902,22 +7246,40 @@
     <w:abstractNumId w:val="7"/>
   </w:num>
   <w:num w:numId="14" w16cid:durableId="1486702352">
-    <w:abstractNumId w:val="11"/>
+    <w:abstractNumId w:val="13"/>
   </w:num>
   <w:num w:numId="15" w16cid:durableId="897320106">
-    <w:abstractNumId w:val="18"/>
+    <w:abstractNumId w:val="24"/>
   </w:num>
   <w:num w:numId="16" w16cid:durableId="287049768">
     <w:abstractNumId w:val="5"/>
   </w:num>
   <w:num w:numId="17" w16cid:durableId="2128499613">
-    <w:abstractNumId w:val="17"/>
+    <w:abstractNumId w:val="23"/>
   </w:num>
   <w:num w:numId="18" w16cid:durableId="994575290">
-    <w:abstractNumId w:val="14"/>
+    <w:abstractNumId w:val="18"/>
   </w:num>
   <w:num w:numId="19" w16cid:durableId="1877698368">
     <w:abstractNumId w:val="1"/>
+  </w:num>
+  <w:num w:numId="20" w16cid:durableId="1789003388">
+    <w:abstractNumId w:val="12"/>
+  </w:num>
+  <w:num w:numId="21" w16cid:durableId="1853449609">
+    <w:abstractNumId w:val="20"/>
+  </w:num>
+  <w:num w:numId="22" w16cid:durableId="1042481938">
+    <w:abstractNumId w:val="17"/>
+  </w:num>
+  <w:num w:numId="23" w16cid:durableId="1174565314">
+    <w:abstractNumId w:val="11"/>
+  </w:num>
+  <w:num w:numId="24" w16cid:durableId="753893310">
+    <w:abstractNumId w:val="19"/>
+  </w:num>
+  <w:num w:numId="25" w16cid:durableId="1662273837">
+    <w:abstractNumId w:val="14"/>
   </w:num>
   <w:numIdMacAtCleanup w:val="19"/>
 </w:numbering>
@@ -4332,18 +7694,19 @@
     <w:link w:val="Heading1Char"/>
     <w:uiPriority w:val="9"/>
     <w:qFormat/>
-    <w:rsid w:val="002D2FA5"/>
+    <w:rsid w:val="00980C29"/>
     <w:pPr>
       <w:keepNext/>
       <w:spacing w:before="240" w:after="60"/>
+      <w:jc w:val="center"/>
       <w:outlineLvl w:val="0"/>
     </w:pPr>
     <w:rPr>
       <w:rFonts w:eastAsia="Times New Roman"/>
-      <w:b/>
       <w:bCs/>
+      <w:color w:val="0070C0"/>
       <w:kern w:val="32"/>
-      <w:sz w:val="32"/>
+      <w:sz w:val="52"/>
       <w:szCs w:val="32"/>
     </w:rPr>
   </w:style>
@@ -4355,7 +7718,7 @@
     <w:uiPriority w:val="9"/>
     <w:unhideWhenUsed/>
     <w:qFormat/>
-    <w:rsid w:val="000C1161"/>
+    <w:rsid w:val="00F81413"/>
     <w:pPr>
       <w:keepNext/>
       <w:spacing w:before="240" w:after="60"/>
@@ -4366,7 +7729,7 @@
       <w:b/>
       <w:bCs/>
       <w:iCs/>
-      <w:sz w:val="28"/>
+      <w:sz w:val="32"/>
       <w:szCs w:val="28"/>
     </w:rPr>
   </w:style>
@@ -4376,10 +7739,9 @@
     <w:next w:val="Normal"/>
     <w:link w:val="Heading3Char"/>
     <w:uiPriority w:val="9"/>
-    <w:semiHidden/>
     <w:unhideWhenUsed/>
     <w:qFormat/>
-    <w:rsid w:val="004C5CDB"/>
+    <w:rsid w:val="00F81413"/>
     <w:pPr>
       <w:keepNext/>
       <w:keepLines/>
@@ -4387,15 +7749,60 @@
       <w:outlineLvl w:val="2"/>
     </w:pPr>
     <w:rPr>
+      <w:rFonts w:eastAsiaTheme="majorEastAsia" w:cstheme="majorBidi"/>
+      <w:b/>
+      <w:color w:val="2A424D" w:themeColor="accent5" w:themeShade="80"/>
+      <w:sz w:val="28"/>
+      <w:szCs w:val="24"/>
+    </w:rPr>
+  </w:style>
+  <w:style w:type="paragraph" w:styleId="Heading4">
+    <w:name w:val="heading 4"/>
+    <w:basedOn w:val="Normal"/>
+    <w:next w:val="Normal"/>
+    <w:link w:val="Heading4Char"/>
+    <w:uiPriority w:val="9"/>
+    <w:semiHidden/>
+    <w:unhideWhenUsed/>
+    <w:qFormat/>
+    <w:rsid w:val="00856723"/>
+    <w:pPr>
+      <w:keepNext/>
+      <w:keepLines/>
+      <w:spacing w:before="40" w:after="0"/>
+      <w:outlineLvl w:val="3"/>
+    </w:pPr>
+    <w:rPr>
       <w:rFonts w:asciiTheme="majorHAnsi" w:eastAsiaTheme="majorEastAsia" w:hAnsiTheme="majorHAnsi" w:cstheme="majorBidi"/>
-      <w:color w:val="570A09" w:themeColor="accent1" w:themeShade="7F"/>
-      <w:szCs w:val="24"/>
+      <w:i/>
+      <w:iCs/>
+      <w:color w:val="830F0E" w:themeColor="accent1" w:themeShade="BF"/>
+    </w:rPr>
+  </w:style>
+  <w:style w:type="paragraph" w:styleId="Heading5">
+    <w:name w:val="heading 5"/>
+    <w:basedOn w:val="Normal"/>
+    <w:next w:val="Normal"/>
+    <w:link w:val="Heading5Char"/>
+    <w:uiPriority w:val="9"/>
+    <w:semiHidden/>
+    <w:unhideWhenUsed/>
+    <w:qFormat/>
+    <w:rsid w:val="00D732A5"/>
+    <w:pPr>
+      <w:keepNext/>
+      <w:keepLines/>
+      <w:spacing w:before="40" w:after="0"/>
+      <w:outlineLvl w:val="4"/>
+    </w:pPr>
+    <w:rPr>
+      <w:rFonts w:asciiTheme="majorHAnsi" w:eastAsiaTheme="majorEastAsia" w:hAnsiTheme="majorHAnsi" w:cstheme="majorBidi"/>
+      <w:color w:val="830F0E" w:themeColor="accent1" w:themeShade="BF"/>
     </w:rPr>
   </w:style>
   <w:style w:type="character" w:default="1" w:styleId="DefaultParagraphFont">
     <w:name w:val="Default Paragraph Font"/>
     <w:uiPriority w:val="1"/>
-    <w:semiHidden/>
     <w:unhideWhenUsed/>
   </w:style>
   <w:style w:type="table" w:default="1" w:styleId="TableNormal">
@@ -4531,13 +7938,13 @@
     <w:name w:val="Heading 1 Char"/>
     <w:link w:val="Heading1"/>
     <w:uiPriority w:val="9"/>
-    <w:rsid w:val="002D2FA5"/>
+    <w:rsid w:val="00980C29"/>
     <w:rPr>
-      <w:rFonts w:ascii="Times New Roman" w:eastAsia="Times New Roman" w:hAnsi="Times New Roman"/>
-      <w:b/>
+      <w:rFonts w:eastAsia="Times New Roman"/>
       <w:bCs/>
+      <w:color w:val="0070C0"/>
       <w:kern w:val="32"/>
-      <w:sz w:val="32"/>
+      <w:sz w:val="52"/>
       <w:szCs w:val="32"/>
       <w:lang w:eastAsia="en-US"/>
     </w:rPr>
@@ -4553,13 +7960,13 @@
     <w:name w:val="Heading 2 Char"/>
     <w:link w:val="Heading2"/>
     <w:uiPriority w:val="9"/>
-    <w:rsid w:val="000C1161"/>
+    <w:rsid w:val="00F81413"/>
     <w:rPr>
       <w:rFonts w:eastAsia="Times New Roman"/>
       <w:b/>
       <w:bCs/>
       <w:iCs/>
-      <w:sz w:val="28"/>
+      <w:sz w:val="32"/>
       <w:szCs w:val="28"/>
       <w:lang w:eastAsia="en-US"/>
     </w:rPr>
@@ -4630,7 +8037,7 @@
       <w:outlineLvl w:val="9"/>
     </w:pPr>
     <w:rPr>
-      <w:b w:val="0"/>
+      <w:b/>
       <w:bCs w:val="0"/>
       <w:kern w:val="0"/>
       <w:lang w:val="en-US"/>
@@ -4700,11 +8107,12 @@
     <w:basedOn w:val="DefaultParagraphFont"/>
     <w:link w:val="Heading3"/>
     <w:uiPriority w:val="9"/>
-    <w:rsid w:val="004C5CDB"/>
+    <w:rsid w:val="00F81413"/>
     <w:rPr>
-      <w:rFonts w:asciiTheme="majorHAnsi" w:eastAsiaTheme="majorEastAsia" w:hAnsiTheme="majorHAnsi" w:cstheme="majorBidi"/>
-      <w:color w:val="570A09" w:themeColor="accent1" w:themeShade="7F"/>
-      <w:sz w:val="24"/>
+      <w:rFonts w:eastAsiaTheme="majorEastAsia" w:cstheme="majorBidi"/>
+      <w:b/>
+      <w:color w:val="2A424D" w:themeColor="accent5" w:themeShade="80"/>
+      <w:sz w:val="28"/>
       <w:szCs w:val="24"/>
       <w:lang w:eastAsia="en-US"/>
     </w:rPr>
@@ -4782,6 +8190,38 @@
     <w:rPr>
       <w:color w:val="9DFFCB" w:themeColor="followedHyperlink"/>
       <w:u w:val="single"/>
+    </w:rPr>
+  </w:style>
+  <w:style w:type="character" w:customStyle="1" w:styleId="Heading4Char">
+    <w:name w:val="Heading 4 Char"/>
+    <w:basedOn w:val="DefaultParagraphFont"/>
+    <w:link w:val="Heading4"/>
+    <w:uiPriority w:val="9"/>
+    <w:semiHidden/>
+    <w:rsid w:val="00856723"/>
+    <w:rPr>
+      <w:rFonts w:asciiTheme="majorHAnsi" w:eastAsiaTheme="majorEastAsia" w:hAnsiTheme="majorHAnsi" w:cstheme="majorBidi"/>
+      <w:i/>
+      <w:iCs/>
+      <w:color w:val="830F0E" w:themeColor="accent1" w:themeShade="BF"/>
+      <w:sz w:val="24"/>
+      <w:szCs w:val="22"/>
+      <w:lang w:eastAsia="en-US"/>
+    </w:rPr>
+  </w:style>
+  <w:style w:type="character" w:customStyle="1" w:styleId="Heading5Char">
+    <w:name w:val="Heading 5 Char"/>
+    <w:basedOn w:val="DefaultParagraphFont"/>
+    <w:link w:val="Heading5"/>
+    <w:uiPriority w:val="9"/>
+    <w:semiHidden/>
+    <w:rsid w:val="00D732A5"/>
+    <w:rPr>
+      <w:rFonts w:asciiTheme="majorHAnsi" w:eastAsiaTheme="majorEastAsia" w:hAnsiTheme="majorHAnsi" w:cstheme="majorBidi"/>
+      <w:color w:val="830F0E" w:themeColor="accent1" w:themeShade="BF"/>
+      <w:sz w:val="24"/>
+      <w:szCs w:val="22"/>
+      <w:lang w:eastAsia="en-US"/>
     </w:rPr>
   </w:style>
 </w:styles>

</xml_diff>

<commit_message>
Design doc update, ER diagram added
</commit_message>
<xml_diff>
--- a/Design/SiteSafeDesign.docx
+++ b/Design/SiteSafeDesign.docx
@@ -1,6 +1,6 @@
 
 <file path=word/document.xml><?xml version="1.0" encoding="utf-8"?>
-<w:document xmlns:wpc="http://schemas.microsoft.com/office/word/2010/wordprocessingCanvas" xmlns:cx="http://schemas.microsoft.com/office/drawing/2014/chartex" xmlns:cx1="http://schemas.microsoft.com/office/drawing/2015/9/8/chartex" xmlns:cx2="http://schemas.microsoft.com/office/drawing/2015/10/21/chartex" xmlns:cx3="http://schemas.microsoft.com/office/drawing/2016/5/9/chartex" xmlns:cx4="http://schemas.microsoft.com/office/drawing/2016/5/10/chartex" xmlns:cx5="http://schemas.microsoft.com/office/drawing/2016/5/11/chartex" xmlns:cx6="http://schemas.microsoft.com/office/drawing/2016/5/12/chartex" xmlns:cx7="http://schemas.microsoft.com/office/drawing/2016/5/13/chartex" xmlns:cx8="http://schemas.microsoft.com/office/drawing/2016/5/14/chartex" xmlns:mc="http://schemas.openxmlformats.org/markup-compatibility/2006" xmlns:aink="http://schemas.microsoft.com/office/drawing/2016/ink" xmlns:am3d="http://schemas.microsoft.com/office/drawing/2017/model3d" xmlns:o="urn:schemas-microsoft-com:office:office" xmlns:oel="http://schemas.microsoft.com/office/2019/extlst" xmlns:r="http://schemas.openxmlformats.org/officeDocument/2006/relationships" xmlns:m="http://schemas.openxmlformats.org/officeDocument/2006/math" xmlns:v="urn:schemas-microsoft-com:vml" xmlns:wp14="http://schemas.microsoft.com/office/word/2010/wordprocessingDrawing" xmlns:wp="http://schemas.openxmlformats.org/drawingml/2006/wordprocessingDrawing" xmlns:w10="urn:schemas-microsoft-com:office:word" xmlns:w="http://schemas.openxmlformats.org/wordprocessingml/2006/main" xmlns:w14="http://schemas.microsoft.com/office/word/2010/wordml" xmlns:w15="http://schemas.microsoft.com/office/word/2012/wordml" xmlns:w16cex="http://schemas.microsoft.com/office/word/2018/wordml/cex" xmlns:w16cid="http://schemas.microsoft.com/office/word/2016/wordml/cid" xmlns:w16="http://schemas.microsoft.com/office/word/2018/wordml" xmlns:w16du="http://schemas.microsoft.com/office/word/2023/wordml/word16du" xmlns:w16sdtdh="http://schemas.microsoft.com/office/word/2020/wordml/sdtdatahash" xmlns:w16se="http://schemas.microsoft.com/office/word/2015/wordml/symex" xmlns:wpg="http://schemas.microsoft.com/office/word/2010/wordprocessingGroup" xmlns:wpi="http://schemas.microsoft.com/office/word/2010/wordprocessingInk" xmlns:wne="http://schemas.microsoft.com/office/word/2006/wordml" xmlns:wps="http://schemas.microsoft.com/office/word/2010/wordprocessingShape" mc:Ignorable="w14 w15 w16se w16cid w16 w16cex w16sdtdh w16du wp14">
+<w:document xmlns:wpc="http://schemas.microsoft.com/office/word/2010/wordprocessingCanvas" xmlns:cx="http://schemas.microsoft.com/office/drawing/2014/chartex" xmlns:cx1="http://schemas.microsoft.com/office/drawing/2015/9/8/chartex" xmlns:cx2="http://schemas.microsoft.com/office/drawing/2015/10/21/chartex" xmlns:cx3="http://schemas.microsoft.com/office/drawing/2016/5/9/chartex" xmlns:cx4="http://schemas.microsoft.com/office/drawing/2016/5/10/chartex" xmlns:cx5="http://schemas.microsoft.com/office/drawing/2016/5/11/chartex" xmlns:cx6="http://schemas.microsoft.com/office/drawing/2016/5/12/chartex" xmlns:cx7="http://schemas.microsoft.com/office/drawing/2016/5/13/chartex" xmlns:cx8="http://schemas.microsoft.com/office/drawing/2016/5/14/chartex" xmlns:mc="http://schemas.openxmlformats.org/markup-compatibility/2006" xmlns:aink="http://schemas.microsoft.com/office/drawing/2016/ink" xmlns:am3d="http://schemas.microsoft.com/office/drawing/2017/model3d" xmlns:o="urn:schemas-microsoft-com:office:office" xmlns:oel="http://schemas.microsoft.com/office/2019/extlst" xmlns:r="http://schemas.openxmlformats.org/officeDocument/2006/relationships" xmlns:m="http://schemas.openxmlformats.org/officeDocument/2006/math" xmlns:v="urn:schemas-microsoft-com:vml" xmlns:wp14="http://schemas.microsoft.com/office/word/2010/wordprocessingDrawing" xmlns:wp="http://schemas.openxmlformats.org/drawingml/2006/wordprocessingDrawing" xmlns:w10="urn:schemas-microsoft-com:office:word" xmlns:w="http://schemas.openxmlformats.org/wordprocessingml/2006/main" xmlns:w14="http://schemas.microsoft.com/office/word/2010/wordml" xmlns:w15="http://schemas.microsoft.com/office/word/2012/wordml" xmlns:w16cex="http://schemas.microsoft.com/office/word/2018/wordml/cex" xmlns:w16cid="http://schemas.microsoft.com/office/word/2016/wordml/cid" xmlns:w16="http://schemas.microsoft.com/office/word/2018/wordml" xmlns:w16du="http://schemas.microsoft.com/office/word/2023/wordml/word16du" xmlns:w16sdtdh="http://schemas.microsoft.com/office/word/2020/wordml/sdtdatahash" xmlns:w16sdtfl="http://schemas.microsoft.com/office/word/2024/wordml/sdtformatlock" xmlns:w16se="http://schemas.microsoft.com/office/word/2015/wordml/symex" xmlns:wpg="http://schemas.microsoft.com/office/word/2010/wordprocessingGroup" xmlns:wpi="http://schemas.microsoft.com/office/word/2010/wordprocessingInk" xmlns:wne="http://schemas.microsoft.com/office/word/2006/wordml" xmlns:wps="http://schemas.microsoft.com/office/word/2010/wordprocessingShape" mc:Ignorable="w14 w15 w16se w16cid w16 w16cex w16sdtdh w16sdtfl w16du wp14">
   <w:body>
     <w:p>
       <w:pPr>
@@ -556,7 +556,7 @@
           <w:szCs w:val="32"/>
         </w:rPr>
         <w:drawing>
-          <wp:anchor distT="0" distB="0" distL="114300" distR="114300" simplePos="0" relativeHeight="251540480" behindDoc="0" locked="0" layoutInCell="1" allowOverlap="1" wp14:anchorId="1AE65912" wp14:editId="78DFB21E">
+          <wp:anchor distT="0" distB="0" distL="114300" distR="114300" simplePos="0" relativeHeight="251540480" behindDoc="0" locked="0" layoutInCell="1" allowOverlap="1" wp14:anchorId="1AE65912" wp14:editId="316A7C6B">
             <wp:simplePos x="0" y="0"/>
             <wp:positionH relativeFrom="column">
               <wp:posOffset>60960</wp:posOffset>
@@ -2869,13 +2869,7 @@
         <w:rPr>
           <w:lang w:val="en-GB"/>
         </w:rPr>
-        <w:t>Recall</w:t>
-      </w:r>
-      <w:r>
-        <w:rPr>
-          <w:lang w:val="en-GB"/>
-        </w:rPr>
-        <w:t xml:space="preserve"> – Confidence Curve</w:t>
+        <w:t>Recall – Confidence Curve</w:t>
       </w:r>
     </w:p>
     <w:p>
@@ -3298,7 +3292,7 @@
           <w:lang w:val="en-GB"/>
         </w:rPr>
         <w:drawing>
-          <wp:anchor distT="0" distB="0" distL="114300" distR="114300" simplePos="0" relativeHeight="251804672" behindDoc="0" locked="0" layoutInCell="1" allowOverlap="1" wp14:anchorId="69356E40" wp14:editId="14F63CC6">
+          <wp:anchor distT="0" distB="0" distL="114300" distR="114300" simplePos="0" relativeHeight="251804672" behindDoc="0" locked="0" layoutInCell="1" allowOverlap="1" wp14:anchorId="69356E40" wp14:editId="542F30A8">
             <wp:simplePos x="0" y="0"/>
             <wp:positionH relativeFrom="column">
               <wp:posOffset>-441960</wp:posOffset>
@@ -3723,14 +3717,7 @@
                                 <w:sz w:val="18"/>
                                 <w:szCs w:val="18"/>
                               </w:rPr>
-                              <w:t xml:space="preserve"> </w:t>
-                            </w:r>
-                            <w:r>
-                              <w:rPr>
-                                <w:sz w:val="18"/>
-                                <w:szCs w:val="18"/>
-                              </w:rPr>
-                              <w:t>Email Incident Detection Example</w:t>
+                              <w:t xml:space="preserve"> Email Incident Detection Example</w:t>
                             </w:r>
                           </w:p>
                         </w:txbxContent>
@@ -3795,14 +3782,7 @@
                           <w:sz w:val="18"/>
                           <w:szCs w:val="18"/>
                         </w:rPr>
-                        <w:t xml:space="preserve"> </w:t>
-                      </w:r>
-                      <w:r>
-                        <w:rPr>
-                          <w:sz w:val="18"/>
-                          <w:szCs w:val="18"/>
-                        </w:rPr>
-                        <w:t>Email Incident Detection Example</w:t>
+                        <w:t xml:space="preserve"> Email Incident Detection Example</w:t>
                       </w:r>
                     </w:p>
                   </w:txbxContent>
@@ -4619,6 +4599,9 @@
         <w:jc w:val="both"/>
       </w:pPr>
       <w:r>
+        <w:rPr>
+          <w:noProof/>
+        </w:rPr>
         <w:drawing>
           <wp:inline distT="0" distB="0" distL="0" distR="0" wp14:anchorId="00280D3C" wp14:editId="19E28223">
             <wp:extent cx="5731510" cy="2371725"/>
@@ -4658,6 +4641,9 @@
         <w:jc w:val="both"/>
       </w:pPr>
       <w:r>
+        <w:rPr>
+          <w:noProof/>
+        </w:rPr>
         <w:drawing>
           <wp:inline distT="0" distB="0" distL="0" distR="0" wp14:anchorId="3BD04E62" wp14:editId="31A000BE">
             <wp:extent cx="5731510" cy="4312920"/>
@@ -4690,6 +4676,9 @@
     </w:p>
     <w:p>
       <w:r>
+        <w:rPr>
+          <w:noProof/>
+        </w:rPr>
         <w:drawing>
           <wp:inline distT="0" distB="0" distL="0" distR="0" wp14:anchorId="458FDD87" wp14:editId="5FA56AC8">
             <wp:extent cx="5731510" cy="1965960"/>
@@ -4725,6 +4714,9 @@
         <w:jc w:val="both"/>
       </w:pPr>
       <w:r>
+        <w:rPr>
+          <w:noProof/>
+        </w:rPr>
         <w:drawing>
           <wp:inline distT="0" distB="0" distL="0" distR="0" wp14:anchorId="56A23189" wp14:editId="418A9357">
             <wp:extent cx="5731510" cy="4312920"/>
@@ -5115,16 +5107,7 @@
       </w:pPr>
       <w:r>
         <w:lastRenderedPageBreak/>
-        <w:t xml:space="preserve">Home Screen </w:t>
-      </w:r>
-      <w:r>
-        <w:t>Company</w:t>
-      </w:r>
-      <w:r>
-        <w:t xml:space="preserve"> Site</w:t>
-      </w:r>
-      <w:r>
-        <w:t xml:space="preserve"> Admin</w:t>
+        <w:t>Home Screen Company Site Admin</w:t>
       </w:r>
     </w:p>
     <w:p/>
@@ -5194,10 +5177,7 @@
         <w:jc w:val="both"/>
       </w:pPr>
       <w:r>
-        <w:t>Users</w:t>
-      </w:r>
-      <w:r>
-        <w:t xml:space="preserve"> Screen Company Site Admin</w:t>
+        <w:t>Users Screen Company Site Admin</w:t>
       </w:r>
     </w:p>
     <w:p/>
@@ -5431,13 +5411,7 @@
         <w:jc w:val="both"/>
       </w:pPr>
       <w:r>
-        <w:t xml:space="preserve">Add </w:t>
-      </w:r>
-      <w:r>
-        <w:t>Admin</w:t>
-      </w:r>
-      <w:r>
-        <w:t xml:space="preserve"> User</w:t>
+        <w:t>Add Admin User</w:t>
       </w:r>
     </w:p>
     <w:p/>
@@ -5684,118 +5658,175 @@
         <w:t xml:space="preserve"> </w:t>
       </w:r>
       <w:r>
-        <w:t>Atomicity, Consistency, Isolation, and Durability ACID compliance ensures data consistency and integrity, making it an ideal choice for managing critical safety-related information in the system.</w:t>
-      </w:r>
-    </w:p>
-    <w:p>
-      <w:pPr>
-        <w:jc w:val="both"/>
-        <w:rPr>
-          <w:lang w:val="en-GB"/>
-        </w:rPr>
-      </w:pPr>
-      <w:r>
-        <w:rPr>
-          <w:lang w:val="en-GB"/>
-        </w:rPr>
-        <w:t>The database will facilitate the tracking of safety violations, generate detailed reports, and support real-time alerts. The following section outlines the proposed database structure, data flow, and relevant considerations.</w:t>
-      </w:r>
-    </w:p>
-    <w:p>
-      <w:pPr>
-        <w:jc w:val="both"/>
-        <w:rPr>
-          <w:lang w:val="en-GB"/>
-        </w:rPr>
-      </w:pPr>
-    </w:p>
-    <w:p>
-      <w:pPr>
-        <w:jc w:val="both"/>
-        <w:rPr>
-          <w:lang w:val="en-GB"/>
-        </w:rPr>
-      </w:pPr>
-    </w:p>
-    <w:p>
-      <w:pPr>
-        <w:jc w:val="both"/>
-        <w:rPr>
-          <w:lang w:val="en-GB"/>
-        </w:rPr>
-      </w:pPr>
-    </w:p>
-    <w:p>
-      <w:pPr>
-        <w:jc w:val="both"/>
-        <w:rPr>
-          <w:lang w:val="en-GB"/>
-        </w:rPr>
-      </w:pPr>
-    </w:p>
-    <w:p>
-      <w:pPr>
-        <w:jc w:val="both"/>
-        <w:rPr>
-          <w:lang w:val="en-GB"/>
-        </w:rPr>
-      </w:pPr>
-    </w:p>
-    <w:p>
-      <w:pPr>
-        <w:jc w:val="both"/>
-        <w:rPr>
-          <w:lang w:val="en-GB"/>
-        </w:rPr>
-      </w:pPr>
-    </w:p>
-    <w:p>
-      <w:pPr>
-        <w:jc w:val="both"/>
-        <w:rPr>
-          <w:lang w:val="en-GB"/>
-        </w:rPr>
-      </w:pPr>
-    </w:p>
-    <w:p>
-      <w:pPr>
-        <w:jc w:val="both"/>
-        <w:rPr>
-          <w:lang w:val="en-GB"/>
-        </w:rPr>
-      </w:pPr>
-    </w:p>
-    <w:p>
-      <w:pPr>
-        <w:jc w:val="both"/>
-        <w:rPr>
-          <w:lang w:val="en-GB"/>
-        </w:rPr>
-      </w:pPr>
-    </w:p>
-    <w:p>
-      <w:pPr>
-        <w:jc w:val="both"/>
-        <w:rPr>
-          <w:lang w:val="en-GB"/>
-        </w:rPr>
-      </w:pPr>
-    </w:p>
-    <w:p>
-      <w:pPr>
-        <w:jc w:val="both"/>
-        <w:rPr>
-          <w:lang w:val="en-GB"/>
-        </w:rPr>
-      </w:pPr>
-    </w:p>
-    <w:p>
-      <w:pPr>
-        <w:jc w:val="both"/>
-        <w:rPr>
-          <w:lang w:val="en-GB"/>
-        </w:rPr>
-      </w:pPr>
+        <w:t xml:space="preserve">Atomicity, Consistency, Isolation, and Durability </w:t>
+      </w:r>
+      <w:r>
+        <w:t>(</w:t>
+      </w:r>
+      <w:r>
+        <w:t>ACID</w:t>
+      </w:r>
+      <w:r>
+        <w:t>)</w:t>
+      </w:r>
+      <w:r>
+        <w:t xml:space="preserve"> compliance ensures data consistency and integrity, making it an ideal choice for managing critical safety-related information in the system.</w:t>
+      </w:r>
+    </w:p>
+    <w:p>
+      <w:pPr>
+        <w:jc w:val="both"/>
+        <w:rPr>
+          <w:lang w:val="en-GB"/>
+        </w:rPr>
+      </w:pPr>
+      <w:r>
+        <w:rPr>
+          <w:lang w:val="en-GB"/>
+        </w:rPr>
+        <w:t xml:space="preserve">The database will facilitate the tracking of safety violations, generate detailed </w:t>
+      </w:r>
+      <w:r>
+        <w:rPr>
+          <w:lang w:val="en-GB"/>
+        </w:rPr>
+        <w:t>dashboards</w:t>
+      </w:r>
+      <w:r>
+        <w:rPr>
+          <w:lang w:val="en-GB"/>
+        </w:rPr>
+        <w:t xml:space="preserve">, and support real-time alerts. </w:t>
+      </w:r>
+      <w:r>
+        <w:rPr>
+          <w:lang w:val="en-GB"/>
+        </w:rPr>
+        <w:t>Below is the Entity Relationship Diagram (ERD) that reveals the database layout and key directions. Followed by a</w:t>
+      </w:r>
+      <w:r>
+        <w:rPr>
+          <w:lang w:val="en-GB"/>
+        </w:rPr>
+        <w:t xml:space="preserve"> section</w:t>
+      </w:r>
+      <w:r>
+        <w:rPr>
+          <w:lang w:val="en-GB"/>
+        </w:rPr>
+        <w:t xml:space="preserve"> that</w:t>
+      </w:r>
+      <w:r>
+        <w:rPr>
+          <w:lang w:val="en-GB"/>
+        </w:rPr>
+        <w:t xml:space="preserve"> outlines the proposed </w:t>
+      </w:r>
+      <w:r>
+        <w:rPr>
+          <w:lang w:val="en-GB"/>
+        </w:rPr>
+        <w:t>table</w:t>
+      </w:r>
+      <w:r>
+        <w:rPr>
+          <w:lang w:val="en-GB"/>
+        </w:rPr>
+        <w:t xml:space="preserve"> structure</w:t>
+      </w:r>
+      <w:r>
+        <w:rPr>
+          <w:lang w:val="en-GB"/>
+        </w:rPr>
+        <w:t>.</w:t>
+      </w:r>
+    </w:p>
+    <w:p>
+      <w:pPr>
+        <w:jc w:val="both"/>
+        <w:rPr>
+          <w:lang w:val="en-GB"/>
+        </w:rPr>
+      </w:pPr>
+    </w:p>
+    <w:p>
+      <w:pPr>
+        <w:pStyle w:val="Heading2"/>
+        <w:jc w:val="both"/>
+      </w:pPr>
+      <w:r>
+        <w:t>Entity Relationship Diagram (ERD)</w:t>
+      </w:r>
+    </w:p>
+    <w:p>
+      <w:pPr>
+        <w:jc w:val="both"/>
+        <w:rPr>
+          <w:lang w:val="en-GB"/>
+        </w:rPr>
+      </w:pPr>
+    </w:p>
+    <w:p>
+      <w:pPr>
+        <w:jc w:val="both"/>
+        <w:rPr>
+          <w:lang w:val="en-GB"/>
+        </w:rPr>
+      </w:pPr>
+      <w:r>
+        <w:rPr>
+          <w:noProof/>
+          <w:lang w:val="en-GB"/>
+        </w:rPr>
+        <w:drawing>
+          <wp:inline distT="0" distB="0" distL="0" distR="0" wp14:anchorId="17F7ED26" wp14:editId="55B55418">
+            <wp:extent cx="5725160" cy="2528570"/>
+            <wp:effectExtent l="0" t="0" r="8890" b="5080"/>
+            <wp:docPr id="530111940" name="Picture 4"/>
+            <wp:cNvGraphicFramePr>
+              <a:graphicFrameLocks xmlns:a="http://schemas.openxmlformats.org/drawingml/2006/main" noChangeAspect="1"/>
+            </wp:cNvGraphicFramePr>
+            <a:graphic xmlns:a="http://schemas.openxmlformats.org/drawingml/2006/main">
+              <a:graphicData uri="http://schemas.openxmlformats.org/drawingml/2006/picture">
+                <pic:pic xmlns:pic="http://schemas.openxmlformats.org/drawingml/2006/picture">
+                  <pic:nvPicPr>
+                    <pic:cNvPr id="0" name="Picture 1"/>
+                    <pic:cNvPicPr>
+                      <a:picLocks noChangeAspect="1" noChangeArrowheads="1"/>
+                    </pic:cNvPicPr>
+                  </pic:nvPicPr>
+                  <pic:blipFill>
+                    <a:blip r:embed="rId51">
+                      <a:extLst>
+                        <a:ext uri="{28A0092B-C50C-407E-A947-70E740481C1C}">
+                          <a14:useLocalDpi xmlns:a14="http://schemas.microsoft.com/office/drawing/2010/main" val="0"/>
+                        </a:ext>
+                      </a:extLst>
+                    </a:blip>
+                    <a:srcRect/>
+                    <a:stretch>
+                      <a:fillRect/>
+                    </a:stretch>
+                  </pic:blipFill>
+                  <pic:spPr bwMode="auto">
+                    <a:xfrm>
+                      <a:off x="0" y="0"/>
+                      <a:ext cx="5725160" cy="2528570"/>
+                    </a:xfrm>
+                    <a:prstGeom prst="rect">
+                      <a:avLst/>
+                    </a:prstGeom>
+                    <a:noFill/>
+                    <a:ln>
+                      <a:noFill/>
+                    </a:ln>
+                  </pic:spPr>
+                </pic:pic>
+              </a:graphicData>
+            </a:graphic>
+          </wp:inline>
+        </w:drawing>
+      </w:r>
     </w:p>
     <w:p>
       <w:pPr>
@@ -5990,7 +6021,7 @@
                     </pic:cNvPicPr>
                   </pic:nvPicPr>
                   <pic:blipFill>
-                    <a:blip r:embed="rId51">
+                    <a:blip r:embed="rId52">
                       <a:extLst>
                         <a:ext uri="{28A0092B-C50C-407E-A947-70E740481C1C}">
                           <a14:useLocalDpi xmlns:a14="http://schemas.microsoft.com/office/drawing/2010/main" val="0"/>
@@ -6186,7 +6217,7 @@
                     </pic:cNvPicPr>
                   </pic:nvPicPr>
                   <pic:blipFill>
-                    <a:blip r:embed="rId52">
+                    <a:blip r:embed="rId53">
                       <a:extLst>
                         <a:ext uri="{28A0092B-C50C-407E-A947-70E740481C1C}">
                           <a14:useLocalDpi xmlns:a14="http://schemas.microsoft.com/office/drawing/2010/main" val="0"/>
@@ -6400,7 +6431,7 @@
                     </pic:cNvPicPr>
                   </pic:nvPicPr>
                   <pic:blipFill>
-                    <a:blip r:embed="rId53">
+                    <a:blip r:embed="rId54">
                       <a:extLst>
                         <a:ext uri="{28A0092B-C50C-407E-A947-70E740481C1C}">
                           <a14:useLocalDpi xmlns:a14="http://schemas.microsoft.com/office/drawing/2010/main" val="0"/>
@@ -6541,7 +6572,7 @@
                     </pic:cNvPicPr>
                   </pic:nvPicPr>
                   <pic:blipFill>
-                    <a:blip r:embed="rId54">
+                    <a:blip r:embed="rId55">
                       <a:extLst>
                         <a:ext uri="{28A0092B-C50C-407E-A947-70E740481C1C}">
                           <a14:useLocalDpi xmlns:a14="http://schemas.microsoft.com/office/drawing/2010/main" val="0"/>
@@ -6634,10 +6665,7 @@
         <w:pStyle w:val="Heading2"/>
       </w:pPr>
       <w:r>
-        <w:t>Pseudo Code for Critical Algorithm</w:t>
-      </w:r>
-      <w:r>
-        <w:t>s</w:t>
+        <w:t>Pseudo Code for Critical Algorithms</w:t>
       </w:r>
     </w:p>
     <w:p>
@@ -6651,6 +6679,11 @@
       </w:pPr>
       <w:r>
         <w:t>Class Diagram</w:t>
+      </w:r>
+    </w:p>
+    <w:p>
+      <w:r>
+        <w:t>Strategy pattern for the notifications</w:t>
       </w:r>
     </w:p>
     <w:p>
@@ -6795,7 +6828,7 @@
         </w:rPr>
         <w:t xml:space="preserve"> </w:t>
       </w:r>
-      <w:hyperlink r:id="rId55" w:tgtFrame="_new" w:history="1">
+      <w:hyperlink r:id="rId56" w:tgtFrame="_new" w:history="1">
         <w:r>
           <w:rPr>
             <w:rStyle w:val="Hyperlink"/>
@@ -6844,7 +6877,7 @@
         </w:rPr>
         <w:t xml:space="preserve"> </w:t>
       </w:r>
-      <w:hyperlink r:id="rId56" w:history="1">
+      <w:hyperlink r:id="rId57" w:history="1">
         <w:r>
           <w:rPr>
             <w:rStyle w:val="Hyperlink"/>
@@ -6889,7 +6922,7 @@
         </w:rPr>
         <w:t xml:space="preserve">: </w:t>
       </w:r>
-      <w:hyperlink r:id="rId57" w:history="1">
+      <w:hyperlink r:id="rId58" w:history="1">
         <w:r>
           <w:rPr>
             <w:rStyle w:val="Hyperlink"/>
@@ -6932,7 +6965,7 @@
         </w:rPr>
         <w:t xml:space="preserve">: </w:t>
       </w:r>
-      <w:hyperlink r:id="rId58" w:history="1">
+      <w:hyperlink r:id="rId59" w:history="1">
         <w:r>
           <w:rPr>
             <w:rStyle w:val="Hyperlink"/>
@@ -6975,7 +7008,7 @@
         </w:rPr>
         <w:t xml:space="preserve">: </w:t>
       </w:r>
-      <w:hyperlink r:id="rId59" w:history="1">
+      <w:hyperlink r:id="rId60" w:history="1">
         <w:r>
           <w:rPr>
             <w:rStyle w:val="Hyperlink"/>
@@ -7018,7 +7051,7 @@
         </w:rPr>
         <w:t xml:space="preserve">: </w:t>
       </w:r>
-      <w:hyperlink r:id="rId60" w:history="1">
+      <w:hyperlink r:id="rId61" w:history="1">
         <w:r>
           <w:rPr>
             <w:rStyle w:val="Hyperlink"/>
@@ -7067,7 +7100,7 @@
         </w:rPr>
         <w:t xml:space="preserve"> </w:t>
       </w:r>
-      <w:hyperlink r:id="rId61" w:history="1">
+      <w:hyperlink r:id="rId62" w:history="1">
         <w:r>
           <w:rPr>
             <w:rStyle w:val="Hyperlink"/>
@@ -7118,7 +7151,7 @@
         </w:rPr>
         <w:t xml:space="preserve"> </w:t>
       </w:r>
-      <w:hyperlink r:id="rId62" w:tgtFrame="_new" w:history="1">
+      <w:hyperlink r:id="rId63" w:tgtFrame="_new" w:history="1">
         <w:r>
           <w:rPr>
             <w:rStyle w:val="Hyperlink"/>
@@ -7145,7 +7178,7 @@
       <w:r>
         <w:t xml:space="preserve">Email Incident Image Example: </w:t>
       </w:r>
-      <w:hyperlink r:id="rId63" w:history="1">
+      <w:hyperlink r:id="rId64" w:history="1">
         <w:r>
           <w:rPr>
             <w:rStyle w:val="Hyperlink"/>
@@ -7178,7 +7211,7 @@
       </w:pPr>
     </w:p>
     <w:sectPr>
-      <w:footerReference w:type="default" r:id="rId64"/>
+      <w:footerReference w:type="default" r:id="rId65"/>
       <w:pgSz w:w="11906" w:h="16838"/>
       <w:pgMar w:top="1440" w:right="1440" w:bottom="1440" w:left="1440" w:header="708" w:footer="708" w:gutter="0"/>
       <w:pgBorders w:offsetFrom="page">
@@ -7197,7 +7230,7 @@
 </file>
 
 <file path=word/endnotes.xml><?xml version="1.0" encoding="utf-8"?>
-<w:endnotes xmlns:wpc="http://schemas.microsoft.com/office/word/2010/wordprocessingCanvas" xmlns:cx="http://schemas.microsoft.com/office/drawing/2014/chartex" xmlns:cx1="http://schemas.microsoft.com/office/drawing/2015/9/8/chartex" xmlns:cx2="http://schemas.microsoft.com/office/drawing/2015/10/21/chartex" xmlns:cx3="http://schemas.microsoft.com/office/drawing/2016/5/9/chartex" xmlns:cx4="http://schemas.microsoft.com/office/drawing/2016/5/10/chartex" xmlns:cx5="http://schemas.microsoft.com/office/drawing/2016/5/11/chartex" xmlns:cx6="http://schemas.microsoft.com/office/drawing/2016/5/12/chartex" xmlns:cx7="http://schemas.microsoft.com/office/drawing/2016/5/13/chartex" xmlns:cx8="http://schemas.microsoft.com/office/drawing/2016/5/14/chartex" xmlns:mc="http://schemas.openxmlformats.org/markup-compatibility/2006" xmlns:aink="http://schemas.microsoft.com/office/drawing/2016/ink" xmlns:am3d="http://schemas.microsoft.com/office/drawing/2017/model3d" xmlns:o="urn:schemas-microsoft-com:office:office" xmlns:oel="http://schemas.microsoft.com/office/2019/extlst" xmlns:r="http://schemas.openxmlformats.org/officeDocument/2006/relationships" xmlns:m="http://schemas.openxmlformats.org/officeDocument/2006/math" xmlns:v="urn:schemas-microsoft-com:vml" xmlns:wp14="http://schemas.microsoft.com/office/word/2010/wordprocessingDrawing" xmlns:wp="http://schemas.openxmlformats.org/drawingml/2006/wordprocessingDrawing" xmlns:w10="urn:schemas-microsoft-com:office:word" xmlns:w="http://schemas.openxmlformats.org/wordprocessingml/2006/main" xmlns:w14="http://schemas.microsoft.com/office/word/2010/wordml" xmlns:w15="http://schemas.microsoft.com/office/word/2012/wordml" xmlns:w16cex="http://schemas.microsoft.com/office/word/2018/wordml/cex" xmlns:w16cid="http://schemas.microsoft.com/office/word/2016/wordml/cid" xmlns:w16="http://schemas.microsoft.com/office/word/2018/wordml" xmlns:w16du="http://schemas.microsoft.com/office/word/2023/wordml/word16du" xmlns:w16sdtdh="http://schemas.microsoft.com/office/word/2020/wordml/sdtdatahash" xmlns:w16se="http://schemas.microsoft.com/office/word/2015/wordml/symex" xmlns:wpg="http://schemas.microsoft.com/office/word/2010/wordprocessingGroup" xmlns:wpi="http://schemas.microsoft.com/office/word/2010/wordprocessingInk" xmlns:wne="http://schemas.microsoft.com/office/word/2006/wordml" xmlns:wps="http://schemas.microsoft.com/office/word/2010/wordprocessingShape" mc:Ignorable="w14 w15 w16se w16cid w16 w16cex w16sdtdh w16du wp14">
+<w:endnotes xmlns:wpc="http://schemas.microsoft.com/office/word/2010/wordprocessingCanvas" xmlns:cx="http://schemas.microsoft.com/office/drawing/2014/chartex" xmlns:cx1="http://schemas.microsoft.com/office/drawing/2015/9/8/chartex" xmlns:cx2="http://schemas.microsoft.com/office/drawing/2015/10/21/chartex" xmlns:cx3="http://schemas.microsoft.com/office/drawing/2016/5/9/chartex" xmlns:cx4="http://schemas.microsoft.com/office/drawing/2016/5/10/chartex" xmlns:cx5="http://schemas.microsoft.com/office/drawing/2016/5/11/chartex" xmlns:cx6="http://schemas.microsoft.com/office/drawing/2016/5/12/chartex" xmlns:cx7="http://schemas.microsoft.com/office/drawing/2016/5/13/chartex" xmlns:cx8="http://schemas.microsoft.com/office/drawing/2016/5/14/chartex" xmlns:mc="http://schemas.openxmlformats.org/markup-compatibility/2006" xmlns:aink="http://schemas.microsoft.com/office/drawing/2016/ink" xmlns:am3d="http://schemas.microsoft.com/office/drawing/2017/model3d" xmlns:o="urn:schemas-microsoft-com:office:office" xmlns:oel="http://schemas.microsoft.com/office/2019/extlst" xmlns:r="http://schemas.openxmlformats.org/officeDocument/2006/relationships" xmlns:m="http://schemas.openxmlformats.org/officeDocument/2006/math" xmlns:v="urn:schemas-microsoft-com:vml" xmlns:wp14="http://schemas.microsoft.com/office/word/2010/wordprocessingDrawing" xmlns:wp="http://schemas.openxmlformats.org/drawingml/2006/wordprocessingDrawing" xmlns:w10="urn:schemas-microsoft-com:office:word" xmlns:w="http://schemas.openxmlformats.org/wordprocessingml/2006/main" xmlns:w14="http://schemas.microsoft.com/office/word/2010/wordml" xmlns:w15="http://schemas.microsoft.com/office/word/2012/wordml" xmlns:w16cex="http://schemas.microsoft.com/office/word/2018/wordml/cex" xmlns:w16cid="http://schemas.microsoft.com/office/word/2016/wordml/cid" xmlns:w16="http://schemas.microsoft.com/office/word/2018/wordml" xmlns:w16du="http://schemas.microsoft.com/office/word/2023/wordml/word16du" xmlns:w16sdtdh="http://schemas.microsoft.com/office/word/2020/wordml/sdtdatahash" xmlns:w16sdtfl="http://schemas.microsoft.com/office/word/2024/wordml/sdtformatlock" xmlns:w16se="http://schemas.microsoft.com/office/word/2015/wordml/symex" xmlns:wpg="http://schemas.microsoft.com/office/word/2010/wordprocessingGroup" xmlns:wpi="http://schemas.microsoft.com/office/word/2010/wordprocessingInk" xmlns:wne="http://schemas.microsoft.com/office/word/2006/wordml" xmlns:wps="http://schemas.microsoft.com/office/word/2010/wordprocessingShape" mc:Ignorable="w14 w15 w16se w16cid w16 w16cex w16sdtdh w16sdtfl w16du wp14">
   <w:endnote w:type="separator" w:id="-1">
     <w:p>
       <w:pPr>
@@ -7222,7 +7255,7 @@
 </file>
 
 <file path=word/footer1.xml><?xml version="1.0" encoding="utf-8"?>
-<w:ftr xmlns:wpc="http://schemas.microsoft.com/office/word/2010/wordprocessingCanvas" xmlns:cx="http://schemas.microsoft.com/office/drawing/2014/chartex" xmlns:cx1="http://schemas.microsoft.com/office/drawing/2015/9/8/chartex" xmlns:cx2="http://schemas.microsoft.com/office/drawing/2015/10/21/chartex" xmlns:cx3="http://schemas.microsoft.com/office/drawing/2016/5/9/chartex" xmlns:cx4="http://schemas.microsoft.com/office/drawing/2016/5/10/chartex" xmlns:cx5="http://schemas.microsoft.com/office/drawing/2016/5/11/chartex" xmlns:cx6="http://schemas.microsoft.com/office/drawing/2016/5/12/chartex" xmlns:cx7="http://schemas.microsoft.com/office/drawing/2016/5/13/chartex" xmlns:cx8="http://schemas.microsoft.com/office/drawing/2016/5/14/chartex" xmlns:mc="http://schemas.openxmlformats.org/markup-compatibility/2006" xmlns:aink="http://schemas.microsoft.com/office/drawing/2016/ink" xmlns:am3d="http://schemas.microsoft.com/office/drawing/2017/model3d" xmlns:o="urn:schemas-microsoft-com:office:office" xmlns:oel="http://schemas.microsoft.com/office/2019/extlst" xmlns:r="http://schemas.openxmlformats.org/officeDocument/2006/relationships" xmlns:m="http://schemas.openxmlformats.org/officeDocument/2006/math" xmlns:v="urn:schemas-microsoft-com:vml" xmlns:wp14="http://schemas.microsoft.com/office/word/2010/wordprocessingDrawing" xmlns:wp="http://schemas.openxmlformats.org/drawingml/2006/wordprocessingDrawing" xmlns:w10="urn:schemas-microsoft-com:office:word" xmlns:w="http://schemas.openxmlformats.org/wordprocessingml/2006/main" xmlns:w14="http://schemas.microsoft.com/office/word/2010/wordml" xmlns:w15="http://schemas.microsoft.com/office/word/2012/wordml" xmlns:w16cex="http://schemas.microsoft.com/office/word/2018/wordml/cex" xmlns:w16cid="http://schemas.microsoft.com/office/word/2016/wordml/cid" xmlns:w16="http://schemas.microsoft.com/office/word/2018/wordml" xmlns:w16du="http://schemas.microsoft.com/office/word/2023/wordml/word16du" xmlns:w16sdtdh="http://schemas.microsoft.com/office/word/2020/wordml/sdtdatahash" xmlns:w16se="http://schemas.microsoft.com/office/word/2015/wordml/symex" xmlns:wpg="http://schemas.microsoft.com/office/word/2010/wordprocessingGroup" xmlns:wpi="http://schemas.microsoft.com/office/word/2010/wordprocessingInk" xmlns:wne="http://schemas.microsoft.com/office/word/2006/wordml" xmlns:wps="http://schemas.microsoft.com/office/word/2010/wordprocessingShape" mc:Ignorable="w14 w15 w16se w16cid w16 w16cex w16sdtdh w16du wp14">
+<w:ftr xmlns:wpc="http://schemas.microsoft.com/office/word/2010/wordprocessingCanvas" xmlns:cx="http://schemas.microsoft.com/office/drawing/2014/chartex" xmlns:cx1="http://schemas.microsoft.com/office/drawing/2015/9/8/chartex" xmlns:cx2="http://schemas.microsoft.com/office/drawing/2015/10/21/chartex" xmlns:cx3="http://schemas.microsoft.com/office/drawing/2016/5/9/chartex" xmlns:cx4="http://schemas.microsoft.com/office/drawing/2016/5/10/chartex" xmlns:cx5="http://schemas.microsoft.com/office/drawing/2016/5/11/chartex" xmlns:cx6="http://schemas.microsoft.com/office/drawing/2016/5/12/chartex" xmlns:cx7="http://schemas.microsoft.com/office/drawing/2016/5/13/chartex" xmlns:cx8="http://schemas.microsoft.com/office/drawing/2016/5/14/chartex" xmlns:mc="http://schemas.openxmlformats.org/markup-compatibility/2006" xmlns:aink="http://schemas.microsoft.com/office/drawing/2016/ink" xmlns:am3d="http://schemas.microsoft.com/office/drawing/2017/model3d" xmlns:o="urn:schemas-microsoft-com:office:office" xmlns:oel="http://schemas.microsoft.com/office/2019/extlst" xmlns:r="http://schemas.openxmlformats.org/officeDocument/2006/relationships" xmlns:m="http://schemas.openxmlformats.org/officeDocument/2006/math" xmlns:v="urn:schemas-microsoft-com:vml" xmlns:wp14="http://schemas.microsoft.com/office/word/2010/wordprocessingDrawing" xmlns:wp="http://schemas.openxmlformats.org/drawingml/2006/wordprocessingDrawing" xmlns:w10="urn:schemas-microsoft-com:office:word" xmlns:w="http://schemas.openxmlformats.org/wordprocessingml/2006/main" xmlns:w14="http://schemas.microsoft.com/office/word/2010/wordml" xmlns:w15="http://schemas.microsoft.com/office/word/2012/wordml" xmlns:w16cex="http://schemas.microsoft.com/office/word/2018/wordml/cex" xmlns:w16cid="http://schemas.microsoft.com/office/word/2016/wordml/cid" xmlns:w16="http://schemas.microsoft.com/office/word/2018/wordml" xmlns:w16du="http://schemas.microsoft.com/office/word/2023/wordml/word16du" xmlns:w16sdtdh="http://schemas.microsoft.com/office/word/2020/wordml/sdtdatahash" xmlns:w16sdtfl="http://schemas.microsoft.com/office/word/2024/wordml/sdtformatlock" xmlns:w16se="http://schemas.microsoft.com/office/word/2015/wordml/symex" xmlns:wpg="http://schemas.microsoft.com/office/word/2010/wordprocessingGroup" xmlns:wpi="http://schemas.microsoft.com/office/word/2010/wordprocessingInk" xmlns:wne="http://schemas.microsoft.com/office/word/2006/wordml" xmlns:wps="http://schemas.microsoft.com/office/word/2010/wordprocessingShape" mc:Ignorable="w14 w15 w16se w16cid w16 w16cex w16sdtdh w16sdtfl w16du wp14">
   <w:p>
     <w:pPr>
       <w:pStyle w:val="Footer"/>
@@ -7304,7 +7337,7 @@
 </file>
 
 <file path=word/footnotes.xml><?xml version="1.0" encoding="utf-8"?>
-<w:footnotes xmlns:wpc="http://schemas.microsoft.com/office/word/2010/wordprocessingCanvas" xmlns:cx="http://schemas.microsoft.com/office/drawing/2014/chartex" xmlns:cx1="http://schemas.microsoft.com/office/drawing/2015/9/8/chartex" xmlns:cx2="http://schemas.microsoft.com/office/drawing/2015/10/21/chartex" xmlns:cx3="http://schemas.microsoft.com/office/drawing/2016/5/9/chartex" xmlns:cx4="http://schemas.microsoft.com/office/drawing/2016/5/10/chartex" xmlns:cx5="http://schemas.microsoft.com/office/drawing/2016/5/11/chartex" xmlns:cx6="http://schemas.microsoft.com/office/drawing/2016/5/12/chartex" xmlns:cx7="http://schemas.microsoft.com/office/drawing/2016/5/13/chartex" xmlns:cx8="http://schemas.microsoft.com/office/drawing/2016/5/14/chartex" xmlns:mc="http://schemas.openxmlformats.org/markup-compatibility/2006" xmlns:aink="http://schemas.microsoft.com/office/drawing/2016/ink" xmlns:am3d="http://schemas.microsoft.com/office/drawing/2017/model3d" xmlns:o="urn:schemas-microsoft-com:office:office" xmlns:oel="http://schemas.microsoft.com/office/2019/extlst" xmlns:r="http://schemas.openxmlformats.org/officeDocument/2006/relationships" xmlns:m="http://schemas.openxmlformats.org/officeDocument/2006/math" xmlns:v="urn:schemas-microsoft-com:vml" xmlns:wp14="http://schemas.microsoft.com/office/word/2010/wordprocessingDrawing" xmlns:wp="http://schemas.openxmlformats.org/drawingml/2006/wordprocessingDrawing" xmlns:w10="urn:schemas-microsoft-com:office:word" xmlns:w="http://schemas.openxmlformats.org/wordprocessingml/2006/main" xmlns:w14="http://schemas.microsoft.com/office/word/2010/wordml" xmlns:w15="http://schemas.microsoft.com/office/word/2012/wordml" xmlns:w16cex="http://schemas.microsoft.com/office/word/2018/wordml/cex" xmlns:w16cid="http://schemas.microsoft.com/office/word/2016/wordml/cid" xmlns:w16="http://schemas.microsoft.com/office/word/2018/wordml" xmlns:w16du="http://schemas.microsoft.com/office/word/2023/wordml/word16du" xmlns:w16sdtdh="http://schemas.microsoft.com/office/word/2020/wordml/sdtdatahash" xmlns:w16se="http://schemas.microsoft.com/office/word/2015/wordml/symex" xmlns:wpg="http://schemas.microsoft.com/office/word/2010/wordprocessingGroup" xmlns:wpi="http://schemas.microsoft.com/office/word/2010/wordprocessingInk" xmlns:wne="http://schemas.microsoft.com/office/word/2006/wordml" xmlns:wps="http://schemas.microsoft.com/office/word/2010/wordprocessingShape" mc:Ignorable="w14 w15 w16se w16cid w16 w16cex w16sdtdh w16du wp14">
+<w:footnotes xmlns:wpc="http://schemas.microsoft.com/office/word/2010/wordprocessingCanvas" xmlns:cx="http://schemas.microsoft.com/office/drawing/2014/chartex" xmlns:cx1="http://schemas.microsoft.com/office/drawing/2015/9/8/chartex" xmlns:cx2="http://schemas.microsoft.com/office/drawing/2015/10/21/chartex" xmlns:cx3="http://schemas.microsoft.com/office/drawing/2016/5/9/chartex" xmlns:cx4="http://schemas.microsoft.com/office/drawing/2016/5/10/chartex" xmlns:cx5="http://schemas.microsoft.com/office/drawing/2016/5/11/chartex" xmlns:cx6="http://schemas.microsoft.com/office/drawing/2016/5/12/chartex" xmlns:cx7="http://schemas.microsoft.com/office/drawing/2016/5/13/chartex" xmlns:cx8="http://schemas.microsoft.com/office/drawing/2016/5/14/chartex" xmlns:mc="http://schemas.openxmlformats.org/markup-compatibility/2006" xmlns:aink="http://schemas.microsoft.com/office/drawing/2016/ink" xmlns:am3d="http://schemas.microsoft.com/office/drawing/2017/model3d" xmlns:o="urn:schemas-microsoft-com:office:office" xmlns:oel="http://schemas.microsoft.com/office/2019/extlst" xmlns:r="http://schemas.openxmlformats.org/officeDocument/2006/relationships" xmlns:m="http://schemas.openxmlformats.org/officeDocument/2006/math" xmlns:v="urn:schemas-microsoft-com:vml" xmlns:wp14="http://schemas.microsoft.com/office/word/2010/wordprocessingDrawing" xmlns:wp="http://schemas.openxmlformats.org/drawingml/2006/wordprocessingDrawing" xmlns:w10="urn:schemas-microsoft-com:office:word" xmlns:w="http://schemas.openxmlformats.org/wordprocessingml/2006/main" xmlns:w14="http://schemas.microsoft.com/office/word/2010/wordml" xmlns:w15="http://schemas.microsoft.com/office/word/2012/wordml" xmlns:w16cex="http://schemas.microsoft.com/office/word/2018/wordml/cex" xmlns:w16cid="http://schemas.microsoft.com/office/word/2016/wordml/cid" xmlns:w16="http://schemas.microsoft.com/office/word/2018/wordml" xmlns:w16du="http://schemas.microsoft.com/office/word/2023/wordml/word16du" xmlns:w16sdtdh="http://schemas.microsoft.com/office/word/2020/wordml/sdtdatahash" xmlns:w16sdtfl="http://schemas.microsoft.com/office/word/2024/wordml/sdtformatlock" xmlns:w16se="http://schemas.microsoft.com/office/word/2015/wordml/symex" xmlns:wpg="http://schemas.microsoft.com/office/word/2010/wordprocessingGroup" xmlns:wpi="http://schemas.microsoft.com/office/word/2010/wordprocessingInk" xmlns:wne="http://schemas.microsoft.com/office/word/2006/wordml" xmlns:wps="http://schemas.microsoft.com/office/word/2010/wordprocessingShape" mc:Ignorable="w14 w15 w16se w16cid w16 w16cex w16sdtdh w16sdtfl w16du wp14">
   <w:footnote w:type="separator" w:id="-1">
     <w:p>
       <w:pPr>
@@ -7329,7 +7362,7 @@
 </file>
 
 <file path=word/numbering.xml><?xml version="1.0" encoding="utf-8"?>
-<w:numbering xmlns:wpc="http://schemas.microsoft.com/office/word/2010/wordprocessingCanvas" xmlns:cx="http://schemas.microsoft.com/office/drawing/2014/chartex" xmlns:cx1="http://schemas.microsoft.com/office/drawing/2015/9/8/chartex" xmlns:cx2="http://schemas.microsoft.com/office/drawing/2015/10/21/chartex" xmlns:cx3="http://schemas.microsoft.com/office/drawing/2016/5/9/chartex" xmlns:cx4="http://schemas.microsoft.com/office/drawing/2016/5/10/chartex" xmlns:cx5="http://schemas.microsoft.com/office/drawing/2016/5/11/chartex" xmlns:cx6="http://schemas.microsoft.com/office/drawing/2016/5/12/chartex" xmlns:cx7="http://schemas.microsoft.com/office/drawing/2016/5/13/chartex" xmlns:cx8="http://schemas.microsoft.com/office/drawing/2016/5/14/chartex" xmlns:mc="http://schemas.openxmlformats.org/markup-compatibility/2006" xmlns:aink="http://schemas.microsoft.com/office/drawing/2016/ink" xmlns:am3d="http://schemas.microsoft.com/office/drawing/2017/model3d" xmlns:o="urn:schemas-microsoft-com:office:office" xmlns:oel="http://schemas.microsoft.com/office/2019/extlst" xmlns:r="http://schemas.openxmlformats.org/officeDocument/2006/relationships" xmlns:m="http://schemas.openxmlformats.org/officeDocument/2006/math" xmlns:v="urn:schemas-microsoft-com:vml" xmlns:wp14="http://schemas.microsoft.com/office/word/2010/wordprocessingDrawing" xmlns:wp="http://schemas.openxmlformats.org/drawingml/2006/wordprocessingDrawing" xmlns:w10="urn:schemas-microsoft-com:office:word" xmlns:w="http://schemas.openxmlformats.org/wordprocessingml/2006/main" xmlns:w14="http://schemas.microsoft.com/office/word/2010/wordml" xmlns:w15="http://schemas.microsoft.com/office/word/2012/wordml" xmlns:w16cex="http://schemas.microsoft.com/office/word/2018/wordml/cex" xmlns:w16cid="http://schemas.microsoft.com/office/word/2016/wordml/cid" xmlns:w16="http://schemas.microsoft.com/office/word/2018/wordml" xmlns:w16du="http://schemas.microsoft.com/office/word/2023/wordml/word16du" xmlns:w16sdtdh="http://schemas.microsoft.com/office/word/2020/wordml/sdtdatahash" xmlns:w16se="http://schemas.microsoft.com/office/word/2015/wordml/symex" xmlns:wpg="http://schemas.microsoft.com/office/word/2010/wordprocessingGroup" xmlns:wpi="http://schemas.microsoft.com/office/word/2010/wordprocessingInk" xmlns:wne="http://schemas.microsoft.com/office/word/2006/wordml" xmlns:wps="http://schemas.microsoft.com/office/word/2010/wordprocessingShape" mc:Ignorable="w14 w15 w16se w16cid w16 w16cex w16sdtdh w16du wp14">
+<w:numbering xmlns:wpc="http://schemas.microsoft.com/office/word/2010/wordprocessingCanvas" xmlns:cx="http://schemas.microsoft.com/office/drawing/2014/chartex" xmlns:cx1="http://schemas.microsoft.com/office/drawing/2015/9/8/chartex" xmlns:cx2="http://schemas.microsoft.com/office/drawing/2015/10/21/chartex" xmlns:cx3="http://schemas.microsoft.com/office/drawing/2016/5/9/chartex" xmlns:cx4="http://schemas.microsoft.com/office/drawing/2016/5/10/chartex" xmlns:cx5="http://schemas.microsoft.com/office/drawing/2016/5/11/chartex" xmlns:cx6="http://schemas.microsoft.com/office/drawing/2016/5/12/chartex" xmlns:cx7="http://schemas.microsoft.com/office/drawing/2016/5/13/chartex" xmlns:cx8="http://schemas.microsoft.com/office/drawing/2016/5/14/chartex" xmlns:mc="http://schemas.openxmlformats.org/markup-compatibility/2006" xmlns:aink="http://schemas.microsoft.com/office/drawing/2016/ink" xmlns:am3d="http://schemas.microsoft.com/office/drawing/2017/model3d" xmlns:o="urn:schemas-microsoft-com:office:office" xmlns:oel="http://schemas.microsoft.com/office/2019/extlst" xmlns:r="http://schemas.openxmlformats.org/officeDocument/2006/relationships" xmlns:m="http://schemas.openxmlformats.org/officeDocument/2006/math" xmlns:v="urn:schemas-microsoft-com:vml" xmlns:wp14="http://schemas.microsoft.com/office/word/2010/wordprocessingDrawing" xmlns:wp="http://schemas.openxmlformats.org/drawingml/2006/wordprocessingDrawing" xmlns:w10="urn:schemas-microsoft-com:office:word" xmlns:w="http://schemas.openxmlformats.org/wordprocessingml/2006/main" xmlns:w14="http://schemas.microsoft.com/office/word/2010/wordml" xmlns:w15="http://schemas.microsoft.com/office/word/2012/wordml" xmlns:w16cex="http://schemas.microsoft.com/office/word/2018/wordml/cex" xmlns:w16cid="http://schemas.microsoft.com/office/word/2016/wordml/cid" xmlns:w16="http://schemas.microsoft.com/office/word/2018/wordml" xmlns:w16du="http://schemas.microsoft.com/office/word/2023/wordml/word16du" xmlns:w16sdtdh="http://schemas.microsoft.com/office/word/2020/wordml/sdtdatahash" xmlns:w16sdtfl="http://schemas.microsoft.com/office/word/2024/wordml/sdtformatlock" xmlns:w16se="http://schemas.microsoft.com/office/word/2015/wordml/symex" xmlns:wpg="http://schemas.microsoft.com/office/word/2010/wordprocessingGroup" xmlns:wpi="http://schemas.microsoft.com/office/word/2010/wordprocessingInk" xmlns:wne="http://schemas.microsoft.com/office/word/2006/wordml" xmlns:wps="http://schemas.microsoft.com/office/word/2010/wordprocessingShape" mc:Ignorable="w14 w15 w16se w16cid w16 w16cex w16sdtdh w16sdtfl w16du wp14">
   <w:abstractNum w:abstractNumId="0" w15:restartNumberingAfterBreak="0">
     <w:nsid w:val="0AC66F47"/>
     <w:multiLevelType w:val="hybridMultilevel"/>
@@ -10817,7 +10850,7 @@
 </file>
 
 <file path=word/styles.xml><?xml version="1.0" encoding="utf-8"?>
-<w:styles xmlns:mc="http://schemas.openxmlformats.org/markup-compatibility/2006" xmlns:r="http://schemas.openxmlformats.org/officeDocument/2006/relationships" xmlns:w="http://schemas.openxmlformats.org/wordprocessingml/2006/main" xmlns:w14="http://schemas.microsoft.com/office/word/2010/wordml" xmlns:w15="http://schemas.microsoft.com/office/word/2012/wordml" xmlns:w16cex="http://schemas.microsoft.com/office/word/2018/wordml/cex" xmlns:w16cid="http://schemas.microsoft.com/office/word/2016/wordml/cid" xmlns:w16="http://schemas.microsoft.com/office/word/2018/wordml" xmlns:w16du="http://schemas.microsoft.com/office/word/2023/wordml/word16du" xmlns:w16sdtdh="http://schemas.microsoft.com/office/word/2020/wordml/sdtdatahash" xmlns:w16se="http://schemas.microsoft.com/office/word/2015/wordml/symex" mc:Ignorable="w14 w15 w16se w16cid w16 w16cex w16sdtdh w16du">
+<w:styles xmlns:mc="http://schemas.openxmlformats.org/markup-compatibility/2006" xmlns:r="http://schemas.openxmlformats.org/officeDocument/2006/relationships" xmlns:w="http://schemas.openxmlformats.org/wordprocessingml/2006/main" xmlns:w14="http://schemas.microsoft.com/office/word/2010/wordml" xmlns:w15="http://schemas.microsoft.com/office/word/2012/wordml" xmlns:w16cex="http://schemas.microsoft.com/office/word/2018/wordml/cex" xmlns:w16cid="http://schemas.microsoft.com/office/word/2016/wordml/cid" xmlns:w16="http://schemas.microsoft.com/office/word/2018/wordml" xmlns:w16du="http://schemas.microsoft.com/office/word/2023/wordml/word16du" xmlns:w16sdtdh="http://schemas.microsoft.com/office/word/2020/wordml/sdtdatahash" xmlns:w16sdtfl="http://schemas.microsoft.com/office/word/2024/wordml/sdtformatlock" xmlns:w16se="http://schemas.microsoft.com/office/word/2015/wordml/symex" mc:Ignorable="w14 w15 w16se w16cid w16 w16cex w16sdtdh w16sdtfl w16du">
   <w:docDefaults>
     <w:rPrDefault>
       <w:rPr>
@@ -11335,6 +11368,7 @@
   <w:style w:type="character" w:default="1" w:styleId="DefaultParagraphFont">
     <w:name w:val="Default Paragraph Font"/>
     <w:uiPriority w:val="1"/>
+    <w:semiHidden/>
     <w:unhideWhenUsed/>
   </w:style>
   <w:style w:type="table" w:default="1" w:styleId="TableNormal">
@@ -24891,10 +24925,19 @@
 </file>
 
 <file path=customXml/item1.xml><?xml version="1.0" encoding="utf-8"?>
+<?mso-contentType ?>
+<FormTemplates xmlns="http://schemas.microsoft.com/sharepoint/v3/contenttype/forms">
+  <Display>DocumentLibraryForm</Display>
+  <Edit>DocumentLibraryForm</Edit>
+  <New>DocumentLibraryForm</New>
+</FormTemplates>
+</file>
+
+<file path=customXml/item2.xml><?xml version="1.0" encoding="utf-8"?>
 <b:Sources xmlns:b="http://schemas.openxmlformats.org/officeDocument/2006/bibliography" xmlns="http://schemas.openxmlformats.org/officeDocument/2006/bibliography" SelectedStyle="\APASixthEditionOfficeOnline.xsl" StyleName="APA" Version="6"/>
 </file>
 
-<file path=customXml/item2.xml><?xml version="1.0" encoding="utf-8"?>
+<file path=customXml/item3.xml><?xml version="1.0" encoding="utf-8"?>
 <ct:contentTypeSchema xmlns:ct="http://schemas.microsoft.com/office/2006/metadata/contentType" xmlns:ma="http://schemas.microsoft.com/office/2006/metadata/properties/metaAttributes" ct:_="" ma:_="" ma:contentTypeName="Document" ma:contentTypeID="0x0101009908F051F1A7FA40B6E0D78DFA896E6F" ma:contentTypeVersion="15" ma:contentTypeDescription="Create a new document." ma:contentTypeScope="" ma:versionID="16bd8ccdb24192f5a23e1f50082beb91">
   <xsd:schema xmlns:xsd="http://www.w3.org/2001/XMLSchema" xmlns:xs="http://www.w3.org/2001/XMLSchema" xmlns:p="http://schemas.microsoft.com/office/2006/metadata/properties" xmlns:ns3="d71ff2ac-62c7-44d6-abd7-1383af8796a8" xmlns:ns4="19621f95-9056-4b81-ab21-41233ae0d36d" targetNamespace="http://schemas.microsoft.com/office/2006/metadata/properties" ma:root="true" ma:fieldsID="4a6057a7fc35ca9381604f182b6a209d" ns3:_="" ns4:_="">
     <xsd:import namespace="d71ff2ac-62c7-44d6-abd7-1383af8796a8"/>
@@ -25127,15 +25170,6 @@
 </ct:contentTypeSchema>
 </file>
 
-<file path=customXml/item3.xml><?xml version="1.0" encoding="utf-8"?>
-<?mso-contentType ?>
-<FormTemplates xmlns="http://schemas.microsoft.com/sharepoint/v3/contenttype/forms">
-  <Display>DocumentLibraryForm</Display>
-  <Edit>DocumentLibraryForm</Edit>
-  <New>DocumentLibraryForm</New>
-</FormTemplates>
-</file>
-
 <file path=customXml/item4.xml><?xml version="1.0" encoding="utf-8"?>
 <p:properties xmlns:p="http://schemas.microsoft.com/office/2006/metadata/properties" xmlns:xsi="http://www.w3.org/2001/XMLSchema-instance" xmlns:pc="http://schemas.microsoft.com/office/infopath/2007/PartnerControls">
   <documentManagement>
@@ -25145,6 +25179,14 @@
 </file>
 
 <file path=customXml/itemProps1.xml><?xml version="1.0" encoding="utf-8"?>
+<ds:datastoreItem xmlns:ds="http://schemas.openxmlformats.org/officeDocument/2006/customXml" ds:itemID="{DBC131DF-4F18-448B-B46F-936BB86E1BD6}">
+  <ds:schemaRefs>
+    <ds:schemaRef ds:uri="http://schemas.microsoft.com/sharepoint/v3/contenttype/forms"/>
+  </ds:schemaRefs>
+</ds:datastoreItem>
+</file>
+
+<file path=customXml/itemProps2.xml><?xml version="1.0" encoding="utf-8"?>
 <ds:datastoreItem xmlns:ds="http://schemas.openxmlformats.org/officeDocument/2006/customXml" ds:itemID="{500AA85C-6BEF-45D1-AD66-44E6B9A5378D}">
   <ds:schemaRefs>
     <ds:schemaRef ds:uri="http://schemas.openxmlformats.org/officeDocument/2006/bibliography"/>
@@ -25152,7 +25194,7 @@
 </ds:datastoreItem>
 </file>
 
-<file path=customXml/itemProps2.xml><?xml version="1.0" encoding="utf-8"?>
+<file path=customXml/itemProps3.xml><?xml version="1.0" encoding="utf-8"?>
 <ds:datastoreItem xmlns:ds="http://schemas.openxmlformats.org/officeDocument/2006/customXml" ds:itemID="{9E4FD10E-ECE4-47FC-B486-A980A4B50C09}">
   <ds:schemaRefs>
     <ds:schemaRef ds:uri="http://schemas.microsoft.com/office/2006/metadata/contentType"/>
@@ -25171,14 +25213,6 @@
 </ds:datastoreItem>
 </file>
 
-<file path=customXml/itemProps3.xml><?xml version="1.0" encoding="utf-8"?>
-<ds:datastoreItem xmlns:ds="http://schemas.openxmlformats.org/officeDocument/2006/customXml" ds:itemID="{DBC131DF-4F18-448B-B46F-936BB86E1BD6}">
-  <ds:schemaRefs>
-    <ds:schemaRef ds:uri="http://schemas.microsoft.com/sharepoint/v3/contenttype/forms"/>
-  </ds:schemaRefs>
-</ds:datastoreItem>
-</file>
-
 <file path=customXml/itemProps4.xml><?xml version="1.0" encoding="utf-8"?>
 <ds:datastoreItem xmlns:ds="http://schemas.openxmlformats.org/officeDocument/2006/customXml" ds:itemID="{3F2AE3CF-AF0A-42C7-BC75-AAA91D189F19}">
   <ds:schemaRefs>

</xml_diff>

<commit_message>
Table added for detection loading in example data, Design doc progress
</commit_message>
<xml_diff>
--- a/Design/SiteSafeDesign.docx
+++ b/Design/SiteSafeDesign.docx
@@ -556,7 +556,7 @@
           <w:szCs w:val="32"/>
         </w:rPr>
         <w:drawing>
-          <wp:anchor distT="0" distB="0" distL="114300" distR="114300" simplePos="0" relativeHeight="251540480" behindDoc="0" locked="0" layoutInCell="1" allowOverlap="1" wp14:anchorId="1AE65912" wp14:editId="316A7C6B">
+          <wp:anchor distT="0" distB="0" distL="114300" distR="114300" simplePos="0" relativeHeight="251540480" behindDoc="0" locked="0" layoutInCell="1" allowOverlap="1" wp14:anchorId="1AE65912" wp14:editId="0AFC0D55">
             <wp:simplePos x="0" y="0"/>
             <wp:positionH relativeFrom="column">
               <wp:posOffset>60960</wp:posOffset>
@@ -3292,7 +3292,7 @@
           <w:lang w:val="en-GB"/>
         </w:rPr>
         <w:drawing>
-          <wp:anchor distT="0" distB="0" distL="114300" distR="114300" simplePos="0" relativeHeight="251804672" behindDoc="0" locked="0" layoutInCell="1" allowOverlap="1" wp14:anchorId="69356E40" wp14:editId="542F30A8">
+          <wp:anchor distT="0" distB="0" distL="114300" distR="114300" simplePos="0" relativeHeight="251804672" behindDoc="0" locked="0" layoutInCell="1" allowOverlap="1" wp14:anchorId="69356E40" wp14:editId="6B648981">
             <wp:simplePos x="0" y="0"/>
             <wp:positionH relativeFrom="column">
               <wp:posOffset>-441960</wp:posOffset>
@@ -6621,26 +6621,18 @@
     </w:p>
     <w:p>
       <w:pPr>
-        <w:jc w:val="both"/>
-      </w:pPr>
-    </w:p>
-    <w:p>
-      <w:pPr>
-        <w:jc w:val="both"/>
-      </w:pPr>
-    </w:p>
-    <w:p>
-      <w:pPr>
-        <w:jc w:val="both"/>
-      </w:pPr>
-    </w:p>
-    <w:p>
-      <w:pPr>
         <w:pStyle w:val="Heading1"/>
+        <w:jc w:val="left"/>
+      </w:pPr>
+    </w:p>
+    <w:p/>
+    <w:p>
+      <w:pPr>
+        <w:pStyle w:val="Heading1"/>
       </w:pPr>
       <w:r>
         <w:lastRenderedPageBreak/>
-        <w:t>Next Iteration Additions</w:t>
+        <w:t>Pseudo Code for Critical Algorithms</w:t>
       </w:r>
     </w:p>
     <w:p/>
@@ -6649,11 +6641,67 @@
         <w:pStyle w:val="Heading2"/>
       </w:pPr>
       <w:r>
+        <w:t>Training YOLO11 model</w:t>
+      </w:r>
+    </w:p>
+    <w:p/>
+    <w:p>
+      <w:pPr>
+        <w:pStyle w:val="Heading2"/>
+      </w:pPr>
+      <w:r>
+        <w:t>Running inference on images with the model</w:t>
+      </w:r>
+    </w:p>
+    <w:p/>
+    <w:p>
+      <w:pPr>
+        <w:pStyle w:val="Heading2"/>
+      </w:pPr>
+      <w:r>
+        <w:t>Pseudo Code for Critical Algorithms</w:t>
+      </w:r>
+    </w:p>
+    <w:p/>
+    <w:p/>
+    <w:p/>
+    <w:p/>
+    <w:p/>
+    <w:p/>
+    <w:p/>
+    <w:p/>
+    <w:p/>
+    <w:p/>
+    <w:p/>
+    <w:p/>
+    <w:p/>
+    <w:p/>
+    <w:p/>
+    <w:p/>
+    <w:p/>
+    <w:p/>
+    <w:p/>
+    <w:p/>
+    <w:p/>
+    <w:p/>
+    <w:p/>
+    <w:p/>
+    <w:p/>
+    <w:p/>
+    <w:p/>
+    <w:p>
+      <w:pPr>
+        <w:pStyle w:val="Heading2"/>
+      </w:pPr>
+      <w:r>
         <w:t>E</w:t>
       </w:r>
       <w:r>
         <w:t>ntity-Relationship Diagram</w:t>
       </w:r>
+      <w:r>
+        <w:t xml:space="preserve"> (Done)</w:t>
+      </w:r>
     </w:p>
     <w:p>
       <w:pPr>
@@ -6795,7 +6843,6 @@
         <w:rPr>
           <w:color w:val="0070C0"/>
         </w:rPr>
-        <w:lastRenderedPageBreak/>
         <w:t>References</w:t>
       </w:r>
     </w:p>
@@ -24925,19 +24972,6 @@
 </file>
 
 <file path=customXml/item1.xml><?xml version="1.0" encoding="utf-8"?>
-<?mso-contentType ?>
-<FormTemplates xmlns="http://schemas.microsoft.com/sharepoint/v3/contenttype/forms">
-  <Display>DocumentLibraryForm</Display>
-  <Edit>DocumentLibraryForm</Edit>
-  <New>DocumentLibraryForm</New>
-</FormTemplates>
-</file>
-
-<file path=customXml/item2.xml><?xml version="1.0" encoding="utf-8"?>
-<b:Sources xmlns:b="http://schemas.openxmlformats.org/officeDocument/2006/bibliography" xmlns="http://schemas.openxmlformats.org/officeDocument/2006/bibliography" SelectedStyle="\APASixthEditionOfficeOnline.xsl" StyleName="APA" Version="6"/>
-</file>
-
-<file path=customXml/item3.xml><?xml version="1.0" encoding="utf-8"?>
 <ct:contentTypeSchema xmlns:ct="http://schemas.microsoft.com/office/2006/metadata/contentType" xmlns:ma="http://schemas.microsoft.com/office/2006/metadata/properties/metaAttributes" ct:_="" ma:_="" ma:contentTypeName="Document" ma:contentTypeID="0x0101009908F051F1A7FA40B6E0D78DFA896E6F" ma:contentTypeVersion="15" ma:contentTypeDescription="Create a new document." ma:contentTypeScope="" ma:versionID="16bd8ccdb24192f5a23e1f50082beb91">
   <xsd:schema xmlns:xsd="http://www.w3.org/2001/XMLSchema" xmlns:xs="http://www.w3.org/2001/XMLSchema" xmlns:p="http://schemas.microsoft.com/office/2006/metadata/properties" xmlns:ns3="d71ff2ac-62c7-44d6-abd7-1383af8796a8" xmlns:ns4="19621f95-9056-4b81-ab21-41233ae0d36d" targetNamespace="http://schemas.microsoft.com/office/2006/metadata/properties" ma:root="true" ma:fieldsID="4a6057a7fc35ca9381604f182b6a209d" ns3:_="" ns4:_="">
     <xsd:import namespace="d71ff2ac-62c7-44d6-abd7-1383af8796a8"/>
@@ -25170,7 +25204,16 @@
 </ct:contentTypeSchema>
 </file>
 
-<file path=customXml/item4.xml><?xml version="1.0" encoding="utf-8"?>
+<file path=customXml/item2.xml><?xml version="1.0" encoding="utf-8"?>
+<?mso-contentType ?>
+<FormTemplates xmlns="http://schemas.microsoft.com/sharepoint/v3/contenttype/forms">
+  <Display>DocumentLibraryForm</Display>
+  <Edit>DocumentLibraryForm</Edit>
+  <New>DocumentLibraryForm</New>
+</FormTemplates>
+</file>
+
+<file path=customXml/item3.xml><?xml version="1.0" encoding="utf-8"?>
 <p:properties xmlns:p="http://schemas.microsoft.com/office/2006/metadata/properties" xmlns:xsi="http://www.w3.org/2001/XMLSchema-instance" xmlns:pc="http://schemas.microsoft.com/office/infopath/2007/PartnerControls">
   <documentManagement>
     <_activity xmlns="d71ff2ac-62c7-44d6-abd7-1383af8796a8" xsi:nil="true"/>
@@ -25178,23 +25221,11 @@
 </p:properties>
 </file>
 
-<file path=customXml/itemProps1.xml><?xml version="1.0" encoding="utf-8"?>
-<ds:datastoreItem xmlns:ds="http://schemas.openxmlformats.org/officeDocument/2006/customXml" ds:itemID="{DBC131DF-4F18-448B-B46F-936BB86E1BD6}">
-  <ds:schemaRefs>
-    <ds:schemaRef ds:uri="http://schemas.microsoft.com/sharepoint/v3/contenttype/forms"/>
-  </ds:schemaRefs>
-</ds:datastoreItem>
+<file path=customXml/item4.xml><?xml version="1.0" encoding="utf-8"?>
+<b:Sources xmlns:b="http://schemas.openxmlformats.org/officeDocument/2006/bibliography" xmlns="http://schemas.openxmlformats.org/officeDocument/2006/bibliography" SelectedStyle="\APASixthEditionOfficeOnline.xsl" StyleName="APA" Version="6"/>
 </file>
 
-<file path=customXml/itemProps2.xml><?xml version="1.0" encoding="utf-8"?>
-<ds:datastoreItem xmlns:ds="http://schemas.openxmlformats.org/officeDocument/2006/customXml" ds:itemID="{500AA85C-6BEF-45D1-AD66-44E6B9A5378D}">
-  <ds:schemaRefs>
-    <ds:schemaRef ds:uri="http://schemas.openxmlformats.org/officeDocument/2006/bibliography"/>
-  </ds:schemaRefs>
-</ds:datastoreItem>
-</file>
-
-<file path=customXml/itemProps3.xml><?xml version="1.0" encoding="utf-8"?>
+<file path=customXml/itemProps1.xml><?xml version="1.0" encoding="utf-8"?>
 <ds:datastoreItem xmlns:ds="http://schemas.openxmlformats.org/officeDocument/2006/customXml" ds:itemID="{9E4FD10E-ECE4-47FC-B486-A980A4B50C09}">
   <ds:schemaRefs>
     <ds:schemaRef ds:uri="http://schemas.microsoft.com/office/2006/metadata/contentType"/>
@@ -25213,7 +25244,15 @@
 </ds:datastoreItem>
 </file>
 
-<file path=customXml/itemProps4.xml><?xml version="1.0" encoding="utf-8"?>
+<file path=customXml/itemProps2.xml><?xml version="1.0" encoding="utf-8"?>
+<ds:datastoreItem xmlns:ds="http://schemas.openxmlformats.org/officeDocument/2006/customXml" ds:itemID="{DBC131DF-4F18-448B-B46F-936BB86E1BD6}">
+  <ds:schemaRefs>
+    <ds:schemaRef ds:uri="http://schemas.microsoft.com/sharepoint/v3/contenttype/forms"/>
+  </ds:schemaRefs>
+</ds:datastoreItem>
+</file>
+
+<file path=customXml/itemProps3.xml><?xml version="1.0" encoding="utf-8"?>
 <ds:datastoreItem xmlns:ds="http://schemas.openxmlformats.org/officeDocument/2006/customXml" ds:itemID="{3F2AE3CF-AF0A-42C7-BC75-AAA91D189F19}">
   <ds:schemaRefs>
     <ds:schemaRef ds:uri="http://schemas.microsoft.com/office/2006/metadata/properties"/>
@@ -25221,4 +25260,12 @@
     <ds:schemaRef ds:uri="d71ff2ac-62c7-44d6-abd7-1383af8796a8"/>
   </ds:schemaRefs>
 </ds:datastoreItem>
+</file>
+
+<file path=customXml/itemProps4.xml><?xml version="1.0" encoding="utf-8"?>
+<ds:datastoreItem xmlns:ds="http://schemas.openxmlformats.org/officeDocument/2006/customXml" ds:itemID="{500AA85C-6BEF-45D1-AD66-44E6B9A5378D}">
+  <ds:schemaRefs>
+    <ds:schemaRef ds:uri="http://schemas.openxmlformats.org/officeDocument/2006/bibliography"/>
+  </ds:schemaRefs>
+</ds:datastoreItem>
 </file>
</xml_diff>

<commit_message>
Design doc component diagram added
</commit_message>
<xml_diff>
--- a/Design/SiteSafeDesign.docx
+++ b/Design/SiteSafeDesign.docx
@@ -556,7 +556,7 @@
           <w:szCs w:val="32"/>
         </w:rPr>
         <w:drawing>
-          <wp:anchor distT="0" distB="0" distL="114300" distR="114300" simplePos="0" relativeHeight="251540480" behindDoc="0" locked="0" layoutInCell="1" allowOverlap="1" wp14:anchorId="1AE65912" wp14:editId="0AFC0D55">
+          <wp:anchor distT="0" distB="0" distL="114300" distR="114300" simplePos="0" relativeHeight="251540480" behindDoc="0" locked="0" layoutInCell="1" allowOverlap="1" wp14:anchorId="1AE65912" wp14:editId="5BBAFAE5">
             <wp:simplePos x="0" y="0"/>
             <wp:positionH relativeFrom="column">
               <wp:posOffset>60960</wp:posOffset>
@@ -3292,7 +3292,7 @@
           <w:lang w:val="en-GB"/>
         </w:rPr>
         <w:drawing>
-          <wp:anchor distT="0" distB="0" distL="114300" distR="114300" simplePos="0" relativeHeight="251804672" behindDoc="0" locked="0" layoutInCell="1" allowOverlap="1" wp14:anchorId="69356E40" wp14:editId="6B648981">
+          <wp:anchor distT="0" distB="0" distL="114300" distR="114300" simplePos="0" relativeHeight="251804672" behindDoc="0" locked="0" layoutInCell="1" allowOverlap="1" wp14:anchorId="69356E40" wp14:editId="2093A8AF">
             <wp:simplePos x="0" y="0"/>
             <wp:positionH relativeFrom="column">
               <wp:posOffset>-441960</wp:posOffset>
@@ -6646,6 +6646,243 @@
     </w:p>
     <w:p/>
     <w:p>
+      <w:r>
+        <w:rPr>
+          <w:b/>
+          <w:bCs/>
+          <w:noProof/>
+        </w:rPr>
+        <mc:AlternateContent>
+          <mc:Choice Requires="wps">
+            <w:drawing>
+              <wp:anchor distT="45720" distB="45720" distL="114300" distR="114300" simplePos="0" relativeHeight="251810816" behindDoc="0" locked="0" layoutInCell="1" allowOverlap="1" wp14:anchorId="790084E0" wp14:editId="2C1BFC5F">
+                <wp:simplePos x="0" y="0"/>
+                <wp:positionH relativeFrom="column">
+                  <wp:posOffset>4282440</wp:posOffset>
+                </wp:positionH>
+                <wp:positionV relativeFrom="paragraph">
+                  <wp:posOffset>1891030</wp:posOffset>
+                </wp:positionV>
+                <wp:extent cx="1265555" cy="255905"/>
+                <wp:effectExtent l="0" t="0" r="0" b="0"/>
+                <wp:wrapNone/>
+                <wp:docPr id="1693720421" name="Text Box 2"/>
+                <wp:cNvGraphicFramePr>
+                  <a:graphicFrameLocks xmlns:a="http://schemas.openxmlformats.org/drawingml/2006/main"/>
+                </wp:cNvGraphicFramePr>
+                <a:graphic xmlns:a="http://schemas.openxmlformats.org/drawingml/2006/main">
+                  <a:graphicData uri="http://schemas.microsoft.com/office/word/2010/wordprocessingShape">
+                    <wps:wsp>
+                      <wps:cNvSpPr txBox="1">
+                        <a:spLocks noChangeArrowheads="1"/>
+                      </wps:cNvSpPr>
+                      <wps:spPr bwMode="auto">
+                        <a:xfrm>
+                          <a:off x="0" y="0"/>
+                          <a:ext cx="1265555" cy="255905"/>
+                        </a:xfrm>
+                        <a:prstGeom prst="rect">
+                          <a:avLst/>
+                        </a:prstGeom>
+                        <a:noFill/>
+                        <a:ln>
+                          <a:noFill/>
+                        </a:ln>
+                      </wps:spPr>
+                      <wps:style>
+                        <a:lnRef idx="0">
+                          <a:scrgbClr r="0" g="0" b="0"/>
+                        </a:lnRef>
+                        <a:fillRef idx="0">
+                          <a:scrgbClr r="0" g="0" b="0"/>
+                        </a:fillRef>
+                        <a:effectRef idx="0">
+                          <a:scrgbClr r="0" g="0" b="0"/>
+                        </a:effectRef>
+                        <a:fontRef idx="minor">
+                          <a:schemeClr val="dk1"/>
+                        </a:fontRef>
+                      </wps:style>
+                      <wps:txbx>
+                        <w:txbxContent>
+                          <w:p>
+                            <w:pPr>
+                              <w:rPr>
+                                <w:sz w:val="18"/>
+                                <w:szCs w:val="18"/>
+                              </w:rPr>
+                            </w:pPr>
+                            <w:r>
+                              <w:rPr>
+                                <w:sz w:val="18"/>
+                                <w:szCs w:val="18"/>
+                              </w:rPr>
+                              <w:t>Website</w:t>
+                            </w:r>
+                            <w:r>
+                              <w:rPr>
+                                <w:sz w:val="18"/>
+                                <w:szCs w:val="18"/>
+                              </w:rPr>
+                              <w:t>.</w:t>
+                            </w:r>
+                            <w:r>
+                              <w:rPr>
+                                <w:sz w:val="18"/>
+                                <w:szCs w:val="18"/>
+                              </w:rPr>
+                              <w:t xml:space="preserve"> </w:t>
+                            </w:r>
+                            <w:r>
+                              <w:rPr>
+                                <w:sz w:val="18"/>
+                                <w:szCs w:val="18"/>
+                              </w:rPr>
+                              <w:t>2</w:t>
+                            </w:r>
+                            <w:r>
+                              <w:rPr>
+                                <w:sz w:val="18"/>
+                                <w:szCs w:val="18"/>
+                              </w:rPr>
+                              <w:t xml:space="preserve"> </w:t>
+                            </w:r>
+                            <w:r>
+                              <w:rPr>
+                                <w:sz w:val="18"/>
+                                <w:szCs w:val="18"/>
+                              </w:rPr>
+                              <w:t>YOLOv11</w:t>
+                            </w:r>
+                          </w:p>
+                        </w:txbxContent>
+                      </wps:txbx>
+                      <wps:bodyPr rot="0" vert="horz" wrap="square" lIns="91440" tIns="45720" rIns="91440" bIns="45720" anchor="t" anchorCtr="0">
+                        <a:noAutofit/>
+                      </wps:bodyPr>
+                    </wps:wsp>
+                  </a:graphicData>
+                </a:graphic>
+                <wp14:sizeRelH relativeFrom="margin">
+                  <wp14:pctWidth>0</wp14:pctWidth>
+                </wp14:sizeRelH>
+                <wp14:sizeRelV relativeFrom="margin">
+                  <wp14:pctHeight>0</wp14:pctHeight>
+                </wp14:sizeRelV>
+              </wp:anchor>
+            </w:drawing>
+          </mc:Choice>
+          <mc:Fallback>
+            <w:pict>
+              <v:shape w14:anchorId="790084E0" id="_x0000_s1029" type="#_x0000_t202" style="position:absolute;margin-left:337.2pt;margin-top:148.9pt;width:99.65pt;height:20.15pt;z-index:251810816;visibility:visible;mso-wrap-style:square;mso-width-percent:0;mso-height-percent:0;mso-wrap-distance-left:9pt;mso-wrap-distance-top:3.6pt;mso-wrap-distance-right:9pt;mso-wrap-distance-bottom:3.6pt;mso-position-horizontal:absolute;mso-position-horizontal-relative:text;mso-position-vertical:absolute;mso-position-vertical-relative:text;mso-width-percent:0;mso-height-percent:0;mso-width-relative:margin;mso-height-relative:margin;v-text-anchor:top" o:gfxdata="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" filled="f" stroked="f">
+                <v:textbox>
+                  <w:txbxContent>
+                    <w:p>
+                      <w:pPr>
+                        <w:rPr>
+                          <w:sz w:val="18"/>
+                          <w:szCs w:val="18"/>
+                        </w:rPr>
+                      </w:pPr>
+                      <w:r>
+                        <w:rPr>
+                          <w:sz w:val="18"/>
+                          <w:szCs w:val="18"/>
+                        </w:rPr>
+                        <w:t>Website</w:t>
+                      </w:r>
+                      <w:r>
+                        <w:rPr>
+                          <w:sz w:val="18"/>
+                          <w:szCs w:val="18"/>
+                        </w:rPr>
+                        <w:t>.</w:t>
+                      </w:r>
+                      <w:r>
+                        <w:rPr>
+                          <w:sz w:val="18"/>
+                          <w:szCs w:val="18"/>
+                        </w:rPr>
+                        <w:t xml:space="preserve"> </w:t>
+                      </w:r>
+                      <w:r>
+                        <w:rPr>
+                          <w:sz w:val="18"/>
+                          <w:szCs w:val="18"/>
+                        </w:rPr>
+                        <w:t>2</w:t>
+                      </w:r>
+                      <w:r>
+                        <w:rPr>
+                          <w:sz w:val="18"/>
+                          <w:szCs w:val="18"/>
+                        </w:rPr>
+                        <w:t xml:space="preserve"> </w:t>
+                      </w:r>
+                      <w:r>
+                        <w:rPr>
+                          <w:sz w:val="18"/>
+                          <w:szCs w:val="18"/>
+                        </w:rPr>
+                        <w:t>YOLOv11</w:t>
+                      </w:r>
+                    </w:p>
+                  </w:txbxContent>
+                </v:textbox>
+              </v:shape>
+            </w:pict>
+          </mc:Fallback>
+        </mc:AlternateContent>
+      </w:r>
+      <w:r>
+        <w:rPr>
+          <w:noProof/>
+        </w:rPr>
+        <w:drawing>
+          <wp:inline distT="0" distB="0" distL="0" distR="0" wp14:anchorId="17ED858E" wp14:editId="79515138">
+            <wp:extent cx="5731510" cy="1892300"/>
+            <wp:effectExtent l="0" t="0" r="2540" b="0"/>
+            <wp:docPr id="869082579" name="Picture 4" descr="A screenshot of a computer&#10;&#10;AI-generated content may be incorrect."/>
+            <wp:cNvGraphicFramePr>
+              <a:graphicFrameLocks xmlns:a="http://schemas.openxmlformats.org/drawingml/2006/main" noChangeAspect="1"/>
+            </wp:cNvGraphicFramePr>
+            <a:graphic xmlns:a="http://schemas.openxmlformats.org/drawingml/2006/main">
+              <a:graphicData uri="http://schemas.openxmlformats.org/drawingml/2006/picture">
+                <pic:pic xmlns:pic="http://schemas.openxmlformats.org/drawingml/2006/picture">
+                  <pic:nvPicPr>
+                    <pic:cNvPr id="869082579" name="Picture 4" descr="A screenshot of a computer&#10;&#10;AI-generated content may be incorrect."/>
+                    <pic:cNvPicPr/>
+                  </pic:nvPicPr>
+                  <pic:blipFill>
+                    <a:blip r:embed="rId56">
+                      <a:extLst>
+                        <a:ext uri="{28A0092B-C50C-407E-A947-70E740481C1C}">
+                          <a14:useLocalDpi xmlns:a14="http://schemas.microsoft.com/office/drawing/2010/main" val="0"/>
+                        </a:ext>
+                      </a:extLst>
+                    </a:blip>
+                    <a:stretch>
+                      <a:fillRect/>
+                    </a:stretch>
+                  </pic:blipFill>
+                  <pic:spPr>
+                    <a:xfrm>
+                      <a:off x="0" y="0"/>
+                      <a:ext cx="5731510" cy="1892300"/>
+                    </a:xfrm>
+                    <a:prstGeom prst="rect">
+                      <a:avLst/>
+                    </a:prstGeom>
+                  </pic:spPr>
+                </pic:pic>
+              </a:graphicData>
+            </a:graphic>
+          </wp:inline>
+        </w:drawing>
+      </w:r>
+    </w:p>
+    <w:p/>
+    <w:p>
       <w:pPr>
         <w:pStyle w:val="Heading2"/>
       </w:pPr>
@@ -6655,12 +6892,880 @@
     </w:p>
     <w:p/>
     <w:p>
+      <w:r>
+        <w:t>1. Import necessary libraries (YOLO, OpenCV).</w:t>
+      </w:r>
+    </w:p>
+    <w:p>
+      <w:r>
+        <w:t>2. Load the YOLOv11 model using the specified weights file.</w:t>
+      </w:r>
+    </w:p>
+    <w:p>
+      <w:r>
+        <w:t xml:space="preserve">3. Define a dictionary with specific </w:t>
+      </w:r>
+      <w:proofErr w:type="spellStart"/>
+      <w:r>
+        <w:t>colors</w:t>
+      </w:r>
+      <w:proofErr w:type="spellEnd"/>
+      <w:r>
+        <w:t xml:space="preserve"> for each class (person, helmet, </w:t>
+      </w:r>
+      <w:proofErr w:type="spellStart"/>
+      <w:r>
+        <w:t>noHelmet</w:t>
+      </w:r>
+      <w:proofErr w:type="spellEnd"/>
+      <w:r>
+        <w:t>, vest).</w:t>
+      </w:r>
+    </w:p>
+    <w:p>
+      <w:r>
+        <w:t>4. Open the video source (webcam or video file).</w:t>
+      </w:r>
+    </w:p>
+    <w:p>
+      <w:r>
+        <w:t>5. Check if the video source is opened successfully.</w:t>
+      </w:r>
+    </w:p>
+    <w:p>
+      <w:r>
+        <w:t xml:space="preserve">   - If not, print an error message and exit.</w:t>
+      </w:r>
+    </w:p>
+    <w:p>
+      <w:r>
+        <w:t>6. Start a loop to process video frames:</w:t>
+      </w:r>
+    </w:p>
+    <w:p>
+      <w:r>
+        <w:t xml:space="preserve">   a. Read a frame from the video source.</w:t>
+      </w:r>
+    </w:p>
+    <w:p>
+      <w:r>
+        <w:t xml:space="preserve">   b. If the frame cannot be read, print a message and exit the loop.</w:t>
+      </w:r>
+    </w:p>
+    <w:p>
+      <w:r>
+        <w:t xml:space="preserve">   c. Run the YOLOv11 model on the frame to get detections.</w:t>
+      </w:r>
+    </w:p>
+    <w:p>
+      <w:r>
+        <w:t xml:space="preserve">   d. Extract bounding box data from the detection results.</w:t>
+      </w:r>
+    </w:p>
+    <w:p>
+      <w:r>
+        <w:t xml:space="preserve">   e. Loop through each detected object:</w:t>
+      </w:r>
+    </w:p>
+    <w:p>
+      <w:r>
+        <w:t xml:space="preserve">      </w:t>
+      </w:r>
+      <w:proofErr w:type="spellStart"/>
+      <w:r>
+        <w:t>i</w:t>
+      </w:r>
+      <w:proofErr w:type="spellEnd"/>
+      <w:r>
+        <w:t>. Extract bounding box coordinates, confidence score, and class ID.</w:t>
+      </w:r>
+    </w:p>
+    <w:p>
+      <w:r>
+        <w:t xml:space="preserve">      ii. Convert confidence score to float.</w:t>
+      </w:r>
+    </w:p>
+    <w:p>
+      <w:r>
+        <w:t xml:space="preserve">      iii. If confidence is greater than 0.6:</w:t>
+      </w:r>
+    </w:p>
+    <w:p>
+      <w:r>
+        <w:lastRenderedPageBreak/>
+        <w:t xml:space="preserve">         - Convert coordinates to integer values.</w:t>
+      </w:r>
+    </w:p>
+    <w:p>
+      <w:r>
+        <w:t xml:space="preserve">         - Get the class name using the class ID.</w:t>
+      </w:r>
+    </w:p>
+    <w:p>
+      <w:r>
+        <w:t xml:space="preserve">         - Assign a specific </w:t>
+      </w:r>
+      <w:proofErr w:type="spellStart"/>
+      <w:r>
+        <w:t>color</w:t>
+      </w:r>
+      <w:proofErr w:type="spellEnd"/>
+      <w:r>
+        <w:t xml:space="preserve"> to the class (default to white if not mapped).</w:t>
+      </w:r>
+    </w:p>
+    <w:p>
+      <w:r>
+        <w:t xml:space="preserve">         - Draw a bounding box around the detected object.</w:t>
+      </w:r>
+    </w:p>
+    <w:p>
+      <w:r>
+        <w:t xml:space="preserve">         - Display the class name and confidence score as text on the frame.</w:t>
+      </w:r>
+    </w:p>
+    <w:p>
+      <w:r>
+        <w:t xml:space="preserve">   f. </w:t>
+      </w:r>
+      <w:r>
+        <w:t xml:space="preserve"> </w:t>
+      </w:r>
+      <w:r>
+        <w:t>Resize the frame to a specified width and height.</w:t>
+      </w:r>
+    </w:p>
+    <w:p>
+      <w:r>
+        <w:t xml:space="preserve">   g.</w:t>
+      </w:r>
+      <w:r>
+        <w:t xml:space="preserve"> </w:t>
+      </w:r>
+      <w:r>
+        <w:t>Display the processed frame in a window.</w:t>
+      </w:r>
+    </w:p>
+    <w:p>
+      <w:r>
+        <w:t xml:space="preserve">   h. Check if the 'q' key is pressed.</w:t>
+      </w:r>
+    </w:p>
+    <w:p>
+      <w:r>
+        <w:t xml:space="preserve">      - If pressed, break the loop.</w:t>
+      </w:r>
+    </w:p>
+    <w:p>
+      <w:r>
+        <w:t>7. Release the video capture object and close all display windows.</w:t>
+      </w:r>
+    </w:p>
+    <w:p/>
+    <w:p>
       <w:pPr>
         <w:pStyle w:val="Heading2"/>
       </w:pPr>
       <w:r>
-        <w:t>Pseudo Code for Critical Algorithms</w:t>
-      </w:r>
+        <w:t xml:space="preserve">Adding a detection row to the database if the last 8/10 detections contain a </w:t>
+      </w:r>
+      <w:proofErr w:type="spellStart"/>
+      <w:r>
+        <w:t>noHelmet</w:t>
+      </w:r>
+      <w:proofErr w:type="spellEnd"/>
+      <w:r>
+        <w:t xml:space="preserve"> object with a dequeue.</w:t>
+      </w:r>
+    </w:p>
+    <w:p/>
+    <w:p>
+      <w:r>
+        <w:t xml:space="preserve">1. Listen for incoming frame data </w:t>
+      </w:r>
+      <w:r>
+        <w:t xml:space="preserve">from </w:t>
+      </w:r>
+      <w:r>
+        <w:t>WebSocket.</w:t>
+      </w:r>
+    </w:p>
+    <w:p>
+      <w:r>
+        <w:t>2. If valid image data is received:</w:t>
+      </w:r>
+    </w:p>
+    <w:p>
+      <w:r>
+        <w:t xml:space="preserve">   - Decode the image from base64.</w:t>
+      </w:r>
+    </w:p>
+    <w:p>
+      <w:r>
+        <w:t xml:space="preserve">   - Convert byte data into an OpenCV image.</w:t>
+      </w:r>
+    </w:p>
+    <w:p>
+      <w:r>
+        <w:t>3. Run YOLO detection on the image.</w:t>
+      </w:r>
+    </w:p>
+    <w:p>
+      <w:r>
+        <w:t xml:space="preserve">   - Check if any detection is "</w:t>
+      </w:r>
+      <w:proofErr w:type="spellStart"/>
+      <w:r>
+        <w:t>NoHelmet</w:t>
+      </w:r>
+      <w:proofErr w:type="spellEnd"/>
+      <w:r>
+        <w:t>."</w:t>
+      </w:r>
+    </w:p>
+    <w:p>
+      <w:r>
+        <w:t xml:space="preserve">   - If "</w:t>
+      </w:r>
+      <w:proofErr w:type="spellStart"/>
+      <w:r>
+        <w:t>NoHelmet</w:t>
+      </w:r>
+      <w:proofErr w:type="spellEnd"/>
+      <w:r>
+        <w:t>" is found, set a flag to True.</w:t>
+      </w:r>
+    </w:p>
+    <w:p>
+      <w:r>
+        <w:t>4. Store the detection result in a frame history list.</w:t>
+      </w:r>
+    </w:p>
+    <w:p>
+      <w:r>
+        <w:t xml:space="preserve">   - Count occurrences of "</w:t>
+      </w:r>
+      <w:proofErr w:type="spellStart"/>
+      <w:r>
+        <w:t>NoHelmet</w:t>
+      </w:r>
+      <w:proofErr w:type="spellEnd"/>
+      <w:r>
+        <w:t>" in the last 10 frames.</w:t>
+      </w:r>
+    </w:p>
+    <w:p>
+      <w:r>
+        <w:t>5. If at least 8 out of 10 frames detect "</w:t>
+      </w:r>
+      <w:proofErr w:type="spellStart"/>
+      <w:r>
+        <w:t>NoHelmet</w:t>
+      </w:r>
+      <w:proofErr w:type="spellEnd"/>
+      <w:r>
+        <w:t>":</w:t>
+      </w:r>
+    </w:p>
+    <w:p>
+      <w:r>
+        <w:t xml:space="preserve">   - Check if 30 seconds have passed since the last incident.</w:t>
+      </w:r>
+    </w:p>
+    <w:p>
+      <w:r>
+        <w:t xml:space="preserve">   - If cooldown time has passed:</w:t>
+      </w:r>
+    </w:p>
+    <w:p>
+      <w:r>
+        <w:t xml:space="preserve">     - Log the detection in the database.</w:t>
+      </w:r>
+    </w:p>
+    <w:p>
+      <w:r>
+        <w:t xml:space="preserve">     - Reset the cooldown timer.</w:t>
+      </w:r>
+    </w:p>
+    <w:p>
+      <w:r>
+        <w:t xml:space="preserve">   - Otherwise, print remaining cooldown time.</w:t>
+      </w:r>
+    </w:p>
+    <w:p/>
+    <w:p>
+      <w:pPr>
+        <w:pStyle w:val="Heading1"/>
+      </w:pPr>
+      <w:r>
+        <w:lastRenderedPageBreak/>
+        <w:t>Component Diagram</w:t>
+      </w:r>
+    </w:p>
+    <w:p/>
+    <w:p>
+      <w:r>
+        <w:rPr>
+          <w:noProof/>
+        </w:rPr>
+        <w:drawing>
+          <wp:inline distT="0" distB="0" distL="0" distR="0" wp14:anchorId="0DAE60CC" wp14:editId="3EFBE365">
+            <wp:extent cx="5731510" cy="4346575"/>
+            <wp:effectExtent l="0" t="0" r="2540" b="0"/>
+            <wp:docPr id="1793784616" name="Picture 5" descr="A diagram of a computer&#10;&#10;AI-generated content may be incorrect."/>
+            <wp:cNvGraphicFramePr>
+              <a:graphicFrameLocks xmlns:a="http://schemas.openxmlformats.org/drawingml/2006/main" noChangeAspect="1"/>
+            </wp:cNvGraphicFramePr>
+            <a:graphic xmlns:a="http://schemas.openxmlformats.org/drawingml/2006/main">
+              <a:graphicData uri="http://schemas.openxmlformats.org/drawingml/2006/picture">
+                <pic:pic xmlns:pic="http://schemas.openxmlformats.org/drawingml/2006/picture">
+                  <pic:nvPicPr>
+                    <pic:cNvPr id="1793784616" name="Picture 5" descr="A diagram of a computer&#10;&#10;AI-generated content may be incorrect."/>
+                    <pic:cNvPicPr/>
+                  </pic:nvPicPr>
+                  <pic:blipFill>
+                    <a:blip r:embed="rId57">
+                      <a:extLst>
+                        <a:ext uri="{28A0092B-C50C-407E-A947-70E740481C1C}">
+                          <a14:useLocalDpi xmlns:a14="http://schemas.microsoft.com/office/drawing/2010/main" val="0"/>
+                        </a:ext>
+                      </a:extLst>
+                    </a:blip>
+                    <a:stretch>
+                      <a:fillRect/>
+                    </a:stretch>
+                  </pic:blipFill>
+                  <pic:spPr>
+                    <a:xfrm>
+                      <a:off x="0" y="0"/>
+                      <a:ext cx="5731510" cy="4346575"/>
+                    </a:xfrm>
+                    <a:prstGeom prst="rect">
+                      <a:avLst/>
+                    </a:prstGeom>
+                  </pic:spPr>
+                </pic:pic>
+              </a:graphicData>
+            </a:graphic>
+          </wp:inline>
+        </w:drawing>
+      </w:r>
+    </w:p>
+    <w:p/>
+    <w:p/>
+    <w:p/>
+    <w:p/>
+    <w:p/>
+    <w:p/>
+    <w:p/>
+    <w:p/>
+    <w:p/>
+    <w:p>
+      <w:pPr>
+        <w:pStyle w:val="Heading2"/>
+      </w:pPr>
+    </w:p>
+    <w:p/>
+    <w:p>
+      <w:pPr>
+        <w:pStyle w:val="Heading1"/>
+      </w:pPr>
+      <w:r>
+        <w:lastRenderedPageBreak/>
+        <w:t>Sequence Diagrams</w:t>
+      </w:r>
+    </w:p>
+    <w:p>
+      <w:pPr>
+        <w:jc w:val="both"/>
+      </w:pPr>
+    </w:p>
+    <w:p>
+      <w:pPr>
+        <w:jc w:val="both"/>
+      </w:pPr>
+    </w:p>
+    <w:p>
+      <w:pPr>
+        <w:jc w:val="both"/>
+      </w:pPr>
+    </w:p>
+    <w:p>
+      <w:pPr>
+        <w:jc w:val="both"/>
+      </w:pPr>
+    </w:p>
+    <w:p>
+      <w:pPr>
+        <w:jc w:val="both"/>
+      </w:pPr>
+    </w:p>
+    <w:p>
+      <w:pPr>
+        <w:jc w:val="both"/>
+      </w:pPr>
+    </w:p>
+    <w:p>
+      <w:pPr>
+        <w:jc w:val="both"/>
+      </w:pPr>
+    </w:p>
+    <w:p>
+      <w:pPr>
+        <w:jc w:val="both"/>
+      </w:pPr>
+    </w:p>
+    <w:p>
+      <w:pPr>
+        <w:jc w:val="both"/>
+      </w:pPr>
+    </w:p>
+    <w:p>
+      <w:pPr>
+        <w:jc w:val="both"/>
+      </w:pPr>
+    </w:p>
+    <w:p>
+      <w:pPr>
+        <w:jc w:val="both"/>
+      </w:pPr>
+    </w:p>
+    <w:p>
+      <w:pPr>
+        <w:jc w:val="both"/>
+      </w:pPr>
+    </w:p>
+    <w:p>
+      <w:pPr>
+        <w:jc w:val="both"/>
+      </w:pPr>
+    </w:p>
+    <w:p>
+      <w:pPr>
+        <w:jc w:val="both"/>
+      </w:pPr>
+    </w:p>
+    <w:p>
+      <w:pPr>
+        <w:jc w:val="both"/>
+      </w:pPr>
+    </w:p>
+    <w:p>
+      <w:pPr>
+        <w:jc w:val="both"/>
+      </w:pPr>
+    </w:p>
+    <w:p>
+      <w:pPr>
+        <w:jc w:val="both"/>
+      </w:pPr>
+    </w:p>
+    <w:p>
+      <w:pPr>
+        <w:pStyle w:val="Subtitle"/>
+        <w:rPr>
+          <w:color w:val="0070C0"/>
+        </w:rPr>
+      </w:pPr>
+      <w:r>
+        <w:rPr>
+          <w:color w:val="0070C0"/>
+        </w:rPr>
+        <w:t>References</w:t>
+      </w:r>
+    </w:p>
+    <w:p>
+      <w:pPr>
+        <w:jc w:val="both"/>
+      </w:pPr>
+    </w:p>
+    <w:p>
+      <w:pPr>
+        <w:pStyle w:val="ListParagraph"/>
+        <w:numPr>
+          <w:ilvl w:val="0"/>
+          <w:numId w:val="24"/>
+        </w:numPr>
+        <w:jc w:val="both"/>
+        <w:rPr>
+          <w:lang w:val="en-GB"/>
+        </w:rPr>
+      </w:pPr>
+      <w:r>
+        <w:rPr>
+          <w:lang w:val="en-GB"/>
+        </w:rPr>
+        <w:t>Python:</w:t>
+      </w:r>
+      <w:r>
+        <w:rPr>
+          <w:lang w:val="en-GB"/>
+        </w:rPr>
+        <w:t xml:space="preserve"> </w:t>
+      </w:r>
+      <w:hyperlink r:id="rId58" w:tgtFrame="_new" w:history="1">
+        <w:r>
+          <w:rPr>
+            <w:rStyle w:val="Hyperlink"/>
+            <w:lang w:val="en-GB"/>
+          </w:rPr>
+          <w:t>https://www.python.org</w:t>
+        </w:r>
+      </w:hyperlink>
+    </w:p>
+    <w:p>
+      <w:pPr>
+        <w:pStyle w:val="ListParagraph"/>
+        <w:jc w:val="both"/>
+        <w:rPr>
+          <w:lang w:val="en-GB"/>
+        </w:rPr>
+      </w:pPr>
+    </w:p>
+    <w:p>
+      <w:pPr>
+        <w:pStyle w:val="ListParagraph"/>
+        <w:numPr>
+          <w:ilvl w:val="0"/>
+          <w:numId w:val="24"/>
+        </w:numPr>
+        <w:jc w:val="both"/>
+        <w:rPr>
+          <w:lang w:val="en-GB"/>
+        </w:rPr>
+      </w:pPr>
+      <w:r>
+        <w:rPr>
+          <w:lang w:val="en-GB"/>
+        </w:rPr>
+        <w:t>YOLO</w:t>
+      </w:r>
+      <w:r>
+        <w:rPr>
+          <w:lang w:val="en-GB"/>
+        </w:rPr>
+        <w:t>:</w:t>
+      </w:r>
+      <w:r>
+        <w:rPr>
+          <w:lang w:val="en-GB"/>
+        </w:rPr>
+        <w:t xml:space="preserve"> </w:t>
+      </w:r>
+      <w:hyperlink r:id="rId59" w:history="1">
+        <w:r>
+          <w:rPr>
+            <w:rStyle w:val="Hyperlink"/>
+            <w:lang w:val="en-GB"/>
+          </w:rPr>
+          <w:t>https://yolo-docs.readthedocs.io/en/latest/</w:t>
+        </w:r>
+      </w:hyperlink>
+    </w:p>
+    <w:p>
+      <w:pPr>
+        <w:pStyle w:val="ListParagraph"/>
+        <w:jc w:val="both"/>
+        <w:rPr>
+          <w:lang w:val="en-GB"/>
+        </w:rPr>
+      </w:pPr>
+    </w:p>
+    <w:p>
+      <w:pPr>
+        <w:pStyle w:val="ListParagraph"/>
+        <w:numPr>
+          <w:ilvl w:val="0"/>
+          <w:numId w:val="24"/>
+        </w:numPr>
+        <w:jc w:val="both"/>
+        <w:rPr>
+          <w:lang w:val="en-GB"/>
+        </w:rPr>
+      </w:pPr>
+      <w:proofErr w:type="spellStart"/>
+      <w:r>
+        <w:rPr>
+          <w:lang w:val="en-GB"/>
+        </w:rPr>
+        <w:t>Ultralytics</w:t>
+      </w:r>
+      <w:proofErr w:type="spellEnd"/>
+      <w:r>
+        <w:rPr>
+          <w:lang w:val="en-GB"/>
+        </w:rPr>
+        <w:t xml:space="preserve">: </w:t>
+      </w:r>
+      <w:hyperlink r:id="rId60" w:history="1">
+        <w:r>
+          <w:rPr>
+            <w:rStyle w:val="Hyperlink"/>
+            <w:lang w:val="en-GB"/>
+          </w:rPr>
+          <w:t>https://ultralytics.com</w:t>
+        </w:r>
+      </w:hyperlink>
+    </w:p>
+    <w:p>
+      <w:pPr>
+        <w:pStyle w:val="ListParagraph"/>
+        <w:jc w:val="both"/>
+        <w:rPr>
+          <w:lang w:val="en-GB"/>
+        </w:rPr>
+      </w:pPr>
+    </w:p>
+    <w:p>
+      <w:pPr>
+        <w:pStyle w:val="ListParagraph"/>
+        <w:numPr>
+          <w:ilvl w:val="0"/>
+          <w:numId w:val="24"/>
+        </w:numPr>
+        <w:jc w:val="both"/>
+        <w:rPr>
+          <w:lang w:val="en-GB"/>
+        </w:rPr>
+      </w:pPr>
+      <w:r>
+        <w:rPr>
+          <w:lang w:val="en-GB"/>
+        </w:rPr>
+        <w:t>OpenCV</w:t>
+      </w:r>
+      <w:r>
+        <w:rPr>
+          <w:lang w:val="en-GB"/>
+        </w:rPr>
+        <w:t xml:space="preserve">: </w:t>
+      </w:r>
+      <w:hyperlink r:id="rId61" w:history="1">
+        <w:r>
+          <w:rPr>
+            <w:rStyle w:val="Hyperlink"/>
+            <w:lang w:val="en-GB"/>
+          </w:rPr>
+          <w:t>https://opencv.org</w:t>
+        </w:r>
+      </w:hyperlink>
+    </w:p>
+    <w:p>
+      <w:pPr>
+        <w:pStyle w:val="ListParagraph"/>
+        <w:jc w:val="both"/>
+        <w:rPr>
+          <w:lang w:val="en-GB"/>
+        </w:rPr>
+      </w:pPr>
+    </w:p>
+    <w:p>
+      <w:pPr>
+        <w:pStyle w:val="ListParagraph"/>
+        <w:numPr>
+          <w:ilvl w:val="0"/>
+          <w:numId w:val="24"/>
+        </w:numPr>
+        <w:jc w:val="both"/>
+        <w:rPr>
+          <w:lang w:val="en-GB"/>
+        </w:rPr>
+      </w:pPr>
+      <w:r>
+        <w:rPr>
+          <w:lang w:val="en-GB"/>
+        </w:rPr>
+        <w:t>Flask</w:t>
+      </w:r>
+      <w:r>
+        <w:rPr>
+          <w:lang w:val="en-GB"/>
+        </w:rPr>
+        <w:t xml:space="preserve">: </w:t>
+      </w:r>
+      <w:hyperlink r:id="rId62" w:history="1">
+        <w:r>
+          <w:rPr>
+            <w:rStyle w:val="Hyperlink"/>
+            <w:lang w:val="en-GB"/>
+          </w:rPr>
+          <w:t>https://flask.palletsprojects.com</w:t>
+        </w:r>
+      </w:hyperlink>
+    </w:p>
+    <w:p>
+      <w:pPr>
+        <w:pStyle w:val="ListParagraph"/>
+        <w:jc w:val="both"/>
+        <w:rPr>
+          <w:lang w:val="en-GB"/>
+        </w:rPr>
+      </w:pPr>
+    </w:p>
+    <w:p>
+      <w:pPr>
+        <w:pStyle w:val="ListParagraph"/>
+        <w:numPr>
+          <w:ilvl w:val="0"/>
+          <w:numId w:val="24"/>
+        </w:numPr>
+        <w:jc w:val="both"/>
+        <w:rPr>
+          <w:lang w:val="en-GB"/>
+        </w:rPr>
+      </w:pPr>
+      <w:r>
+        <w:rPr>
+          <w:lang w:val="en-GB"/>
+        </w:rPr>
+        <w:t>React</w:t>
+      </w:r>
+      <w:r>
+        <w:rPr>
+          <w:lang w:val="en-GB"/>
+        </w:rPr>
+        <w:t xml:space="preserve">: </w:t>
+      </w:r>
+      <w:hyperlink r:id="rId63" w:history="1">
+        <w:r>
+          <w:rPr>
+            <w:rStyle w:val="Hyperlink"/>
+            <w:lang w:val="en-GB"/>
+          </w:rPr>
+          <w:t>https://reactjs.org</w:t>
+        </w:r>
+      </w:hyperlink>
+    </w:p>
+    <w:p>
+      <w:pPr>
+        <w:pStyle w:val="ListParagraph"/>
+        <w:jc w:val="both"/>
+        <w:rPr>
+          <w:lang w:val="en-GB"/>
+        </w:rPr>
+      </w:pPr>
+    </w:p>
+    <w:p>
+      <w:pPr>
+        <w:pStyle w:val="ListParagraph"/>
+        <w:numPr>
+          <w:ilvl w:val="0"/>
+          <w:numId w:val="24"/>
+        </w:numPr>
+        <w:jc w:val="both"/>
+        <w:rPr>
+          <w:lang w:val="en-GB"/>
+        </w:rPr>
+      </w:pPr>
+      <w:r>
+        <w:rPr>
+          <w:lang w:val="en-GB"/>
+        </w:rPr>
+        <w:t>SMTP</w:t>
+      </w:r>
+      <w:r>
+        <w:rPr>
+          <w:lang w:val="en-GB"/>
+        </w:rPr>
+        <w:t>:</w:t>
+      </w:r>
+      <w:r>
+        <w:rPr>
+          <w:lang w:val="en-GB"/>
+        </w:rPr>
+        <w:t xml:space="preserve"> </w:t>
+      </w:r>
+      <w:hyperlink r:id="rId64" w:history="1">
+        <w:r>
+          <w:rPr>
+            <w:rStyle w:val="Hyperlink"/>
+            <w:lang w:val="en-GB"/>
+          </w:rPr>
+          <w:t>https://tools.ietf.org/html/rfc5321</w:t>
+        </w:r>
+      </w:hyperlink>
+    </w:p>
+    <w:p>
+      <w:pPr>
+        <w:pStyle w:val="ListParagraph"/>
+        <w:jc w:val="both"/>
+        <w:rPr>
+          <w:lang w:val="en-GB"/>
+        </w:rPr>
+      </w:pPr>
+    </w:p>
+    <w:p>
+      <w:pPr>
+        <w:pStyle w:val="ListParagraph"/>
+        <w:numPr>
+          <w:ilvl w:val="0"/>
+          <w:numId w:val="24"/>
+        </w:numPr>
+        <w:jc w:val="both"/>
+        <w:rPr>
+          <w:rStyle w:val="Hyperlink"/>
+          <w:color w:val="auto"/>
+          <w:u w:val="none"/>
+        </w:rPr>
+      </w:pPr>
+      <w:r>
+        <w:rPr>
+          <w:lang w:val="en-GB"/>
+        </w:rPr>
+        <w:t>MySQL</w:t>
+      </w:r>
+      <w:r>
+        <w:rPr>
+          <w:lang w:val="en-GB"/>
+        </w:rPr>
+        <w:t>:</w:t>
+      </w:r>
+      <w:r>
+        <w:rPr>
+          <w:lang w:val="en-GB"/>
+        </w:rPr>
+        <w:t xml:space="preserve"> </w:t>
+      </w:r>
+      <w:hyperlink r:id="rId65" w:tgtFrame="_new" w:history="1">
+        <w:r>
+          <w:rPr>
+            <w:rStyle w:val="Hyperlink"/>
+            <w:lang w:val="en-GB"/>
+          </w:rPr>
+          <w:t>https://www.mysql.com</w:t>
+        </w:r>
+      </w:hyperlink>
+    </w:p>
+    <w:p>
+      <w:pPr>
+        <w:pStyle w:val="ListParagraph"/>
+      </w:pPr>
+    </w:p>
+    <w:p>
+      <w:pPr>
+        <w:pStyle w:val="ListParagraph"/>
+        <w:numPr>
+          <w:ilvl w:val="0"/>
+          <w:numId w:val="24"/>
+        </w:numPr>
+        <w:jc w:val="both"/>
+      </w:pPr>
+      <w:r>
+        <w:t xml:space="preserve">Email Incident Image Example: </w:t>
+      </w:r>
+      <w:hyperlink r:id="rId66" w:history="1">
+        <w:r>
+          <w:rPr>
+            <w:rStyle w:val="Hyperlink"/>
+          </w:rPr>
+          <w:t>https://markhamglobal.com/products/conqor-ig200/</w:t>
+        </w:r>
+      </w:hyperlink>
+    </w:p>
+    <w:p>
+      <w:pPr>
+        <w:jc w:val="both"/>
+      </w:pPr>
     </w:p>
     <w:p/>
     <w:p/>
@@ -6675,590 +7780,13 @@
     <w:p/>
     <w:p/>
     <w:p/>
-    <w:p/>
-    <w:p/>
-    <w:p/>
-    <w:p/>
-    <w:p/>
-    <w:p/>
-    <w:p/>
-    <w:p/>
-    <w:p/>
-    <w:p/>
-    <w:p/>
-    <w:p/>
-    <w:p/>
-    <w:p/>
-    <w:p>
-      <w:pPr>
-        <w:pStyle w:val="Heading2"/>
-      </w:pPr>
-      <w:r>
-        <w:t>E</w:t>
-      </w:r>
-      <w:r>
-        <w:t>ntity-Relationship Diagram</w:t>
-      </w:r>
-      <w:r>
-        <w:t xml:space="preserve"> (Done)</w:t>
-      </w:r>
-    </w:p>
-    <w:p>
-      <w:pPr>
-        <w:pStyle w:val="Heading2"/>
-      </w:pPr>
-    </w:p>
-    <w:p>
-      <w:pPr>
-        <w:pStyle w:val="Heading2"/>
-      </w:pPr>
-      <w:r>
-        <w:t>Pseudo Code for Critical Algorithms</w:t>
-      </w:r>
-    </w:p>
-    <w:p>
-      <w:pPr>
-        <w:pStyle w:val="Heading2"/>
-      </w:pPr>
-    </w:p>
-    <w:p>
-      <w:pPr>
-        <w:pStyle w:val="Heading2"/>
-      </w:pPr>
-      <w:r>
-        <w:t>Class Diagram</w:t>
-      </w:r>
-    </w:p>
-    <w:p>
-      <w:r>
-        <w:t>Strategy pattern for the notifications</w:t>
-      </w:r>
-    </w:p>
-    <w:p>
-      <w:pPr>
-        <w:pStyle w:val="Heading2"/>
-      </w:pPr>
-    </w:p>
-    <w:p>
-      <w:pPr>
-        <w:pStyle w:val="Heading2"/>
-      </w:pPr>
-      <w:r>
-        <w:t>Sequence Diagrams</w:t>
-      </w:r>
-    </w:p>
-    <w:p>
-      <w:pPr>
-        <w:jc w:val="both"/>
-      </w:pPr>
-    </w:p>
-    <w:p>
-      <w:pPr>
-        <w:jc w:val="both"/>
-      </w:pPr>
-    </w:p>
-    <w:p>
-      <w:pPr>
-        <w:jc w:val="both"/>
-      </w:pPr>
-    </w:p>
-    <w:p>
-      <w:pPr>
-        <w:jc w:val="both"/>
-      </w:pPr>
-    </w:p>
-    <w:p>
-      <w:pPr>
-        <w:jc w:val="both"/>
-      </w:pPr>
-    </w:p>
-    <w:p>
-      <w:pPr>
-        <w:jc w:val="both"/>
-      </w:pPr>
-    </w:p>
-    <w:p>
-      <w:pPr>
-        <w:jc w:val="both"/>
-      </w:pPr>
-    </w:p>
-    <w:p>
-      <w:pPr>
-        <w:jc w:val="both"/>
-      </w:pPr>
-    </w:p>
-    <w:p>
-      <w:pPr>
-        <w:jc w:val="both"/>
-      </w:pPr>
-    </w:p>
-    <w:p>
-      <w:pPr>
-        <w:jc w:val="both"/>
-      </w:pPr>
-    </w:p>
-    <w:p>
-      <w:pPr>
-        <w:jc w:val="both"/>
-      </w:pPr>
-    </w:p>
-    <w:p>
-      <w:pPr>
-        <w:jc w:val="both"/>
-      </w:pPr>
-    </w:p>
-    <w:p>
-      <w:pPr>
-        <w:jc w:val="both"/>
-      </w:pPr>
-    </w:p>
-    <w:p>
-      <w:pPr>
-        <w:jc w:val="both"/>
-      </w:pPr>
-    </w:p>
-    <w:p>
-      <w:pPr>
-        <w:jc w:val="both"/>
-      </w:pPr>
-    </w:p>
-    <w:p>
-      <w:pPr>
-        <w:jc w:val="both"/>
-      </w:pPr>
-    </w:p>
-    <w:p>
-      <w:pPr>
-        <w:jc w:val="both"/>
-      </w:pPr>
-    </w:p>
-    <w:p>
-      <w:pPr>
-        <w:pStyle w:val="Subtitle"/>
-        <w:rPr>
-          <w:color w:val="0070C0"/>
-        </w:rPr>
-      </w:pPr>
-      <w:r>
-        <w:rPr>
-          <w:color w:val="0070C0"/>
-        </w:rPr>
-        <w:t>References</w:t>
-      </w:r>
-    </w:p>
-    <w:p>
-      <w:pPr>
-        <w:jc w:val="both"/>
-      </w:pPr>
-    </w:p>
-    <w:p>
-      <w:pPr>
-        <w:pStyle w:val="ListParagraph"/>
-        <w:numPr>
-          <w:ilvl w:val="0"/>
-          <w:numId w:val="24"/>
-        </w:numPr>
-        <w:jc w:val="both"/>
-        <w:rPr>
-          <w:lang w:val="en-GB"/>
-        </w:rPr>
-      </w:pPr>
-      <w:r>
-        <w:rPr>
-          <w:lang w:val="en-GB"/>
-        </w:rPr>
-        <w:t>Python:</w:t>
-      </w:r>
-      <w:r>
-        <w:rPr>
-          <w:lang w:val="en-GB"/>
-        </w:rPr>
-        <w:t xml:space="preserve"> </w:t>
-      </w:r>
-      <w:hyperlink r:id="rId56" w:tgtFrame="_new" w:history="1">
-        <w:r>
-          <w:rPr>
-            <w:rStyle w:val="Hyperlink"/>
-            <w:lang w:val="en-GB"/>
-          </w:rPr>
-          <w:t>https://www.python.org</w:t>
-        </w:r>
-      </w:hyperlink>
-    </w:p>
-    <w:p>
-      <w:pPr>
-        <w:pStyle w:val="ListParagraph"/>
-        <w:jc w:val="both"/>
-        <w:rPr>
-          <w:lang w:val="en-GB"/>
-        </w:rPr>
-      </w:pPr>
-    </w:p>
-    <w:p>
-      <w:pPr>
-        <w:pStyle w:val="ListParagraph"/>
-        <w:numPr>
-          <w:ilvl w:val="0"/>
-          <w:numId w:val="24"/>
-        </w:numPr>
-        <w:jc w:val="both"/>
-        <w:rPr>
-          <w:lang w:val="en-GB"/>
-        </w:rPr>
-      </w:pPr>
-      <w:r>
-        <w:rPr>
-          <w:lang w:val="en-GB"/>
-        </w:rPr>
-        <w:t>YOLO</w:t>
-      </w:r>
-      <w:r>
-        <w:rPr>
-          <w:lang w:val="en-GB"/>
-        </w:rPr>
-        <w:t>:</w:t>
-      </w:r>
-      <w:r>
-        <w:rPr>
-          <w:lang w:val="en-GB"/>
-        </w:rPr>
-        <w:t xml:space="preserve"> </w:t>
-      </w:r>
-      <w:hyperlink r:id="rId57" w:history="1">
-        <w:r>
-          <w:rPr>
-            <w:rStyle w:val="Hyperlink"/>
-            <w:lang w:val="en-GB"/>
-          </w:rPr>
-          <w:t>https://yolo-docs.readthedocs.io/en/latest/</w:t>
-        </w:r>
-      </w:hyperlink>
-    </w:p>
-    <w:p>
-      <w:pPr>
-        <w:pStyle w:val="ListParagraph"/>
-        <w:jc w:val="both"/>
-        <w:rPr>
-          <w:lang w:val="en-GB"/>
-        </w:rPr>
-      </w:pPr>
-    </w:p>
-    <w:p>
-      <w:pPr>
-        <w:pStyle w:val="ListParagraph"/>
-        <w:numPr>
-          <w:ilvl w:val="0"/>
-          <w:numId w:val="24"/>
-        </w:numPr>
-        <w:jc w:val="both"/>
-        <w:rPr>
-          <w:lang w:val="en-GB"/>
-        </w:rPr>
-      </w:pPr>
-      <w:proofErr w:type="spellStart"/>
-      <w:r>
-        <w:rPr>
-          <w:lang w:val="en-GB"/>
-        </w:rPr>
-        <w:t>Ultralytics</w:t>
-      </w:r>
-      <w:proofErr w:type="spellEnd"/>
-      <w:r>
-        <w:rPr>
-          <w:lang w:val="en-GB"/>
-        </w:rPr>
-        <w:t xml:space="preserve">: </w:t>
-      </w:r>
-      <w:hyperlink r:id="rId58" w:history="1">
-        <w:r>
-          <w:rPr>
-            <w:rStyle w:val="Hyperlink"/>
-            <w:lang w:val="en-GB"/>
-          </w:rPr>
-          <w:t>https://ultralytics.com</w:t>
-        </w:r>
-      </w:hyperlink>
-    </w:p>
-    <w:p>
-      <w:pPr>
-        <w:pStyle w:val="ListParagraph"/>
-        <w:jc w:val="both"/>
-        <w:rPr>
-          <w:lang w:val="en-GB"/>
-        </w:rPr>
-      </w:pPr>
-    </w:p>
-    <w:p>
-      <w:pPr>
-        <w:pStyle w:val="ListParagraph"/>
-        <w:numPr>
-          <w:ilvl w:val="0"/>
-          <w:numId w:val="24"/>
-        </w:numPr>
-        <w:jc w:val="both"/>
-        <w:rPr>
-          <w:lang w:val="en-GB"/>
-        </w:rPr>
-      </w:pPr>
-      <w:r>
-        <w:rPr>
-          <w:lang w:val="en-GB"/>
-        </w:rPr>
-        <w:t>OpenCV</w:t>
-      </w:r>
-      <w:r>
-        <w:rPr>
-          <w:lang w:val="en-GB"/>
-        </w:rPr>
-        <w:t xml:space="preserve">: </w:t>
-      </w:r>
-      <w:hyperlink r:id="rId59" w:history="1">
-        <w:r>
-          <w:rPr>
-            <w:rStyle w:val="Hyperlink"/>
-            <w:lang w:val="en-GB"/>
-          </w:rPr>
-          <w:t>https://opencv.org</w:t>
-        </w:r>
-      </w:hyperlink>
-    </w:p>
-    <w:p>
-      <w:pPr>
-        <w:pStyle w:val="ListParagraph"/>
-        <w:jc w:val="both"/>
-        <w:rPr>
-          <w:lang w:val="en-GB"/>
-        </w:rPr>
-      </w:pPr>
-    </w:p>
-    <w:p>
-      <w:pPr>
-        <w:pStyle w:val="ListParagraph"/>
-        <w:numPr>
-          <w:ilvl w:val="0"/>
-          <w:numId w:val="24"/>
-        </w:numPr>
-        <w:jc w:val="both"/>
-        <w:rPr>
-          <w:lang w:val="en-GB"/>
-        </w:rPr>
-      </w:pPr>
-      <w:r>
-        <w:rPr>
-          <w:lang w:val="en-GB"/>
-        </w:rPr>
-        <w:t>Flask</w:t>
-      </w:r>
-      <w:r>
-        <w:rPr>
-          <w:lang w:val="en-GB"/>
-        </w:rPr>
-        <w:t xml:space="preserve">: </w:t>
-      </w:r>
-      <w:hyperlink r:id="rId60" w:history="1">
-        <w:r>
-          <w:rPr>
-            <w:rStyle w:val="Hyperlink"/>
-            <w:lang w:val="en-GB"/>
-          </w:rPr>
-          <w:t>https://flask.palletsprojects.com</w:t>
-        </w:r>
-      </w:hyperlink>
-    </w:p>
-    <w:p>
-      <w:pPr>
-        <w:pStyle w:val="ListParagraph"/>
-        <w:jc w:val="both"/>
-        <w:rPr>
-          <w:lang w:val="en-GB"/>
-        </w:rPr>
-      </w:pPr>
-    </w:p>
-    <w:p>
-      <w:pPr>
-        <w:pStyle w:val="ListParagraph"/>
-        <w:numPr>
-          <w:ilvl w:val="0"/>
-          <w:numId w:val="24"/>
-        </w:numPr>
-        <w:jc w:val="both"/>
-        <w:rPr>
-          <w:lang w:val="en-GB"/>
-        </w:rPr>
-      </w:pPr>
-      <w:r>
-        <w:rPr>
-          <w:lang w:val="en-GB"/>
-        </w:rPr>
-        <w:t>React</w:t>
-      </w:r>
-      <w:r>
-        <w:rPr>
-          <w:lang w:val="en-GB"/>
-        </w:rPr>
-        <w:t xml:space="preserve">: </w:t>
-      </w:r>
-      <w:hyperlink r:id="rId61" w:history="1">
-        <w:r>
-          <w:rPr>
-            <w:rStyle w:val="Hyperlink"/>
-            <w:lang w:val="en-GB"/>
-          </w:rPr>
-          <w:t>https://reactjs.org</w:t>
-        </w:r>
-      </w:hyperlink>
-    </w:p>
-    <w:p>
-      <w:pPr>
-        <w:pStyle w:val="ListParagraph"/>
-        <w:jc w:val="both"/>
-        <w:rPr>
-          <w:lang w:val="en-GB"/>
-        </w:rPr>
-      </w:pPr>
-    </w:p>
-    <w:p>
-      <w:pPr>
-        <w:pStyle w:val="ListParagraph"/>
-        <w:numPr>
-          <w:ilvl w:val="0"/>
-          <w:numId w:val="24"/>
-        </w:numPr>
-        <w:jc w:val="both"/>
-        <w:rPr>
-          <w:lang w:val="en-GB"/>
-        </w:rPr>
-      </w:pPr>
-      <w:r>
-        <w:rPr>
-          <w:lang w:val="en-GB"/>
-        </w:rPr>
-        <w:t>SMTP</w:t>
-      </w:r>
-      <w:r>
-        <w:rPr>
-          <w:lang w:val="en-GB"/>
-        </w:rPr>
-        <w:t>:</w:t>
-      </w:r>
-      <w:r>
-        <w:rPr>
-          <w:lang w:val="en-GB"/>
-        </w:rPr>
-        <w:t xml:space="preserve"> </w:t>
-      </w:r>
-      <w:hyperlink r:id="rId62" w:history="1">
-        <w:r>
-          <w:rPr>
-            <w:rStyle w:val="Hyperlink"/>
-            <w:lang w:val="en-GB"/>
-          </w:rPr>
-          <w:t>https://tools.ietf.org/html/rfc5321</w:t>
-        </w:r>
-      </w:hyperlink>
-    </w:p>
-    <w:p>
-      <w:pPr>
-        <w:pStyle w:val="ListParagraph"/>
-        <w:jc w:val="both"/>
-        <w:rPr>
-          <w:lang w:val="en-GB"/>
-        </w:rPr>
-      </w:pPr>
-    </w:p>
-    <w:p>
-      <w:pPr>
-        <w:pStyle w:val="ListParagraph"/>
-        <w:numPr>
-          <w:ilvl w:val="0"/>
-          <w:numId w:val="24"/>
-        </w:numPr>
-        <w:jc w:val="both"/>
-        <w:rPr>
-          <w:rStyle w:val="Hyperlink"/>
-          <w:color w:val="auto"/>
-          <w:u w:val="none"/>
-        </w:rPr>
-      </w:pPr>
-      <w:r>
-        <w:rPr>
-          <w:lang w:val="en-GB"/>
-        </w:rPr>
-        <w:t>MySQL</w:t>
-      </w:r>
-      <w:r>
-        <w:rPr>
-          <w:lang w:val="en-GB"/>
-        </w:rPr>
-        <w:t>:</w:t>
-      </w:r>
-      <w:r>
-        <w:rPr>
-          <w:lang w:val="en-GB"/>
-        </w:rPr>
-        <w:t xml:space="preserve"> </w:t>
-      </w:r>
-      <w:hyperlink r:id="rId63" w:tgtFrame="_new" w:history="1">
-        <w:r>
-          <w:rPr>
-            <w:rStyle w:val="Hyperlink"/>
-            <w:lang w:val="en-GB"/>
-          </w:rPr>
-          <w:t>https://www.mysql.com</w:t>
-        </w:r>
-      </w:hyperlink>
-    </w:p>
-    <w:p>
-      <w:pPr>
-        <w:pStyle w:val="ListParagraph"/>
-      </w:pPr>
-    </w:p>
-    <w:p>
-      <w:pPr>
-        <w:pStyle w:val="ListParagraph"/>
-        <w:numPr>
-          <w:ilvl w:val="0"/>
-          <w:numId w:val="24"/>
-        </w:numPr>
-        <w:jc w:val="both"/>
-      </w:pPr>
-      <w:r>
-        <w:t xml:space="preserve">Email Incident Image Example: </w:t>
-      </w:r>
-      <w:hyperlink r:id="rId64" w:history="1">
-        <w:r>
-          <w:rPr>
-            <w:rStyle w:val="Hyperlink"/>
-          </w:rPr>
-          <w:t>https://markhamglobal.com/products/conqor-ig200/</w:t>
-        </w:r>
-      </w:hyperlink>
-    </w:p>
-    <w:p>
-      <w:pPr>
-        <w:jc w:val="both"/>
-      </w:pPr>
-    </w:p>
-    <w:p/>
-    <w:p/>
-    <w:p/>
-    <w:p/>
-    <w:p/>
-    <w:p/>
-    <w:p/>
-    <w:p/>
-    <w:p/>
-    <w:p/>
-    <w:p/>
-    <w:p/>
-    <w:p/>
     <w:p>
       <w:pPr>
         <w:jc w:val="right"/>
       </w:pPr>
     </w:p>
     <w:sectPr>
-      <w:footerReference w:type="default" r:id="rId65"/>
+      <w:footerReference w:type="default" r:id="rId67"/>
       <w:pgSz w:w="11906" w:h="16838"/>
       <w:pgMar w:top="1440" w:right="1440" w:bottom="1440" w:left="1440" w:header="708" w:footer="708" w:gutter="0"/>
       <w:pgBorders w:offsetFrom="page">
@@ -24972,6 +25500,23 @@
 </file>
 
 <file path=customXml/item1.xml><?xml version="1.0" encoding="utf-8"?>
+<?mso-contentType ?>
+<FormTemplates xmlns="http://schemas.microsoft.com/sharepoint/v3/contenttype/forms">
+  <Display>DocumentLibraryForm</Display>
+  <Edit>DocumentLibraryForm</Edit>
+  <New>DocumentLibraryForm</New>
+</FormTemplates>
+</file>
+
+<file path=customXml/item2.xml><?xml version="1.0" encoding="utf-8"?>
+<p:properties xmlns:p="http://schemas.microsoft.com/office/2006/metadata/properties" xmlns:xsi="http://www.w3.org/2001/XMLSchema-instance" xmlns:pc="http://schemas.microsoft.com/office/infopath/2007/PartnerControls">
+  <documentManagement>
+    <_activity xmlns="d71ff2ac-62c7-44d6-abd7-1383af8796a8" xsi:nil="true"/>
+  </documentManagement>
+</p:properties>
+</file>
+
+<file path=customXml/item3.xml><?xml version="1.0" encoding="utf-8"?>
 <ct:contentTypeSchema xmlns:ct="http://schemas.microsoft.com/office/2006/metadata/contentType" xmlns:ma="http://schemas.microsoft.com/office/2006/metadata/properties/metaAttributes" ct:_="" ma:_="" ma:contentTypeName="Document" ma:contentTypeID="0x0101009908F051F1A7FA40B6E0D78DFA896E6F" ma:contentTypeVersion="15" ma:contentTypeDescription="Create a new document." ma:contentTypeScope="" ma:versionID="16bd8ccdb24192f5a23e1f50082beb91">
   <xsd:schema xmlns:xsd="http://www.w3.org/2001/XMLSchema" xmlns:xs="http://www.w3.org/2001/XMLSchema" xmlns:p="http://schemas.microsoft.com/office/2006/metadata/properties" xmlns:ns3="d71ff2ac-62c7-44d6-abd7-1383af8796a8" xmlns:ns4="19621f95-9056-4b81-ab21-41233ae0d36d" targetNamespace="http://schemas.microsoft.com/office/2006/metadata/properties" ma:root="true" ma:fieldsID="4a6057a7fc35ca9381604f182b6a209d" ns3:_="" ns4:_="">
     <xsd:import namespace="d71ff2ac-62c7-44d6-abd7-1383af8796a8"/>
@@ -25204,28 +25749,29 @@
 </ct:contentTypeSchema>
 </file>
 
-<file path=customXml/item2.xml><?xml version="1.0" encoding="utf-8"?>
-<?mso-contentType ?>
-<FormTemplates xmlns="http://schemas.microsoft.com/sharepoint/v3/contenttype/forms">
-  <Display>DocumentLibraryForm</Display>
-  <Edit>DocumentLibraryForm</Edit>
-  <New>DocumentLibraryForm</New>
-</FormTemplates>
-</file>
-
-<file path=customXml/item3.xml><?xml version="1.0" encoding="utf-8"?>
-<p:properties xmlns:p="http://schemas.microsoft.com/office/2006/metadata/properties" xmlns:xsi="http://www.w3.org/2001/XMLSchema-instance" xmlns:pc="http://schemas.microsoft.com/office/infopath/2007/PartnerControls">
-  <documentManagement>
-    <_activity xmlns="d71ff2ac-62c7-44d6-abd7-1383af8796a8" xsi:nil="true"/>
-  </documentManagement>
-</p:properties>
-</file>
-
 <file path=customXml/item4.xml><?xml version="1.0" encoding="utf-8"?>
 <b:Sources xmlns:b="http://schemas.openxmlformats.org/officeDocument/2006/bibliography" xmlns="http://schemas.openxmlformats.org/officeDocument/2006/bibliography" SelectedStyle="\APASixthEditionOfficeOnline.xsl" StyleName="APA" Version="6"/>
 </file>
 
 <file path=customXml/itemProps1.xml><?xml version="1.0" encoding="utf-8"?>
+<ds:datastoreItem xmlns:ds="http://schemas.openxmlformats.org/officeDocument/2006/customXml" ds:itemID="{DBC131DF-4F18-448B-B46F-936BB86E1BD6}">
+  <ds:schemaRefs>
+    <ds:schemaRef ds:uri="http://schemas.microsoft.com/sharepoint/v3/contenttype/forms"/>
+  </ds:schemaRefs>
+</ds:datastoreItem>
+</file>
+
+<file path=customXml/itemProps2.xml><?xml version="1.0" encoding="utf-8"?>
+<ds:datastoreItem xmlns:ds="http://schemas.openxmlformats.org/officeDocument/2006/customXml" ds:itemID="{3F2AE3CF-AF0A-42C7-BC75-AAA91D189F19}">
+  <ds:schemaRefs>
+    <ds:schemaRef ds:uri="http://schemas.microsoft.com/office/2006/metadata/properties"/>
+    <ds:schemaRef ds:uri="http://schemas.microsoft.com/office/infopath/2007/PartnerControls"/>
+    <ds:schemaRef ds:uri="d71ff2ac-62c7-44d6-abd7-1383af8796a8"/>
+  </ds:schemaRefs>
+</ds:datastoreItem>
+</file>
+
+<file path=customXml/itemProps3.xml><?xml version="1.0" encoding="utf-8"?>
 <ds:datastoreItem xmlns:ds="http://schemas.openxmlformats.org/officeDocument/2006/customXml" ds:itemID="{9E4FD10E-ECE4-47FC-B486-A980A4B50C09}">
   <ds:schemaRefs>
     <ds:schemaRef ds:uri="http://schemas.microsoft.com/office/2006/metadata/contentType"/>
@@ -25244,24 +25790,6 @@
 </ds:datastoreItem>
 </file>
 
-<file path=customXml/itemProps2.xml><?xml version="1.0" encoding="utf-8"?>
-<ds:datastoreItem xmlns:ds="http://schemas.openxmlformats.org/officeDocument/2006/customXml" ds:itemID="{DBC131DF-4F18-448B-B46F-936BB86E1BD6}">
-  <ds:schemaRefs>
-    <ds:schemaRef ds:uri="http://schemas.microsoft.com/sharepoint/v3/contenttype/forms"/>
-  </ds:schemaRefs>
-</ds:datastoreItem>
-</file>
-
-<file path=customXml/itemProps3.xml><?xml version="1.0" encoding="utf-8"?>
-<ds:datastoreItem xmlns:ds="http://schemas.openxmlformats.org/officeDocument/2006/customXml" ds:itemID="{3F2AE3CF-AF0A-42C7-BC75-AAA91D189F19}">
-  <ds:schemaRefs>
-    <ds:schemaRef ds:uri="http://schemas.microsoft.com/office/2006/metadata/properties"/>
-    <ds:schemaRef ds:uri="http://schemas.microsoft.com/office/infopath/2007/PartnerControls"/>
-    <ds:schemaRef ds:uri="d71ff2ac-62c7-44d6-abd7-1383af8796a8"/>
-  </ds:schemaRefs>
-</ds:datastoreItem>
-</file>
-
 <file path=customXml/itemProps4.xml><?xml version="1.0" encoding="utf-8"?>
 <ds:datastoreItem xmlns:ds="http://schemas.openxmlformats.org/officeDocument/2006/customXml" ds:itemID="{500AA85C-6BEF-45D1-AD66-44E6B9A5378D}">
   <ds:schemaRefs>

</xml_diff>